<commit_message>
Corrige visualizacao A4 do Word
</commit_message>
<xml_diff>
--- a/templates/modelo-tratativa-rnc.docx
+++ b/templates/modelo-tratativa-rnc.docx
@@ -1,1947 +1,1947 @@
 
 <file path=word/document.xml><?xml version="1.0" encoding="utf-8"?>
-<w:document xmlns:wpc="http://schemas.microsoft.com/office/word/2010/wordprocessingCanvas" xmlns:cx="http://schemas.microsoft.com/office/drawing/2014/chartex" xmlns:cx1="http://schemas.microsoft.com/office/drawing/2015/9/8/chartex" xmlns:cx2="http://schemas.microsoft.com/office/drawing/2015/10/21/chartex" xmlns:cx3="http://schemas.microsoft.com/office/drawing/2016/5/9/chartex" xmlns:cx4="http://schemas.microsoft.com/office/drawing/2016/5/10/chartex" xmlns:cx5="http://schemas.microsoft.com/office/drawing/2016/5/11/chartex" xmlns:cx6="http://schemas.microsoft.com/office/drawing/2016/5/12/chartex" xmlns:cx7="http://schemas.microsoft.com/office/drawing/2016/5/13/chartex" xmlns:cx8="http://schemas.microsoft.com/office/drawing/2016/5/14/chartex" xmlns:mc="http://schemas.openxmlformats.org/markup-compatibility/2006" xmlns:aink="http://schemas.microsoft.com/office/drawing/2016/ink" xmlns:am3d="http://schemas.microsoft.com/office/drawing/2017/model3d" xmlns:o="urn:schemas-microsoft-com:office:office" xmlns:oel="http://schemas.microsoft.com/office/2019/extlst" xmlns:r="http://schemas.openxmlformats.org/officeDocument/2006/relationships" xmlns:m="http://schemas.openxmlformats.org/officeDocument/2006/math" xmlns:v="urn:schemas-microsoft-com:vml" xmlns:wp14="http://schemas.microsoft.com/office/word/2010/wordprocessingDrawing" xmlns:wp="http://schemas.openxmlformats.org/drawingml/2006/wordprocessingDrawing" xmlns:w10="urn:schemas-microsoft-com:office:word" xmlns:w="http://schemas.openxmlformats.org/wordprocessingml/2006/main" xmlns:w14="http://schemas.microsoft.com/office/word/2010/wordml" xmlns:w15="http://schemas.microsoft.com/office/word/2012/wordml" xmlns:w16cex="http://schemas.microsoft.com/office/word/2018/wordml/cex" xmlns:w16cid="http://schemas.microsoft.com/office/word/2016/wordml/cid" xmlns:w16="http://schemas.microsoft.com/office/word/2018/wordml" xmlns:w16du="http://schemas.microsoft.com/office/word/2023/wordml/word16du" xmlns:w16sdtdh="http://schemas.microsoft.com/office/word/2020/wordml/sdtdatahash" xmlns:w16sdtfl="http://schemas.microsoft.com/office/word/2024/wordml/sdtformatlock" xmlns:w16se="http://schemas.microsoft.com/office/word/2015/wordml/symex" xmlns:wpg="http://schemas.microsoft.com/office/word/2010/wordprocessingGroup" xmlns:wpi="http://schemas.microsoft.com/office/word/2010/wordprocessingInk" xmlns:wne="http://schemas.microsoft.com/office/word/2006/wordml" xmlns:wps="http://schemas.microsoft.com/office/word/2010/wordprocessingShape" mc:Ignorable="w14 w15 w16se w16cid w16 w16cex w16sdtdh w16sdtfl w16du wp14">
-  <w:body>
-    <w:tbl>
-      <w:tblPr>
-        <w:tblW w:w="10485" w:type="dxa"/>
-        <w:jc w:val="center"/>
-        <w:shd w:val="clear" w:color="auto" w:fill="FFFFFF"/>
-        <w:tblLayout w:type="fixed"/>
-        <w:tblCellMar>
-          <w:left w:w="70" w:type="dxa"/>
-          <w:right w:w="70" w:type="dxa"/>
-        </w:tblCellMar>
-        <w:tblLook w:val="04A0" w:firstRow="1" w:lastRow="0" w:firstColumn="1" w:lastColumn="0" w:noHBand="0" w:noVBand="1"/>
-      </w:tblPr>
-      <w:tblGrid>
-        <w:gridCol w:w="2621"/>
-        <w:gridCol w:w="1492"/>
-        <w:gridCol w:w="1985"/>
-        <w:gridCol w:w="141"/>
-        <w:gridCol w:w="1276"/>
-        <w:gridCol w:w="851"/>
-        <w:gridCol w:w="2119"/>
-      </w:tblGrid>
-      <w:tr>
-        <w:trPr>
-          <w:cantSplit/>
-          <w:trHeight w:val="454"/>
-          <w:jc w:val="center"/>
-        </w:trPr>
-        <w:tc>
-          <w:tcPr>
-            <w:tcW w:w="10485" w:type="dxa"/>
-            <w:gridSpan w:val="7"/>
-            <w:tcBorders>
-              <w:top w:val="single" w:sz="4" w:space="0" w:color="auto"/>
-              <w:left w:val="single" w:sz="4" w:space="0" w:color="auto"/>
-              <w:bottom w:val="single" w:sz="4" w:space="0" w:color="auto"/>
-              <w:right w:val="single" w:sz="4" w:space="0" w:color="auto"/>
-            </w:tcBorders>
-            <w:shd w:val="clear" w:color="auto" w:fill="002060"/>
-            <w:vAlign w:val="center"/>
-          </w:tcPr>
-          <w:p>
-            <w:pPr>
-              <w:keepNext/>
-              <w:keepLines/>
-              <w:suppressLineNumbers/>
-              <w:suppressAutoHyphens/>
-              <w:spacing w:after="0" w:line="256" w:lineRule="auto"/>
-              <w:jc w:val="center"/>
-              <w:rPr>
-                <w:rFonts w:ascii="Times New Roman" w:hAnsi="Times New Roman"/>
-                <w:b/>
-                <w:color w:val="FFFFFF"/>
-                <w:sz w:val="20"/>
-                <w:szCs w:val="20"/>
-              </w:rPr>
-            </w:pPr>
-            <w:r>
-              <w:rPr>
-                <w:rFonts w:ascii="Times New Roman" w:hAnsi="Times New Roman"/>
-                <w:b/>
-                <w:color w:val="FFFFFF"/>
-                <w:sz w:val="20"/>
-                <w:szCs w:val="20"/>
-              </w:rPr>
-              <w:t>INFORMAÇÕES DA TRATATIVA</w:t>
-            </w:r>
-          </w:p>
-        </w:tc>
-      </w:tr>
-      <w:tr>
-        <w:trPr>
-          <w:cantSplit/>
-          <w:trHeight w:val="454"/>
-          <w:jc w:val="center"/>
-        </w:trPr>
-        <w:tc>
-          <w:tcPr>
-            <w:tcW w:w="4113" w:type="dxa"/>
-            <w:gridSpan w:val="2"/>
-            <w:tcBorders>
-              <w:top w:val="single" w:sz="4" w:space="0" w:color="auto"/>
-              <w:left w:val="single" w:sz="4" w:space="0" w:color="auto"/>
-              <w:bottom w:val="single" w:sz="4" w:space="0" w:color="auto"/>
-              <w:right w:val="single" w:sz="4" w:space="0" w:color="auto"/>
-            </w:tcBorders>
-            <w:shd w:val="clear" w:color="auto" w:fill="002060"/>
-            <w:vAlign w:val="center"/>
-          </w:tcPr>
-          <w:p>
-            <w:pPr>
-              <w:keepNext/>
-              <w:keepLines/>
-              <w:suppressLineNumbers/>
-              <w:suppressAutoHyphens/>
-              <w:spacing w:after="0" w:line="256" w:lineRule="auto"/>
-              <w:jc w:val="center"/>
-              <w:rPr>
-                <w:rFonts w:ascii="Times New Roman" w:hAnsi="Times New Roman"/>
-                <w:b/>
-                <w:color w:val="FFFFFF"/>
-                <w:sz w:val="20"/>
-                <w:szCs w:val="20"/>
-              </w:rPr>
-            </w:pPr>
-            <w:r>
-              <w:rPr>
-                <w:rFonts w:ascii="Times New Roman" w:hAnsi="Times New Roman"/>
-                <w:b/>
-                <w:color w:val="FFFFFF"/>
-                <w:sz w:val="20"/>
-                <w:szCs w:val="20"/>
-              </w:rPr>
-              <w:t>RNC Nº:</w:t>
-            </w:r>
-          </w:p>
-        </w:tc>
-        <w:tc>
-          <w:tcPr>
-            <w:tcW w:w="3402" w:type="dxa"/>
-            <w:gridSpan w:val="3"/>
-            <w:tcBorders>
-              <w:top w:val="single" w:sz="4" w:space="0" w:color="auto"/>
-              <w:left w:val="single" w:sz="4" w:space="0" w:color="auto"/>
-              <w:bottom w:val="single" w:sz="4" w:space="0" w:color="auto"/>
-              <w:right w:val="single" w:sz="4" w:space="0" w:color="auto"/>
-            </w:tcBorders>
-            <w:shd w:val="clear" w:color="auto" w:fill="002060"/>
-            <w:vAlign w:val="center"/>
-          </w:tcPr>
-          <w:p>
-            <w:pPr>
-              <w:keepNext/>
-              <w:keepLines/>
-              <w:suppressLineNumbers/>
-              <w:suppressAutoHyphens/>
-              <w:spacing w:after="0" w:line="256" w:lineRule="auto"/>
-              <w:jc w:val="center"/>
-              <w:rPr>
-                <w:rFonts w:ascii="Times New Roman" w:hAnsi="Times New Roman"/>
-                <w:b/>
-                <w:color w:val="FFFFFF"/>
-                <w:sz w:val="20"/>
-                <w:szCs w:val="20"/>
-              </w:rPr>
-            </w:pPr>
-            <w:r>
-              <w:rPr>
-                <w:rFonts w:ascii="Times New Roman" w:hAnsi="Times New Roman"/>
-                <w:b/>
-                <w:color w:val="FFFFFF"/>
-                <w:sz w:val="20"/>
-                <w:szCs w:val="20"/>
-              </w:rPr>
-              <w:t>DATA DA EMISSÃO DA RNC:</w:t>
-            </w:r>
-          </w:p>
-        </w:tc>
-        <w:tc>
-          <w:tcPr>
-            <w:tcW w:w="2970" w:type="dxa"/>
-            <w:gridSpan w:val="2"/>
-            <w:tcBorders>
-              <w:top w:val="single" w:sz="4" w:space="0" w:color="auto"/>
-              <w:left w:val="single" w:sz="4" w:space="0" w:color="auto"/>
-              <w:bottom w:val="single" w:sz="4" w:space="0" w:color="auto"/>
-              <w:right w:val="single" w:sz="4" w:space="0" w:color="auto"/>
-            </w:tcBorders>
-            <w:shd w:val="clear" w:color="auto" w:fill="002060"/>
-            <w:vAlign w:val="center"/>
-          </w:tcPr>
-          <w:p>
-            <w:pPr>
-              <w:keepNext/>
-              <w:keepLines/>
-              <w:suppressLineNumbers/>
-              <w:suppressAutoHyphens/>
-              <w:spacing w:after="0" w:line="256" w:lineRule="auto"/>
-              <w:jc w:val="center"/>
-              <w:rPr>
-                <w:rFonts w:ascii="Times New Roman" w:hAnsi="Times New Roman"/>
-                <w:b/>
-                <w:color w:val="FFFFFF"/>
-                <w:sz w:val="20"/>
-                <w:szCs w:val="20"/>
-              </w:rPr>
-            </w:pPr>
-            <w:r>
-              <w:rPr>
-                <w:rFonts w:ascii="Times New Roman" w:hAnsi="Times New Roman"/>
-                <w:b/>
-                <w:color w:val="FFFFFF"/>
-                <w:sz w:val="20"/>
-                <w:szCs w:val="20"/>
-              </w:rPr>
-              <w:t>DATA DA EMISSÃO DA TRATATIVA:</w:t>
-            </w:r>
-          </w:p>
-        </w:tc>
-      </w:tr>
-      <w:tr>
-        <w:trPr>
-          <w:cantSplit/>
-          <w:trHeight w:val="623"/>
-          <w:jc w:val="center"/>
-        </w:trPr>
-        <w:tc>
-          <w:tcPr>
-            <w:tcW w:w="4113" w:type="dxa"/>
-            <w:gridSpan w:val="2"/>
-            <w:tcBorders>
-              <w:top w:val="single" w:sz="4" w:space="0" w:color="auto"/>
-              <w:left w:val="single" w:sz="4" w:space="0" w:color="auto"/>
-              <w:bottom w:val="single" w:sz="4" w:space="0" w:color="auto"/>
-              <w:right w:val="single" w:sz="4" w:space="0" w:color="auto"/>
-            </w:tcBorders>
-            <w:shd w:val="clear" w:color="auto" w:fill="FFFFFF"/>
-            <w:vAlign w:val="center"/>
-          </w:tcPr>
-          <w:p>
-            <w:pPr>
-              <w:keepNext/>
-              <w:keepLines/>
-              <w:suppressLineNumbers/>
-              <w:suppressAutoHyphens/>
-              <w:spacing w:after="0" w:line="256" w:lineRule="auto"/>
-              <w:jc w:val="center"/>
-              <w:rPr>
-                <w:rFonts w:ascii="Times New Roman" w:hAnsi="Times New Roman"/>
-                <w:b/>
-                <w:sz w:val="20"/>
-                <w:szCs w:val="20"/>
-              </w:rPr>
-            </w:pPr>
-            <w:r>
-              <w:rPr>
-                <w:rFonts w:ascii="Times New Roman" w:hAnsi="Times New Roman"/>
-                <w:b/>
-                <w:sz w:val="20"/>
-                <w:szCs w:val="20"/>
-              </w:rPr>
-              <w:t>[NÚMERO_RNC]</w:t>
-            </w:r>
-          </w:p>
-        </w:tc>
-        <w:tc>
-          <w:tcPr>
-            <w:tcW w:w="3402" w:type="dxa"/>
-            <w:gridSpan w:val="3"/>
-            <w:tcBorders>
-              <w:top w:val="single" w:sz="4" w:space="0" w:color="auto"/>
-              <w:left w:val="single" w:sz="4" w:space="0" w:color="auto"/>
-              <w:bottom w:val="single" w:sz="4" w:space="0" w:color="auto"/>
-              <w:right w:val="single" w:sz="4" w:space="0" w:color="auto"/>
-            </w:tcBorders>
-            <w:shd w:val="clear" w:color="auto" w:fill="FFFFFF"/>
-            <w:vAlign w:val="center"/>
-          </w:tcPr>
-          <w:p>
-            <w:pPr>
-              <w:keepNext/>
-              <w:keepLines/>
-              <w:suppressLineNumbers/>
-              <w:suppressAutoHyphens/>
-              <w:spacing w:after="0" w:line="256" w:lineRule="auto"/>
-              <w:rPr>
-                <w:rFonts w:ascii="Times New Roman" w:hAnsi="Times New Roman"/>
-                <w:b/>
-                <w:sz w:val="20"/>
-                <w:szCs w:val="20"/>
-              </w:rPr>
-            </w:pPr>
-            <w:r>
-              <w:rPr>
-                <w:rFonts w:ascii="Times New Roman" w:hAnsi="Times New Roman"/>
-                <w:b/>
-                <w:sz w:val="20"/>
-                <w:szCs w:val="20"/>
-              </w:rPr>
-              <w:t>[DATA_EMISSÃO]</w:t>
-            </w:r>
-          </w:p>
-        </w:tc>
-        <w:tc>
-          <w:tcPr>
-            <w:tcW w:w="2970" w:type="dxa"/>
-            <w:gridSpan w:val="2"/>
-            <w:tcBorders>
-              <w:top w:val="single" w:sz="4" w:space="0" w:color="auto"/>
-              <w:left w:val="single" w:sz="4" w:space="0" w:color="auto"/>
-              <w:bottom w:val="single" w:sz="4" w:space="0" w:color="auto"/>
-              <w:right w:val="single" w:sz="4" w:space="0" w:color="auto"/>
-            </w:tcBorders>
-            <w:shd w:val="clear" w:color="auto" w:fill="FFFFFF"/>
-            <w:vAlign w:val="center"/>
-          </w:tcPr>
-          <w:p>
-            <w:pPr>
-              <w:keepNext/>
-              <w:keepLines/>
-              <w:suppressLineNumbers/>
-              <w:suppressAutoHyphens/>
-              <w:spacing w:after="0" w:line="256" w:lineRule="auto"/>
-              <w:jc w:val="center"/>
-              <w:rPr>
-                <w:rFonts w:ascii="Times New Roman" w:hAnsi="Times New Roman"/>
-                <w:b/>
-                <w:sz w:val="20"/>
-                <w:szCs w:val="20"/>
-              </w:rPr>
-            </w:pPr>
-            <w:r>
-              <w:rPr>
-                <w:rFonts w:ascii="Times New Roman" w:hAnsi="Times New Roman"/>
-                <w:b/>
-                <w:sz w:val="20"/>
-                <w:szCs w:val="20"/>
-              </w:rPr>
-              <w:t>[DATA_HOJE]</w:t>
-            </w:r>
-          </w:p>
-        </w:tc>
-      </w:tr>
-      <w:tr>
-        <w:trPr>
-          <w:cantSplit/>
-          <w:trHeight w:val="844"/>
-          <w:jc w:val="center"/>
-        </w:trPr>
-        <w:tc>
-          <w:tcPr>
-            <w:tcW w:w="6239" w:type="dxa"/>
-            <w:gridSpan w:val="4"/>
-            <w:tcBorders>
-              <w:top w:val="single" w:sz="4" w:space="0" w:color="auto"/>
-              <w:left w:val="single" w:sz="4" w:space="0" w:color="auto"/>
-              <w:bottom w:val="single" w:sz="4" w:space="0" w:color="auto"/>
-              <w:right w:val="single" w:sz="4" w:space="0" w:color="auto"/>
-            </w:tcBorders>
-            <w:hideMark/>
-          </w:tcPr>
-          <w:p>
-            <w:pPr>
-              <w:keepNext/>
-              <w:keepLines/>
-              <w:suppressLineNumbers/>
-              <w:suppressAutoHyphens/>
-              <w:spacing w:after="0" w:line="256" w:lineRule="auto"/>
-              <w:rPr>
-                <w:rFonts w:ascii="Times New Roman" w:hAnsi="Times New Roman"/>
-                <w:b/>
-                <w:sz w:val="20"/>
-                <w:szCs w:val="20"/>
-              </w:rPr>
-            </w:pPr>
-            <w:r>
-              <w:rPr>
-                <w:rFonts w:ascii="Times New Roman" w:hAnsi="Times New Roman"/>
-                <w:b/>
-                <w:sz w:val="20"/>
-                <w:szCs w:val="20"/>
-              </w:rPr>
-              <w:t>LOCAL/ FRENTE:</w:t>
-            </w:r>
-            <w:r>
-              <w:rPr>
-                <w:rFonts w:ascii="Times New Roman" w:hAnsi="Times New Roman"/>
-                <w:b/>
-                <w:sz w:val="20"/>
-                <w:szCs w:val="20"/>
-              </w:rPr>
-              <w:t xml:space="preserve"> </w:t>
-            </w:r>
-            <w:r>
-              <w:rPr>
-                <w:rFonts w:ascii="Times New Roman" w:hAnsi="Times New Roman"/>
-                <w:b/>
-                <w:sz w:val="20"/>
-                <w:szCs w:val="20"/>
-              </w:rPr>
-              <w:t>[LOCAL/ FRENTE]</w:t>
-            </w:r>
-          </w:p>
-          <w:p>
-            <w:pPr>
-              <w:keepNext/>
-              <w:keepLines/>
-              <w:suppressLineNumbers/>
-              <w:suppressAutoHyphens/>
-              <w:spacing w:after="0" w:line="256" w:lineRule="auto"/>
-              <w:rPr>
-                <w:rFonts w:ascii="Times New Roman" w:hAnsi="Times New Roman"/>
-                <w:b/>
-                <w:sz w:val="20"/>
-                <w:szCs w:val="20"/>
-              </w:rPr>
-            </w:pPr>
-          </w:p>
-        </w:tc>
-        <w:tc>
-          <w:tcPr>
-            <w:tcW w:w="4246" w:type="dxa"/>
-            <w:gridSpan w:val="3"/>
-            <w:tcBorders>
-              <w:top w:val="single" w:sz="4" w:space="0" w:color="auto"/>
-              <w:left w:val="single" w:sz="4" w:space="0" w:color="auto"/>
-              <w:bottom w:val="single" w:sz="4" w:space="0" w:color="auto"/>
-              <w:right w:val="single" w:sz="4" w:space="0" w:color="auto"/>
-            </w:tcBorders>
-          </w:tcPr>
-          <w:p>
-            <w:pPr>
-              <w:keepNext/>
-              <w:keepLines/>
-              <w:suppressLineNumbers/>
-              <w:suppressAutoHyphens/>
-              <w:spacing w:after="0" w:line="256" w:lineRule="auto"/>
-              <w:rPr>
-                <w:rFonts w:ascii="Times New Roman" w:hAnsi="Times New Roman"/>
-                <w:b/>
-                <w:sz w:val="20"/>
-                <w:szCs w:val="20"/>
-              </w:rPr>
-            </w:pPr>
-            <w:r>
-              <w:rPr>
-                <w:rFonts w:ascii="Times New Roman" w:hAnsi="Times New Roman"/>
-                <w:b/>
-                <w:sz w:val="20"/>
-                <w:szCs w:val="20"/>
-              </w:rPr>
-              <w:t>CONTRATO:</w:t>
-            </w:r>
-            <w:r>
-              <w:rPr>
-                <w:rFonts w:ascii="Times New Roman" w:hAnsi="Times New Roman"/>
-                <w:b/>
-                <w:sz w:val="20"/>
-                <w:szCs w:val="20"/>
-              </w:rPr>
-              <w:t xml:space="preserve"> </w:t>
-            </w:r>
-            <w:r>
-              <w:rPr>
-                <w:rFonts w:ascii="Times New Roman" w:hAnsi="Times New Roman"/>
-                <w:b/>
-                <w:sz w:val="20"/>
-                <w:szCs w:val="20"/>
-              </w:rPr>
-              <w:t>[CONTRATO]</w:t>
-            </w:r>
-          </w:p>
-        </w:tc>
-      </w:tr>
-      <w:tr>
-        <w:trPr>
-          <w:cantSplit/>
-          <w:trHeight w:val="1134"/>
-          <w:jc w:val="center"/>
-        </w:trPr>
-        <w:tc>
-          <w:tcPr>
-            <w:tcW w:w="10485" w:type="dxa"/>
-            <w:gridSpan w:val="7"/>
-            <w:tcBorders>
-              <w:top w:val="single" w:sz="4" w:space="0" w:color="auto"/>
-              <w:left w:val="single" w:sz="4" w:space="0" w:color="auto"/>
-              <w:bottom w:val="single" w:sz="4" w:space="0" w:color="auto"/>
-              <w:right w:val="single" w:sz="4" w:space="0" w:color="auto"/>
-            </w:tcBorders>
-            <w:hideMark/>
-          </w:tcPr>
-          <w:p>
-            <w:pPr>
-              <w:keepNext/>
-              <w:keepLines/>
-              <w:suppressLineNumbers/>
-              <w:shd w:val="clear" w:color="auto" w:fill="FFFFFF"/>
-              <w:suppressAutoHyphens/>
-              <w:spacing w:after="0" w:line="256" w:lineRule="auto"/>
-              <w:rPr>
-                <w:rFonts w:ascii="Times New Roman" w:eastAsia="Times New Roman" w:hAnsi="Times New Roman"/>
-                <w:color w:val="000000"/>
-                <w:sz w:val="20"/>
-                <w:szCs w:val="20"/>
-                <w:lang w:eastAsia="pt-BR"/>
-              </w:rPr>
-            </w:pPr>
-            <w:r>
-              <w:rPr>
-                <w:rFonts w:ascii="Times New Roman" w:hAnsi="Times New Roman"/>
-                <w:b/>
-                <w:sz w:val="20"/>
-                <w:szCs w:val="20"/>
-              </w:rPr>
-              <w:t>RESPONSÁVEL PELA ÁREA:</w:t>
-            </w:r>
-            <w:r>
-              <w:rPr>
-                <w:rFonts w:ascii="Times New Roman" w:hAnsi="Times New Roman"/>
-                <w:b/>
-                <w:sz w:val="20"/>
-                <w:szCs w:val="20"/>
-              </w:rPr>
-              <w:t xml:space="preserve"> </w:t>
-            </w:r>
-            <w:r>
-              <w:rPr>
-                <w:rFonts w:ascii="Times New Roman" w:hAnsi="Times New Roman"/>
-                <w:b/>
-                <w:sz w:val="20"/>
-                <w:szCs w:val="20"/>
-              </w:rPr>
-              <w:t>[RESPONSÁVEL PELA ÁREA]</w:t>
-            </w:r>
-          </w:p>
-        </w:tc>
-      </w:tr>
-      <w:tr>
-        <w:trPr>
-          <w:trHeight w:val="411"/>
-          <w:jc w:val="center"/>
-        </w:trPr>
-        <w:tc>
-          <w:tcPr>
-            <w:tcW w:w="10485" w:type="dxa"/>
-            <w:gridSpan w:val="7"/>
-            <w:tcBorders>
-              <w:top w:val="single" w:sz="4" w:space="0" w:color="auto"/>
-              <w:left w:val="single" w:sz="4" w:space="0" w:color="auto"/>
-              <w:bottom w:val="single" w:sz="4" w:space="0" w:color="auto"/>
-              <w:right w:val="single" w:sz="4" w:space="0" w:color="auto"/>
-            </w:tcBorders>
-            <w:shd w:val="clear" w:color="auto" w:fill="002060"/>
-            <w:vAlign w:val="center"/>
-            <w:hideMark/>
-          </w:tcPr>
-          <w:p>
-            <w:pPr>
-              <w:keepNext/>
-              <w:keepLines/>
-              <w:suppressLineNumbers/>
-              <w:suppressAutoHyphens/>
-              <w:spacing w:after="0" w:line="256" w:lineRule="auto"/>
-              <w:jc w:val="center"/>
-              <w:rPr>
-                <w:rFonts w:ascii="Times New Roman" w:hAnsi="Times New Roman"/>
-                <w:b/>
-                <w:color w:val="FFFFFF"/>
-                <w:sz w:val="20"/>
-                <w:szCs w:val="20"/>
-              </w:rPr>
-            </w:pPr>
-            <w:r>
-              <w:rPr>
-                <w:rFonts w:ascii="Times New Roman" w:hAnsi="Times New Roman"/>
-                <w:b/>
-                <w:color w:val="FFFFFF"/>
-                <w:sz w:val="20"/>
-                <w:szCs w:val="20"/>
-              </w:rPr>
-              <w:t>TIPO DE OCORRÊNCIA</w:t>
-            </w:r>
-          </w:p>
-        </w:tc>
-      </w:tr>
-      <w:tr>
-        <w:trPr>
-          <w:trHeight w:val="425"/>
-          <w:jc w:val="center"/>
-        </w:trPr>
-        <w:tc>
-          <w:tcPr>
-            <w:tcW w:w="2621" w:type="dxa"/>
-            <w:tcBorders>
-              <w:top w:val="single" w:sz="4" w:space="0" w:color="auto"/>
-              <w:left w:val="single" w:sz="4" w:space="0" w:color="auto"/>
-              <w:bottom w:val="single" w:sz="4" w:space="0" w:color="auto"/>
-              <w:right w:val="single" w:sz="4" w:space="0" w:color="auto"/>
-            </w:tcBorders>
-            <w:vAlign w:val="center"/>
-          </w:tcPr>
-          <w:p>
-            <w:pPr>
-              <w:keepNext/>
-              <w:keepLines/>
-              <w:suppressLineNumbers/>
-              <w:suppressAutoHyphens/>
-              <w:spacing w:after="0" w:line="256" w:lineRule="auto"/>
-              <w:rPr>
-                <w:rFonts w:ascii="Times New Roman" w:hAnsi="Times New Roman"/>
-                <w:b/>
-                <w:sz w:val="20"/>
-                <w:szCs w:val="20"/>
-              </w:rPr>
-            </w:pPr>
-            <w:r>
-              <w:rPr>
-                <w:rFonts w:ascii="Times New Roman" w:hAnsi="Times New Roman"/>
-                <w:b/>
-                <w:noProof/>
-                <w:sz w:val="20"/>
-                <w:szCs w:val="20"/>
-              </w:rPr>
-              <mc:AlternateContent>
-                <mc:Choice Requires="wps">
-                  <w:drawing>
-                    <wp:anchor distT="0" distB="0" distL="114300" distR="114300" simplePos="0" relativeHeight="251656192" behindDoc="0" locked="0" layoutInCell="1" allowOverlap="1" wp14:anchorId="76BF7F04" wp14:editId="09AD3F85">
-                      <wp:simplePos x="0" y="0"/>
-                      <wp:positionH relativeFrom="column">
-                        <wp:posOffset>1148715</wp:posOffset>
-                      </wp:positionH>
-                      <wp:positionV relativeFrom="paragraph">
-                        <wp:posOffset>19050</wp:posOffset>
-                      </wp:positionV>
-                      <wp:extent cx="195580" cy="140335"/>
-                      <wp:effectExtent l="8255" t="8255" r="5715" b="13335"/>
-                      <wp:wrapNone/>
-                      <wp:docPr id="1557458591" name="AutoShape 18"/>
-                      <wp:cNvGraphicFramePr>
-                        <a:graphicFrameLocks xmlns:a="http://schemas.openxmlformats.org/drawingml/2006/main"/>
-                      </wp:cNvGraphicFramePr>
-                      <a:graphic xmlns:a="http://schemas.openxmlformats.org/drawingml/2006/main">
-                        <a:graphicData uri="http://schemas.microsoft.com/office/word/2010/wordprocessingShape">
-                          <wps:wsp>
-                            <wps:cNvSpPr>
-                              <a:spLocks noChangeArrowheads="1"/>
-                            </wps:cNvSpPr>
-                            <wps:spPr bwMode="auto">
-                              <a:xfrm>
-                                <a:off x="0" y="0"/>
-                                <a:ext cx="195580" cy="140335"/>
-                              </a:xfrm>
-                              <a:prstGeom prst="roundRect">
-                                <a:avLst>
-                                  <a:gd name="adj" fmla="val 16667"/>
-                                </a:avLst>
-                              </a:prstGeom>
-                              <a:noFill/>
-                              <a:ln w="9525">
-                                <a:solidFill>
-                                  <a:srgbClr val="196B24"/>
-                                </a:solidFill>
-                                <a:round/>
-                                <a:headEnd/>
-                                <a:tailEnd/>
-                              </a:ln>
-                              <a:effectLst/>
-                              <a:extLst>
-                                <a:ext uri="{909E8E84-426E-40DD-AFC4-6F175D3DCCD1}">
-                                  <a14:hiddenFill xmlns:a14="http://schemas.microsoft.com/office/drawing/2010/main">
-                                    <a:solidFill>
-                                      <a:srgbClr val="FFFFFF"/>
-                                    </a:solidFill>
-                                  </a14:hiddenFill>
-                                </a:ext>
-                                <a:ext uri="{AF507438-7753-43E0-B8FC-AC1667EBCBE1}">
-                                  <a14:hiddenEffects xmlns:a14="http://schemas.microsoft.com/office/drawing/2010/main">
-                                    <a:effectLst>
-                                      <a:outerShdw dist="35921" dir="2700000" algn="ctr" rotWithShape="0">
-                                        <a:srgbClr val="868686"/>
-                                      </a:outerShdw>
-                                    </a:effectLst>
-                                  </a14:hiddenEffects>
-                                </a:ext>
-                              </a:extLst>
-                            </wps:spPr>
-                            <wps:bodyPr rot="0" vert="horz" wrap="square" lIns="91440" tIns="45720" rIns="91440" bIns="45720" anchor="t" anchorCtr="0" upright="1">
-                              <a:noAutofit/>
-                            </wps:bodyPr>
-                          </wps:wsp>
-                        </a:graphicData>
-                      </a:graphic>
-                      <wp14:sizeRelH relativeFrom="page">
-                        <wp14:pctWidth>0</wp14:pctWidth>
-                      </wp14:sizeRelH>
-                      <wp14:sizeRelV relativeFrom="page">
-                        <wp14:pctHeight>0</wp14:pctHeight>
-                      </wp14:sizeRelV>
-                    </wp:anchor>
-                  </w:drawing>
-                </mc:Choice>
-                <mc:Fallback>
-                  <w:pict>
-                    <v:roundrect w14:anchorId="2EBDF774" id="AutoShape 18" o:spid="_x0000_s1026" style="position:absolute;margin-left:90.45pt;margin-top:1.5pt;width:15.4pt;height:11.05pt;z-index:251656192;visibility:visible;mso-wrap-style:square;mso-width-percent:0;mso-height-percent:0;mso-wrap-distance-left:9pt;mso-wrap-distance-top:0;mso-wrap-distance-right:9pt;mso-wrap-distance-bottom:0;mso-position-horizontal:absolute;mso-position-horizontal-relative:text;mso-position-vertical:absolute;mso-position-vertical-relative:text;mso-width-percent:0;mso-height-percent:0;mso-width-relative:page;mso-height-relative:page;v-text-anchor:top" arcsize="10923f" o:gfxdata="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" filled="f" strokecolor="#196b24">
-                      <v:shadow color="#868686"/>
-                    </v:roundrect>
-                  </w:pict>
-                </mc:Fallback>
-              </mc:AlternateContent>
-            </w:r>
-            <w:r>
-              <w:rPr>
-                <w:rFonts w:ascii="Times New Roman" w:hAnsi="Times New Roman"/>
-                <w:b/>
-                <w:sz w:val="20"/>
-                <w:szCs w:val="20"/>
-              </w:rPr>
-              <w:t>MEIO AMBIENTE</w:t>
-            </w:r>
-            <w:r>
-              <w:rPr>
-                <w:rFonts w:ascii="Times New Roman" w:hAnsi="Times New Roman"/>
-                <w:b/>
-                <w:sz w:val="20"/>
-                <w:szCs w:val="20"/>
-              </w:rPr>
-              <w:t>:</w:t>
-            </w:r>
-          </w:p>
-        </w:tc>
-        <w:tc>
-          <w:tcPr>
-            <w:tcW w:w="3477" w:type="dxa"/>
-            <w:gridSpan w:val="2"/>
-            <w:tcBorders>
-              <w:top w:val="single" w:sz="4" w:space="0" w:color="auto"/>
-              <w:left w:val="single" w:sz="4" w:space="0" w:color="auto"/>
-              <w:bottom w:val="single" w:sz="4" w:space="0" w:color="auto"/>
-              <w:right w:val="single" w:sz="4" w:space="0" w:color="auto"/>
-            </w:tcBorders>
-            <w:vAlign w:val="center"/>
-          </w:tcPr>
-          <w:p>
-            <w:pPr>
-              <w:keepNext/>
-              <w:keepLines/>
-              <w:suppressLineNumbers/>
-              <w:suppressAutoHyphens/>
-              <w:spacing w:after="0" w:line="256" w:lineRule="auto"/>
-              <w:rPr>
-                <w:rFonts w:ascii="Times New Roman" w:hAnsi="Times New Roman"/>
-                <w:b/>
-                <w:sz w:val="20"/>
-                <w:szCs w:val="20"/>
-              </w:rPr>
-            </w:pPr>
-            <w:r>
-              <w:rPr>
-                <w:rFonts w:ascii="Times New Roman" w:hAnsi="Times New Roman"/>
-                <w:b/>
-                <w:noProof/>
-                <w:sz w:val="20"/>
-                <w:szCs w:val="20"/>
-              </w:rPr>
-              <mc:AlternateContent>
-                <mc:Choice Requires="wps">
-                  <w:drawing>
-                    <wp:anchor distT="0" distB="0" distL="114300" distR="114300" simplePos="0" relativeHeight="251657216" behindDoc="0" locked="0" layoutInCell="1" allowOverlap="1" wp14:anchorId="2B78AE7F" wp14:editId="71DA8255">
-                      <wp:simplePos x="0" y="0"/>
-                      <wp:positionH relativeFrom="column">
-                        <wp:posOffset>1858645</wp:posOffset>
-                      </wp:positionH>
-                      <wp:positionV relativeFrom="paragraph">
-                        <wp:posOffset>15240</wp:posOffset>
-                      </wp:positionV>
-                      <wp:extent cx="195580" cy="140335"/>
-                      <wp:effectExtent l="10795" t="13970" r="12700" b="7620"/>
-                      <wp:wrapNone/>
-                      <wp:docPr id="801053956" name="AutoShape 19"/>
-                      <wp:cNvGraphicFramePr>
-                        <a:graphicFrameLocks xmlns:a="http://schemas.openxmlformats.org/drawingml/2006/main"/>
-                      </wp:cNvGraphicFramePr>
-                      <a:graphic xmlns:a="http://schemas.openxmlformats.org/drawingml/2006/main">
-                        <a:graphicData uri="http://schemas.microsoft.com/office/word/2010/wordprocessingShape">
-                          <wps:wsp>
-                            <wps:cNvSpPr>
-                              <a:spLocks noChangeArrowheads="1"/>
-                            </wps:cNvSpPr>
-                            <wps:spPr bwMode="auto">
-                              <a:xfrm>
-                                <a:off x="0" y="0"/>
-                                <a:ext cx="195580" cy="140335"/>
-                              </a:xfrm>
-                              <a:prstGeom prst="roundRect">
-                                <a:avLst>
-                                  <a:gd name="adj" fmla="val 16667"/>
-                                </a:avLst>
-                              </a:prstGeom>
-                              <a:noFill/>
-                              <a:ln w="9525">
-                                <a:solidFill>
-                                  <a:srgbClr val="196B24"/>
-                                </a:solidFill>
-                                <a:round/>
-                                <a:headEnd/>
-                                <a:tailEnd/>
-                              </a:ln>
-                              <a:effectLst/>
-                              <a:extLst>
-                                <a:ext uri="{909E8E84-426E-40DD-AFC4-6F175D3DCCD1}">
-                                  <a14:hiddenFill xmlns:a14="http://schemas.microsoft.com/office/drawing/2010/main">
-                                    <a:solidFill>
-                                      <a:srgbClr val="FFFFFF"/>
-                                    </a:solidFill>
-                                  </a14:hiddenFill>
-                                </a:ext>
-                                <a:ext uri="{AF507438-7753-43E0-B8FC-AC1667EBCBE1}">
-                                  <a14:hiddenEffects xmlns:a14="http://schemas.microsoft.com/office/drawing/2010/main">
-                                    <a:effectLst>
-                                      <a:outerShdw dist="35921" dir="2700000" algn="ctr" rotWithShape="0">
-                                        <a:srgbClr val="868686"/>
-                                      </a:outerShdw>
-                                    </a:effectLst>
-                                  </a14:hiddenEffects>
-                                </a:ext>
-                              </a:extLst>
-                            </wps:spPr>
-                            <wps:bodyPr rot="0" vert="horz" wrap="square" lIns="91440" tIns="45720" rIns="91440" bIns="45720" anchor="t" anchorCtr="0" upright="1">
-                              <a:noAutofit/>
-                            </wps:bodyPr>
-                          </wps:wsp>
-                        </a:graphicData>
-                      </a:graphic>
-                      <wp14:sizeRelH relativeFrom="page">
-                        <wp14:pctWidth>0</wp14:pctWidth>
-                      </wp14:sizeRelH>
-                      <wp14:sizeRelV relativeFrom="page">
-                        <wp14:pctHeight>0</wp14:pctHeight>
-                      </wp14:sizeRelV>
-                    </wp:anchor>
-                  </w:drawing>
-                </mc:Choice>
-                <mc:Fallback>
-                  <w:pict>
-                    <v:roundrect w14:anchorId="33B94A96" id="AutoShape 19" o:spid="_x0000_s1026" style="position:absolute;margin-left:146.35pt;margin-top:1.2pt;width:15.4pt;height:11.05pt;z-index:251657216;visibility:visible;mso-wrap-style:square;mso-width-percent:0;mso-height-percent:0;mso-wrap-distance-left:9pt;mso-wrap-distance-top:0;mso-wrap-distance-right:9pt;mso-wrap-distance-bottom:0;mso-position-horizontal:absolute;mso-position-horizontal-relative:text;mso-position-vertical:absolute;mso-position-vertical-relative:text;mso-width-percent:0;mso-height-percent:0;mso-width-relative:page;mso-height-relative:page;v-text-anchor:top" arcsize="10923f" o:gfxdata="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" filled="f" strokecolor="#196b24">
-                      <v:shadow color="#868686"/>
-                    </v:roundrect>
-                  </w:pict>
-                </mc:Fallback>
-              </mc:AlternateContent>
-            </w:r>
-            <w:r>
-              <w:rPr>
-                <w:rFonts w:ascii="Times New Roman" w:hAnsi="Times New Roman"/>
-                <w:b/>
-                <w:sz w:val="20"/>
-                <w:szCs w:val="20"/>
-              </w:rPr>
-              <w:t>SEGURANÇA DO TRABALHO</w:t>
-            </w:r>
-            <w:r>
-              <w:rPr>
-                <w:rFonts w:ascii="Times New Roman" w:hAnsi="Times New Roman"/>
-                <w:b/>
-                <w:sz w:val="20"/>
-                <w:szCs w:val="20"/>
-              </w:rPr>
-              <w:t>:</w:t>
-            </w:r>
-          </w:p>
-        </w:tc>
-        <w:tc>
-          <w:tcPr>
-            <w:tcW w:w="2268" w:type="dxa"/>
-            <w:gridSpan w:val="3"/>
-            <w:tcBorders>
-              <w:top w:val="single" w:sz="4" w:space="0" w:color="auto"/>
-              <w:left w:val="single" w:sz="4" w:space="0" w:color="auto"/>
-              <w:bottom w:val="single" w:sz="4" w:space="0" w:color="auto"/>
-              <w:right w:val="single" w:sz="4" w:space="0" w:color="auto"/>
-            </w:tcBorders>
-            <w:vAlign w:val="center"/>
-          </w:tcPr>
-          <w:p>
-            <w:pPr>
-              <w:keepNext/>
-              <w:keepLines/>
-              <w:suppressLineNumbers/>
-              <w:suppressAutoHyphens/>
-              <w:spacing w:after="0" w:line="256" w:lineRule="auto"/>
-              <w:rPr>
-                <w:rFonts w:ascii="Times New Roman" w:hAnsi="Times New Roman"/>
-                <w:b/>
-                <w:sz w:val="20"/>
-                <w:szCs w:val="20"/>
-              </w:rPr>
-            </w:pPr>
-            <w:r>
-              <w:rPr>
-                <w:rFonts w:ascii="Times New Roman" w:hAnsi="Times New Roman"/>
-                <w:b/>
-                <w:noProof/>
-                <w:sz w:val="20"/>
-                <w:szCs w:val="20"/>
-              </w:rPr>
-              <mc:AlternateContent>
-                <mc:Choice Requires="wps">
-                  <w:drawing>
-                    <wp:anchor distT="0" distB="0" distL="114300" distR="114300" simplePos="0" relativeHeight="251658240" behindDoc="0" locked="0" layoutInCell="1" allowOverlap="1" wp14:anchorId="4FCB034B" wp14:editId="4842015E">
-                      <wp:simplePos x="0" y="0"/>
-                      <wp:positionH relativeFrom="column">
-                        <wp:posOffset>964565</wp:posOffset>
-                      </wp:positionH>
-                      <wp:positionV relativeFrom="paragraph">
-                        <wp:posOffset>15240</wp:posOffset>
-                      </wp:positionV>
-                      <wp:extent cx="195580" cy="140335"/>
-                      <wp:effectExtent l="10160" t="13970" r="13335" b="7620"/>
-                      <wp:wrapNone/>
-                      <wp:docPr id="1760387860" name="AutoShape 20"/>
-                      <wp:cNvGraphicFramePr>
-                        <a:graphicFrameLocks xmlns:a="http://schemas.openxmlformats.org/drawingml/2006/main"/>
-                      </wp:cNvGraphicFramePr>
-                      <a:graphic xmlns:a="http://schemas.openxmlformats.org/drawingml/2006/main">
-                        <a:graphicData uri="http://schemas.microsoft.com/office/word/2010/wordprocessingShape">
-                          <wps:wsp>
-                            <wps:cNvSpPr>
-                              <a:spLocks noChangeArrowheads="1"/>
-                            </wps:cNvSpPr>
-                            <wps:spPr bwMode="auto">
-                              <a:xfrm>
-                                <a:off x="0" y="0"/>
-                                <a:ext cx="195580" cy="140335"/>
-                              </a:xfrm>
-                              <a:prstGeom prst="roundRect">
-                                <a:avLst>
-                                  <a:gd name="adj" fmla="val 16667"/>
-                                </a:avLst>
-                              </a:prstGeom>
-                              <a:noFill/>
-                              <a:ln w="9525">
-                                <a:solidFill>
-                                  <a:srgbClr val="196B24"/>
-                                </a:solidFill>
-                                <a:round/>
-                                <a:headEnd/>
-                                <a:tailEnd/>
-                              </a:ln>
-                              <a:effectLst/>
-                              <a:extLst>
-                                <a:ext uri="{909E8E84-426E-40DD-AFC4-6F175D3DCCD1}">
-                                  <a14:hiddenFill xmlns:a14="http://schemas.microsoft.com/office/drawing/2010/main">
-                                    <a:solidFill>
-                                      <a:srgbClr val="FFFFFF"/>
-                                    </a:solidFill>
-                                  </a14:hiddenFill>
-                                </a:ext>
-                                <a:ext uri="{AF507438-7753-43E0-B8FC-AC1667EBCBE1}">
-                                  <a14:hiddenEffects xmlns:a14="http://schemas.microsoft.com/office/drawing/2010/main">
-                                    <a:effectLst>
-                                      <a:outerShdw dist="35921" dir="2700000" algn="ctr" rotWithShape="0">
-                                        <a:srgbClr val="868686"/>
-                                      </a:outerShdw>
-                                    </a:effectLst>
-                                  </a14:hiddenEffects>
-                                </a:ext>
-                              </a:extLst>
-                            </wps:spPr>
-                            <wps:bodyPr rot="0" vert="horz" wrap="square" lIns="91440" tIns="45720" rIns="91440" bIns="45720" anchor="t" anchorCtr="0" upright="1">
-                              <a:noAutofit/>
-                            </wps:bodyPr>
-                          </wps:wsp>
-                        </a:graphicData>
-                      </a:graphic>
-                      <wp14:sizeRelH relativeFrom="page">
-                        <wp14:pctWidth>0</wp14:pctWidth>
-                      </wp14:sizeRelH>
-                      <wp14:sizeRelV relativeFrom="page">
-                        <wp14:pctHeight>0</wp14:pctHeight>
-                      </wp14:sizeRelV>
-                    </wp:anchor>
-                  </w:drawing>
-                </mc:Choice>
-                <mc:Fallback>
-                  <w:pict>
-                    <v:roundrect w14:anchorId="22AEBB71" id="AutoShape 20" o:spid="_x0000_s1026" style="position:absolute;margin-left:75.95pt;margin-top:1.2pt;width:15.4pt;height:11.05pt;z-index:251658240;visibility:visible;mso-wrap-style:square;mso-width-percent:0;mso-height-percent:0;mso-wrap-distance-left:9pt;mso-wrap-distance-top:0;mso-wrap-distance-right:9pt;mso-wrap-distance-bottom:0;mso-position-horizontal:absolute;mso-position-horizontal-relative:text;mso-position-vertical:absolute;mso-position-vertical-relative:text;mso-width-percent:0;mso-height-percent:0;mso-width-relative:page;mso-height-relative:page;v-text-anchor:top" arcsize="10923f" o:gfxdata="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" filled="f" strokecolor="#196b24">
-                      <v:shadow color="#868686"/>
-                    </v:roundrect>
-                  </w:pict>
-                </mc:Fallback>
-              </mc:AlternateContent>
-            </w:r>
-            <w:r>
-              <w:rPr>
-                <w:rFonts w:ascii="Times New Roman" w:hAnsi="Times New Roman"/>
-                <w:b/>
-                <w:sz w:val="20"/>
-                <w:szCs w:val="20"/>
-              </w:rPr>
-              <w:t>ENGENHARIA</w:t>
-            </w:r>
-            <w:r>
-              <w:rPr>
-                <w:rFonts w:ascii="Times New Roman" w:hAnsi="Times New Roman"/>
-                <w:b/>
-                <w:sz w:val="20"/>
-                <w:szCs w:val="20"/>
-              </w:rPr>
-              <w:t>:</w:t>
-            </w:r>
-          </w:p>
-        </w:tc>
-        <w:tc>
-          <w:tcPr>
-            <w:tcW w:w="2119" w:type="dxa"/>
-            <w:tcBorders>
-              <w:top w:val="single" w:sz="4" w:space="0" w:color="auto"/>
-              <w:left w:val="single" w:sz="4" w:space="0" w:color="auto"/>
-              <w:bottom w:val="single" w:sz="4" w:space="0" w:color="auto"/>
-              <w:right w:val="single" w:sz="4" w:space="0" w:color="auto"/>
-            </w:tcBorders>
-            <w:vAlign w:val="center"/>
-          </w:tcPr>
-          <w:p>
-            <w:pPr>
-              <w:keepNext/>
-              <w:keepLines/>
-              <w:suppressLineNumbers/>
-              <w:suppressAutoHyphens/>
-              <w:spacing w:after="0" w:line="256" w:lineRule="auto"/>
-              <w:rPr>
-                <w:rFonts w:ascii="Times New Roman" w:hAnsi="Times New Roman"/>
-                <w:b/>
-                <w:sz w:val="20"/>
-                <w:szCs w:val="20"/>
-              </w:rPr>
-            </w:pPr>
-            <w:r>
-              <w:rPr>
-                <w:rFonts w:ascii="Times New Roman" w:hAnsi="Times New Roman"/>
-                <w:b/>
-                <w:noProof/>
-                <w:sz w:val="20"/>
-                <w:szCs w:val="20"/>
-              </w:rPr>
-              <mc:AlternateContent>
-                <mc:Choice Requires="wps">
-                  <w:drawing>
-                    <wp:anchor distT="0" distB="0" distL="114300" distR="114300" simplePos="0" relativeHeight="251659264" behindDoc="0" locked="0" layoutInCell="1" allowOverlap="1" wp14:anchorId="3A4A4730" wp14:editId="1DD36CBA">
-                      <wp:simplePos x="0" y="0"/>
-                      <wp:positionH relativeFrom="column">
-                        <wp:posOffset>567690</wp:posOffset>
-                      </wp:positionH>
-                      <wp:positionV relativeFrom="paragraph">
-                        <wp:posOffset>24765</wp:posOffset>
-                      </wp:positionV>
-                      <wp:extent cx="195580" cy="140335"/>
-                      <wp:effectExtent l="5715" t="13970" r="8255" b="7620"/>
-                      <wp:wrapNone/>
-                      <wp:docPr id="476071933" name="AutoShape 21"/>
-                      <wp:cNvGraphicFramePr>
-                        <a:graphicFrameLocks xmlns:a="http://schemas.openxmlformats.org/drawingml/2006/main"/>
-                      </wp:cNvGraphicFramePr>
-                      <a:graphic xmlns:a="http://schemas.openxmlformats.org/drawingml/2006/main">
-                        <a:graphicData uri="http://schemas.microsoft.com/office/word/2010/wordprocessingShape">
-                          <wps:wsp>
-                            <wps:cNvSpPr>
-                              <a:spLocks noChangeArrowheads="1"/>
-                            </wps:cNvSpPr>
-                            <wps:spPr bwMode="auto">
-                              <a:xfrm>
-                                <a:off x="0" y="0"/>
-                                <a:ext cx="195580" cy="140335"/>
-                              </a:xfrm>
-                              <a:prstGeom prst="roundRect">
-                                <a:avLst>
-                                  <a:gd name="adj" fmla="val 16667"/>
-                                </a:avLst>
-                              </a:prstGeom>
-                              <a:noFill/>
-                              <a:ln w="9525">
-                                <a:solidFill>
-                                  <a:srgbClr val="196B24"/>
-                                </a:solidFill>
-                                <a:round/>
-                                <a:headEnd/>
-                                <a:tailEnd/>
-                              </a:ln>
-                              <a:effectLst/>
-                              <a:extLst>
-                                <a:ext uri="{909E8E84-426E-40DD-AFC4-6F175D3DCCD1}">
-                                  <a14:hiddenFill xmlns:a14="http://schemas.microsoft.com/office/drawing/2010/main">
-                                    <a:solidFill>
-                                      <a:srgbClr val="FFFFFF"/>
-                                    </a:solidFill>
-                                  </a14:hiddenFill>
-                                </a:ext>
-                                <a:ext uri="{AF507438-7753-43E0-B8FC-AC1667EBCBE1}">
-                                  <a14:hiddenEffects xmlns:a14="http://schemas.microsoft.com/office/drawing/2010/main">
-                                    <a:effectLst>
-                                      <a:outerShdw dist="35921" dir="2700000" algn="ctr" rotWithShape="0">
-                                        <a:srgbClr val="868686"/>
-                                      </a:outerShdw>
-                                    </a:effectLst>
-                                  </a14:hiddenEffects>
-                                </a:ext>
-                              </a:extLst>
-                            </wps:spPr>
-                            <wps:bodyPr rot="0" vert="horz" wrap="square" lIns="91440" tIns="45720" rIns="91440" bIns="45720" anchor="t" anchorCtr="0" upright="1">
-                              <a:noAutofit/>
-                            </wps:bodyPr>
-                          </wps:wsp>
-                        </a:graphicData>
-                      </a:graphic>
-                      <wp14:sizeRelH relativeFrom="page">
-                        <wp14:pctWidth>0</wp14:pctWidth>
-                      </wp14:sizeRelH>
-                      <wp14:sizeRelV relativeFrom="page">
-                        <wp14:pctHeight>0</wp14:pctHeight>
-                      </wp14:sizeRelV>
-                    </wp:anchor>
-                  </w:drawing>
-                </mc:Choice>
-                <mc:Fallback>
-                  <w:pict>
-                    <v:roundrect w14:anchorId="0C1EC122" id="AutoShape 21" o:spid="_x0000_s1026" style="position:absolute;margin-left:44.7pt;margin-top:1.95pt;width:15.4pt;height:11.05pt;z-index:251659264;visibility:visible;mso-wrap-style:square;mso-width-percent:0;mso-height-percent:0;mso-wrap-distance-left:9pt;mso-wrap-distance-top:0;mso-wrap-distance-right:9pt;mso-wrap-distance-bottom:0;mso-position-horizontal:absolute;mso-position-horizontal-relative:text;mso-position-vertical:absolute;mso-position-vertical-relative:text;mso-width-percent:0;mso-height-percent:0;mso-width-relative:page;mso-height-relative:page;v-text-anchor:top" arcsize="10923f" o:gfxdata="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" filled="f" strokecolor="#196b24">
-                      <v:shadow color="#868686"/>
-                    </v:roundrect>
-                  </w:pict>
-                </mc:Fallback>
-              </mc:AlternateContent>
-            </w:r>
-            <w:r>
-              <w:rPr>
-                <w:rFonts w:ascii="Times New Roman" w:hAnsi="Times New Roman"/>
-                <w:b/>
-                <w:sz w:val="20"/>
-                <w:szCs w:val="20"/>
-              </w:rPr>
-              <w:t>SOCIAL</w:t>
-            </w:r>
-            <w:r>
-              <w:rPr>
-                <w:rFonts w:ascii="Times New Roman" w:hAnsi="Times New Roman"/>
-                <w:b/>
-                <w:sz w:val="20"/>
-                <w:szCs w:val="20"/>
-              </w:rPr>
-              <w:t>:</w:t>
-            </w:r>
-          </w:p>
-        </w:tc>
-      </w:tr>
-      <w:tr>
-        <w:trPr>
-          <w:cantSplit/>
-          <w:trHeight w:val="1977"/>
-          <w:jc w:val="center"/>
-        </w:trPr>
-        <w:tc>
-          <w:tcPr>
-            <w:tcW w:w="10485" w:type="dxa"/>
-            <w:gridSpan w:val="7"/>
-            <w:tcBorders>
-              <w:top w:val="single" w:sz="4" w:space="0" w:color="auto"/>
-              <w:left w:val="single" w:sz="4" w:space="0" w:color="auto"/>
-              <w:bottom w:val="single" w:sz="4" w:space="0" w:color="auto"/>
-              <w:right w:val="single" w:sz="4" w:space="0" w:color="auto"/>
-            </w:tcBorders>
-            <w:hideMark/>
-          </w:tcPr>
-          <w:p>
-            <w:pPr>
-              <w:keepNext/>
-              <w:keepLines/>
-              <w:suppressLineNumbers/>
-              <w:suppressAutoHyphens/>
-              <w:spacing w:before="240" w:after="0" w:line="256" w:lineRule="auto"/>
-              <w:rPr>
-                <w:rFonts w:ascii="Times New Roman" w:hAnsi="Times New Roman"/>
-                <w:b/>
-                <w:sz w:val="20"/>
-                <w:szCs w:val="20"/>
-              </w:rPr>
-            </w:pPr>
-            <w:r>
-              <w:rPr>
-                <w:rFonts w:ascii="Times New Roman" w:eastAsia="Times New Roman" w:hAnsi="Times New Roman"/>
-                <w:b/>
-                <w:color w:val="000000"/>
-                <w:sz w:val="20"/>
-                <w:szCs w:val="20"/>
-                <w:lang w:eastAsia="pt-BR"/>
-              </w:rPr>
-              <w:t>ANÁLISE DA OCORRÊNCIA</w:t>
-            </w:r>
-            <w:r>
-              <w:rPr>
-                <w:rFonts w:ascii="Times New Roman" w:eastAsia="Times New Roman" w:hAnsi="Times New Roman"/>
-                <w:b/>
-                <w:color w:val="000000"/>
-                <w:sz w:val="20"/>
-                <w:szCs w:val="20"/>
-                <w:lang w:eastAsia="pt-BR"/>
-              </w:rPr>
-              <w:t>:</w:t>
-            </w:r>
-            <w:r>
-              <w:t xml:space="preserve"> </w:t>
-            </w:r>
-            <w:r>
-              <w:rPr>
-                <w:rFonts w:ascii="Times New Roman" w:eastAsia="Times New Roman" w:hAnsi="Times New Roman"/>
-                <w:b/>
-                <w:color w:val="000000"/>
-                <w:sz w:val="20"/>
-                <w:szCs w:val="20"/>
-                <w:lang w:eastAsia="pt-BR"/>
-              </w:rPr>
-              <w:t>[DESCRIÇÃO_OCORRÊNCIA]</w:t>
-            </w:r>
-          </w:p>
-        </w:tc>
-      </w:tr>
-      <w:tr>
-        <w:trPr>
-          <w:cantSplit/>
-          <w:trHeight w:val="2171"/>
-          <w:jc w:val="center"/>
-        </w:trPr>
-        <w:tc>
-          <w:tcPr>
-            <w:tcW w:w="10485" w:type="dxa"/>
-            <w:gridSpan w:val="7"/>
-            <w:tcBorders>
-              <w:top w:val="single" w:sz="4" w:space="0" w:color="auto"/>
-              <w:left w:val="single" w:sz="4" w:space="0" w:color="auto"/>
-              <w:bottom w:val="single" w:sz="4" w:space="0" w:color="auto"/>
-              <w:right w:val="single" w:sz="4" w:space="0" w:color="auto"/>
-            </w:tcBorders>
-            <w:hideMark/>
-          </w:tcPr>
-          <w:p>
-            <w:pPr>
-              <w:keepNext/>
-              <w:keepLines/>
-              <w:suppressLineNumbers/>
-              <w:suppressAutoHyphens/>
-              <w:spacing w:before="240" w:after="0" w:line="256" w:lineRule="auto"/>
-              <w:rPr>
-                <w:rFonts w:ascii="Times New Roman" w:hAnsi="Times New Roman"/>
-                <w:b/>
-                <w:sz w:val="20"/>
-                <w:szCs w:val="20"/>
-              </w:rPr>
-            </w:pPr>
-            <w:r>
-              <w:rPr>
-                <w:rFonts w:ascii="Times New Roman" w:eastAsia="Times New Roman" w:hAnsi="Times New Roman"/>
-                <w:b/>
-                <w:color w:val="000000"/>
-                <w:sz w:val="20"/>
-                <w:szCs w:val="20"/>
-                <w:lang w:eastAsia="pt-BR"/>
-              </w:rPr>
-              <w:t>MEDIDAS CORRETIVAS</w:t>
-            </w:r>
-            <w:r>
-              <w:rPr>
-                <w:rFonts w:ascii="Times New Roman" w:eastAsia="Times New Roman" w:hAnsi="Times New Roman"/>
-                <w:b/>
-                <w:color w:val="000000"/>
-                <w:sz w:val="20"/>
-                <w:szCs w:val="20"/>
-                <w:lang w:eastAsia="pt-BR"/>
-              </w:rPr>
-              <w:t>:</w:t>
-            </w:r>
-            <w:r>
-              <w:rPr>
-                <w:rFonts w:ascii="Times New Roman" w:eastAsia="Times New Roman" w:hAnsi="Times New Roman"/>
-                <w:b/>
-                <w:color w:val="000000"/>
-                <w:sz w:val="20"/>
-                <w:szCs w:val="20"/>
-                <w:lang w:eastAsia="pt-BR"/>
-              </w:rPr>
-              <w:t xml:space="preserve"> </w:t>
-            </w:r>
-            <w:r>
-              <w:rPr>
-                <w:rFonts w:ascii="Times New Roman" w:eastAsia="Times New Roman" w:hAnsi="Times New Roman"/>
-                <w:b/>
-                <w:color w:val="000000"/>
-                <w:sz w:val="20"/>
-                <w:szCs w:val="20"/>
-                <w:lang w:eastAsia="pt-BR"/>
-              </w:rPr>
-              <w:t>[MEDIDAS_CORRETIVAS]</w:t>
-            </w:r>
-          </w:p>
-        </w:tc>
-      </w:tr>
-      <w:tr>
-        <w:trPr>
-          <w:cantSplit/>
-          <w:trHeight w:val="2394"/>
-          <w:jc w:val="center"/>
-        </w:trPr>
-        <w:tc>
-          <w:tcPr>
-            <w:tcW w:w="10485" w:type="dxa"/>
-            <w:gridSpan w:val="7"/>
-            <w:tcBorders>
-              <w:top w:val="single" w:sz="4" w:space="0" w:color="auto"/>
-              <w:left w:val="single" w:sz="4" w:space="0" w:color="auto"/>
-              <w:bottom w:val="single" w:sz="4" w:space="0" w:color="auto"/>
-              <w:right w:val="single" w:sz="4" w:space="0" w:color="auto"/>
-            </w:tcBorders>
-            <w:hideMark/>
-          </w:tcPr>
-          <w:p>
-            <w:pPr>
-              <w:spacing w:before="240" w:after="0"/>
-              <w:rPr>
-                <w:rFonts w:ascii="Times New Roman" w:eastAsia="Times New Roman" w:hAnsi="Times New Roman"/>
-                <w:b/>
-                <w:color w:val="000000"/>
-                <w:sz w:val="20"/>
-                <w:szCs w:val="20"/>
-                <w:lang w:eastAsia="pt-BR"/>
-              </w:rPr>
-            </w:pPr>
-            <w:r>
-              <w:rPr>
-                <w:rFonts w:ascii="Times New Roman" w:eastAsia="Times New Roman" w:hAnsi="Times New Roman"/>
-                <w:b/>
-                <w:color w:val="000000"/>
-                <w:sz w:val="20"/>
-                <w:szCs w:val="20"/>
-                <w:lang w:eastAsia="pt-BR"/>
-              </w:rPr>
-              <w:t>OBSERVAÇÕES (SE HOUVER)</w:t>
-            </w:r>
-            <w:r>
-              <w:rPr>
-                <w:rFonts w:ascii="Times New Roman" w:eastAsia="Times New Roman" w:hAnsi="Times New Roman"/>
-                <w:b/>
-                <w:color w:val="000000"/>
-                <w:sz w:val="20"/>
-                <w:szCs w:val="20"/>
-                <w:lang w:eastAsia="pt-BR"/>
-              </w:rPr>
-              <w:t>:</w:t>
-            </w:r>
-            <w:r>
-              <w:rPr>
-                <w:rFonts w:ascii="Times New Roman" w:eastAsia="Times New Roman" w:hAnsi="Times New Roman"/>
-                <w:b/>
-                <w:color w:val="000000"/>
-                <w:sz w:val="20"/>
-                <w:szCs w:val="20"/>
-                <w:lang w:eastAsia="pt-BR"/>
-              </w:rPr>
-              <w:t xml:space="preserve"> </w:t>
-            </w:r>
-            <w:r>
-              <w:rPr>
-                <w:rFonts w:ascii="Times New Roman" w:eastAsia="Times New Roman" w:hAnsi="Times New Roman"/>
-                <w:b/>
-                <w:color w:val="000000"/>
-                <w:sz w:val="20"/>
-                <w:szCs w:val="20"/>
-                <w:lang w:eastAsia="pt-BR"/>
-              </w:rPr>
-              <w:t>[OBSERVAÇÕES]</w:t>
-            </w:r>
-          </w:p>
-        </w:tc>
-      </w:tr>
-    </w:tbl>
-    <w:p>
-      <w:pPr>
-        <w:pStyle w:val="Corpodetexto"/>
-        <w:spacing w:before="9" w:line="360" w:lineRule="auto"/>
-        <w:rPr>
-          <w:rFonts w:ascii="Times New Roman" w:hAnsi="Times New Roman" w:cs="Times New Roman"/>
-          <w:color w:val="000000"/>
-        </w:rPr>
-      </w:pPr>
-    </w:p>
-    <w:p>
-      <w:pPr>
-        <w:pStyle w:val="Corpodetexto"/>
-        <w:spacing w:before="9" w:line="360" w:lineRule="auto"/>
-        <w:rPr>
-          <w:rFonts w:ascii="Times New Roman" w:hAnsi="Times New Roman" w:cs="Times New Roman"/>
-          <w:color w:val="000000"/>
-        </w:rPr>
-      </w:pPr>
-      <w:r>
-        <w:rPr>
-          <w:rFonts w:ascii="Times New Roman" w:hAnsi="Times New Roman" w:cs="Times New Roman"/>
-          <w:color w:val="000000"/>
-        </w:rPr>
-        <w:br w:type="page"/>
-      </w:r>
-    </w:p>
-    <w:tbl>
-      <w:tblPr>
-        <w:tblW w:w="0" w:type="auto"/>
-        <w:tblInd w:w="817" w:type="dxa"/>
-        <w:tblBorders>
-          <w:top w:val="single" w:sz="4" w:space="0" w:color="000000"/>
-          <w:left w:val="single" w:sz="4" w:space="0" w:color="000000"/>
-          <w:bottom w:val="single" w:sz="4" w:space="0" w:color="000000"/>
-          <w:right w:val="single" w:sz="4" w:space="0" w:color="000000"/>
-          <w:insideH w:val="single" w:sz="4" w:space="0" w:color="000000"/>
-          <w:insideV w:val="single" w:sz="4" w:space="0" w:color="000000"/>
-        </w:tblBorders>
-        <w:tblLook w:val="04A0" w:firstRow="1" w:lastRow="0" w:firstColumn="1" w:lastColumn="0" w:noHBand="0" w:noVBand="1"/>
-      </w:tblPr>
-      <w:tblGrid>
-        <w:gridCol w:w="4193"/>
-        <w:gridCol w:w="4193"/>
-      </w:tblGrid>
-      <w:tr>
-        <w:trPr>
-          <w:trHeight w:val="236"/>
-        </w:trPr>
-        <w:tc>
-          <w:tcPr>
-            <w:tcW w:w="8386" w:type="dxa"/>
-            <w:gridSpan w:val="2"/>
-            <w:tcBorders>
-              <w:top w:val="single" w:sz="4" w:space="0" w:color="000000"/>
-              <w:left w:val="single" w:sz="4" w:space="0" w:color="000000"/>
-              <w:bottom w:val="single" w:sz="4" w:space="0" w:color="000000"/>
-              <w:right w:val="single" w:sz="4" w:space="0" w:color="000000"/>
-            </w:tcBorders>
-            <w:shd w:val="clear" w:color="auto" w:fill="002060"/>
-            <w:vAlign w:val="center"/>
-            <w:hideMark/>
-          </w:tcPr>
-          <w:p>
-            <w:pPr>
-              <w:jc w:val="center"/>
-              <w:rPr>
-                <w:rFonts w:ascii="Times New Roman" w:hAnsi="Times New Roman"/>
-                <w:b/>
-                <w:bCs/>
-                <w:color w:val="FFFFFF"/>
-              </w:rPr>
-            </w:pPr>
-            <w:r>
-              <w:rPr>
-                <w:rFonts w:ascii="Times New Roman" w:hAnsi="Times New Roman"/>
-                <w:b/>
-                <w:bCs/>
-                <w:color w:val="FFFFFF"/>
-              </w:rPr>
-              <w:t>REGISTRO FOTOGRÁFICO DA AÇÃO CORRETIVA</w:t>
-            </w:r>
-          </w:p>
-        </w:tc>
-      </w:tr>
-      <w:tr>
-        <w:trPr>
-          <w:trHeight w:val="236"/>
-        </w:trPr>
-        <w:tc>
-          <w:tcPr>
-            <w:tcW w:w="4193" w:type="dxa"/>
-            <w:tcBorders>
-              <w:top w:val="single" w:sz="4" w:space="0" w:color="000000"/>
-              <w:left w:val="single" w:sz="4" w:space="0" w:color="000000"/>
-              <w:bottom w:val="single" w:sz="4" w:space="0" w:color="000000"/>
-              <w:right w:val="single" w:sz="4" w:space="0" w:color="000000"/>
-            </w:tcBorders>
-            <w:shd w:val="clear" w:color="auto" w:fill="002060"/>
-            <w:vAlign w:val="center"/>
-          </w:tcPr>
-          <w:p>
-            <w:pPr>
-              <w:jc w:val="center"/>
-              <w:rPr>
-                <w:rFonts w:ascii="Times New Roman" w:hAnsi="Times New Roman"/>
-                <w:b/>
-                <w:bCs/>
-                <w:color w:val="FFFFFF"/>
-              </w:rPr>
-            </w:pPr>
-            <w:r>
-              <w:rPr>
-                <w:rFonts w:ascii="Times New Roman" w:hAnsi="Times New Roman"/>
-                <w:b/>
-                <w:color w:val="FFFFFF"/>
-                <w:lang w:eastAsia="pt-BR"/>
-              </w:rPr>
-              <w:t>FOTO 1 –</w:t>
-            </w:r>
-            <w:r>
-              <w:rPr>
-                <w:rFonts w:ascii="Times New Roman" w:hAnsi="Times New Roman"/>
-                <w:color w:val="FFFFFF"/>
-                <w:lang w:eastAsia="pt-BR"/>
-              </w:rPr>
-              <w:t xml:space="preserve"> </w:t>
-            </w:r>
-            <w:r>
-              <w:rPr>
-                <w:rFonts w:ascii="Times New Roman" w:hAnsi="Times New Roman"/>
-                <w:color w:val="FFFFFF"/>
-                <w:lang w:eastAsia="pt-BR"/>
-              </w:rPr>
-              <w:t>[LEGENDA</w:t>
-            </w:r>
-            <w:r>
-              <w:rPr>
-                <w:rFonts w:ascii="Times New Roman" w:hAnsi="Times New Roman"/>
-                <w:color w:val="FFFFFF"/>
-                <w:lang w:eastAsia="pt-BR"/>
-              </w:rPr>
-              <w:t>1</w:t>
-            </w:r>
-            <w:r>
-              <w:rPr>
-                <w:rFonts w:ascii="Times New Roman" w:hAnsi="Times New Roman"/>
-                <w:color w:val="FFFFFF"/>
-                <w:lang w:eastAsia="pt-BR"/>
-              </w:rPr>
-              <w:t>]</w:t>
-            </w:r>
-          </w:p>
-        </w:tc>
-        <w:tc>
-          <w:tcPr>
-            <w:tcW w:w="4193" w:type="dxa"/>
-            <w:tcBorders>
-              <w:top w:val="single" w:sz="4" w:space="0" w:color="000000"/>
-              <w:left w:val="single" w:sz="4" w:space="0" w:color="000000"/>
-              <w:bottom w:val="single" w:sz="4" w:space="0" w:color="000000"/>
-              <w:right w:val="single" w:sz="4" w:space="0" w:color="000000"/>
-            </w:tcBorders>
-            <w:shd w:val="clear" w:color="auto" w:fill="002060"/>
-            <w:vAlign w:val="center"/>
-          </w:tcPr>
-          <w:p>
-            <w:pPr>
-              <w:jc w:val="center"/>
-              <w:rPr>
-                <w:rFonts w:ascii="Times New Roman" w:hAnsi="Times New Roman"/>
-                <w:b/>
-                <w:bCs/>
-                <w:color w:val="FFFFFF"/>
-              </w:rPr>
-            </w:pPr>
-            <w:r>
-              <w:rPr>
-                <w:rFonts w:ascii="Times New Roman" w:hAnsi="Times New Roman"/>
-                <w:b/>
-                <w:color w:val="FFFFFF"/>
-                <w:lang w:eastAsia="pt-BR"/>
-              </w:rPr>
-              <w:t>FOTO 2 –</w:t>
-            </w:r>
-            <w:r>
-              <w:rPr>
-                <w:rFonts w:ascii="Times New Roman" w:hAnsi="Times New Roman"/>
-                <w:color w:val="FFFFFF"/>
-                <w:lang w:eastAsia="pt-BR"/>
-              </w:rPr>
-              <w:t xml:space="preserve"> </w:t>
-            </w:r>
-            <w:r>
-              <w:rPr>
-                <w:rFonts w:ascii="Times New Roman" w:hAnsi="Times New Roman"/>
-                <w:color w:val="FFFFFF"/>
-                <w:lang w:eastAsia="pt-BR"/>
-              </w:rPr>
-              <w:t>[LEGENDA</w:t>
-            </w:r>
-            <w:r>
-              <w:rPr>
-                <w:rFonts w:ascii="Times New Roman" w:hAnsi="Times New Roman"/>
-                <w:color w:val="FFFFFF"/>
-                <w:lang w:eastAsia="pt-BR"/>
-              </w:rPr>
-              <w:t>2</w:t>
-            </w:r>
-            <w:r>
-              <w:rPr>
-                <w:rFonts w:ascii="Times New Roman" w:hAnsi="Times New Roman"/>
-                <w:color w:val="FFFFFF"/>
-                <w:lang w:eastAsia="pt-BR"/>
-              </w:rPr>
-              <w:t>]</w:t>
-            </w:r>
-          </w:p>
-        </w:tc>
-      </w:tr>
-      <w:tr>
-        <w:trPr>
-          <w:trHeight w:val="2671"/>
-        </w:trPr>
-        <w:tc>
-          <w:tcPr>
-            <w:tcW w:w="4193" w:type="dxa"/>
-            <w:tcBorders>
-              <w:top w:val="single" w:sz="4" w:space="0" w:color="000000"/>
-              <w:left w:val="single" w:sz="4" w:space="0" w:color="000000"/>
-              <w:bottom w:val="single" w:sz="4" w:space="0" w:color="000000"/>
-              <w:right w:val="single" w:sz="4" w:space="0" w:color="000000"/>
-            </w:tcBorders>
-          </w:tcPr>
-          <w:p>
-            <w:pPr>
-              <w:shd w:val="clear" w:color="auto" w:fill="FFFFFF"/>
-              <w:spacing w:before="240"/>
-              <w:rPr>
-                <w:rFonts w:ascii="Times New Roman" w:hAnsi="Times New Roman"/>
-                <w:lang w:eastAsia="pt-BR"/>
-              </w:rPr>
-            </w:pPr>
-            <w:r>
-              <w:rPr>
-                <w:rFonts w:ascii="Times New Roman" w:hAnsi="Times New Roman"/>
-                <w:lang w:eastAsia="pt-BR"/>
-              </w:rPr>
-              <w:t>[FOTO_1]</w:t>
-            </w:r>
-          </w:p>
-        </w:tc>
-        <w:tc>
-          <w:tcPr>
-            <w:tcW w:w="4193" w:type="dxa"/>
-            <w:tcBorders>
-              <w:top w:val="single" w:sz="4" w:space="0" w:color="000000"/>
-              <w:left w:val="single" w:sz="4" w:space="0" w:color="000000"/>
-              <w:bottom w:val="single" w:sz="4" w:space="0" w:color="000000"/>
-              <w:right w:val="single" w:sz="4" w:space="0" w:color="000000"/>
-            </w:tcBorders>
-          </w:tcPr>
-          <w:p>
-            <w:pPr>
-              <w:shd w:val="clear" w:color="auto" w:fill="FFFFFF"/>
-              <w:spacing w:before="240"/>
-              <w:rPr>
-                <w:rFonts w:ascii="Times New Roman" w:hAnsi="Times New Roman"/>
-                <w:lang w:eastAsia="pt-BR"/>
-              </w:rPr>
-            </w:pPr>
-            <w:r>
-              <w:rPr>
-                <w:rFonts w:ascii="Times New Roman" w:hAnsi="Times New Roman"/>
-                <w:lang w:eastAsia="pt-BR"/>
-              </w:rPr>
-              <w:t>[FOTO_</w:t>
-            </w:r>
-            <w:r>
-              <w:rPr>
-                <w:rFonts w:ascii="Times New Roman" w:hAnsi="Times New Roman"/>
-                <w:lang w:eastAsia="pt-BR"/>
-              </w:rPr>
-              <w:t>2</w:t>
-            </w:r>
-            <w:r>
-              <w:rPr>
-                <w:rFonts w:ascii="Times New Roman" w:hAnsi="Times New Roman"/>
-                <w:lang w:eastAsia="pt-BR"/>
-              </w:rPr>
-              <w:t>]</w:t>
-            </w:r>
-          </w:p>
-        </w:tc>
-      </w:tr>
-      <w:tr>
-        <w:trPr>
-          <w:trHeight w:val="381"/>
-        </w:trPr>
-        <w:tc>
-          <w:tcPr>
-            <w:tcW w:w="4193" w:type="dxa"/>
-            <w:tcBorders>
-              <w:top w:val="single" w:sz="4" w:space="0" w:color="000000"/>
-              <w:left w:val="single" w:sz="4" w:space="0" w:color="000000"/>
-              <w:bottom w:val="single" w:sz="4" w:space="0" w:color="000000"/>
-              <w:right w:val="single" w:sz="4" w:space="0" w:color="000000"/>
-            </w:tcBorders>
-            <w:shd w:val="clear" w:color="auto" w:fill="002060"/>
-            <w:hideMark/>
-          </w:tcPr>
-          <w:p>
-            <w:pPr>
-              <w:jc w:val="center"/>
-              <w:rPr>
-                <w:rFonts w:ascii="Times New Roman" w:hAnsi="Times New Roman"/>
-                <w:color w:val="FFFFFF"/>
-                <w:lang w:eastAsia="pt-BR"/>
-              </w:rPr>
-            </w:pPr>
-            <w:r>
-              <w:rPr>
-                <w:rFonts w:ascii="Times New Roman" w:hAnsi="Times New Roman"/>
-                <w:b/>
-                <w:color w:val="FFFFFF"/>
-                <w:lang w:eastAsia="pt-BR"/>
-              </w:rPr>
-              <w:t>FOTO 3 –</w:t>
-            </w:r>
-            <w:r>
-              <w:rPr>
-                <w:rFonts w:ascii="Times New Roman" w:hAnsi="Times New Roman"/>
-                <w:color w:val="FFFFFF"/>
-                <w:lang w:eastAsia="pt-BR"/>
-              </w:rPr>
-              <w:t xml:space="preserve"> </w:t>
-            </w:r>
-            <w:r>
-              <w:rPr>
-                <w:rFonts w:ascii="Times New Roman" w:hAnsi="Times New Roman"/>
-                <w:color w:val="FFFFFF"/>
-                <w:lang w:eastAsia="pt-BR"/>
-              </w:rPr>
-              <w:t>[LEGENDA</w:t>
-            </w:r>
-            <w:r>
-              <w:rPr>
-                <w:rFonts w:ascii="Times New Roman" w:hAnsi="Times New Roman"/>
-                <w:color w:val="FFFFFF"/>
-                <w:lang w:eastAsia="pt-BR"/>
-              </w:rPr>
-              <w:t>3</w:t>
-            </w:r>
-            <w:r>
-              <w:rPr>
-                <w:rFonts w:ascii="Times New Roman" w:hAnsi="Times New Roman"/>
-                <w:color w:val="FFFFFF"/>
-                <w:lang w:eastAsia="pt-BR"/>
-              </w:rPr>
-              <w:t>]</w:t>
-            </w:r>
-          </w:p>
-        </w:tc>
-        <w:tc>
-          <w:tcPr>
-            <w:tcW w:w="4193" w:type="dxa"/>
-            <w:tcBorders>
-              <w:top w:val="single" w:sz="4" w:space="0" w:color="000000"/>
-              <w:left w:val="single" w:sz="4" w:space="0" w:color="000000"/>
-              <w:bottom w:val="single" w:sz="4" w:space="0" w:color="000000"/>
-              <w:right w:val="single" w:sz="4" w:space="0" w:color="000000"/>
-            </w:tcBorders>
-            <w:shd w:val="clear" w:color="auto" w:fill="002060"/>
-          </w:tcPr>
-          <w:p>
-            <w:pPr>
-              <w:jc w:val="center"/>
-              <w:rPr>
-                <w:rFonts w:ascii="Times New Roman" w:hAnsi="Times New Roman"/>
-                <w:color w:val="FFFFFF"/>
-                <w:lang w:eastAsia="pt-BR"/>
-              </w:rPr>
-            </w:pPr>
-            <w:r>
-              <w:rPr>
-                <w:rFonts w:ascii="Times New Roman" w:hAnsi="Times New Roman"/>
-                <w:b/>
-                <w:color w:val="FFFFFF"/>
-                <w:lang w:eastAsia="pt-BR"/>
-              </w:rPr>
-              <w:t>FOTO 4 –</w:t>
-            </w:r>
-            <w:r>
-              <w:rPr>
-                <w:rFonts w:ascii="Times New Roman" w:hAnsi="Times New Roman"/>
-                <w:color w:val="FFFFFF"/>
-                <w:lang w:eastAsia="pt-BR"/>
-              </w:rPr>
-              <w:t xml:space="preserve"> </w:t>
-            </w:r>
-            <w:r>
-              <w:rPr>
-                <w:rFonts w:ascii="Times New Roman" w:hAnsi="Times New Roman"/>
-                <w:color w:val="FFFFFF"/>
-                <w:lang w:eastAsia="pt-BR"/>
-              </w:rPr>
-              <w:t>[LEGENDA</w:t>
-            </w:r>
-            <w:r>
-              <w:rPr>
-                <w:rFonts w:ascii="Times New Roman" w:hAnsi="Times New Roman"/>
-                <w:color w:val="FFFFFF"/>
-                <w:lang w:eastAsia="pt-BR"/>
-              </w:rPr>
-              <w:t>4</w:t>
-            </w:r>
-            <w:r>
-              <w:rPr>
-                <w:rFonts w:ascii="Times New Roman" w:hAnsi="Times New Roman"/>
-                <w:color w:val="FFFFFF"/>
-                <w:lang w:eastAsia="pt-BR"/>
-              </w:rPr>
-              <w:t>]</w:t>
-            </w:r>
-          </w:p>
-        </w:tc>
-      </w:tr>
-      <w:tr>
-        <w:trPr>
-          <w:trHeight w:val="2835"/>
-        </w:trPr>
-        <w:tc>
-          <w:tcPr>
-            <w:tcW w:w="4193" w:type="dxa"/>
-            <w:tcBorders>
-              <w:top w:val="single" w:sz="4" w:space="0" w:color="000000"/>
-              <w:left w:val="single" w:sz="4" w:space="0" w:color="000000"/>
-              <w:bottom w:val="single" w:sz="4" w:space="0" w:color="000000"/>
-              <w:right w:val="single" w:sz="4" w:space="0" w:color="000000"/>
-            </w:tcBorders>
-          </w:tcPr>
-          <w:p>
-            <w:pPr>
-              <w:shd w:val="clear" w:color="auto" w:fill="FFFFFF"/>
-              <w:spacing w:before="240"/>
-              <w:rPr>
-                <w:rFonts w:ascii="Times New Roman" w:hAnsi="Times New Roman"/>
-                <w:b/>
-                <w:lang w:eastAsia="pt-BR"/>
-              </w:rPr>
-            </w:pPr>
-            <w:r>
-              <w:rPr>
-                <w:rFonts w:ascii="Times New Roman" w:hAnsi="Times New Roman"/>
-                <w:lang w:eastAsia="pt-BR"/>
-              </w:rPr>
-              <w:t>[FOTO_3]</w:t>
-            </w:r>
-          </w:p>
-        </w:tc>
-        <w:tc>
-          <w:tcPr>
-            <w:tcW w:w="4193" w:type="dxa"/>
-            <w:tcBorders>
-              <w:top w:val="single" w:sz="4" w:space="0" w:color="000000"/>
-              <w:left w:val="single" w:sz="4" w:space="0" w:color="000000"/>
-              <w:bottom w:val="single" w:sz="4" w:space="0" w:color="000000"/>
-              <w:right w:val="single" w:sz="4" w:space="0" w:color="000000"/>
-            </w:tcBorders>
-          </w:tcPr>
-          <w:p>
-            <w:pPr>
-              <w:shd w:val="clear" w:color="auto" w:fill="FFFFFF"/>
-              <w:spacing w:before="240"/>
-              <w:rPr>
-                <w:rFonts w:ascii="Times New Roman" w:hAnsi="Times New Roman"/>
-                <w:b/>
-                <w:lang w:eastAsia="pt-BR"/>
-              </w:rPr>
-            </w:pPr>
-            <w:r>
-              <w:rPr>
-                <w:rFonts w:ascii="Times New Roman" w:hAnsi="Times New Roman"/>
-                <w:lang w:eastAsia="pt-BR"/>
-              </w:rPr>
-              <w:t>[FOTO_</w:t>
-            </w:r>
-            <w:r>
-              <w:rPr>
-                <w:rFonts w:ascii="Times New Roman" w:hAnsi="Times New Roman"/>
-                <w:lang w:eastAsia="pt-BR"/>
-              </w:rPr>
-              <w:t>4</w:t>
-            </w:r>
-            <w:r>
-              <w:rPr>
-                <w:rFonts w:ascii="Times New Roman" w:hAnsi="Times New Roman"/>
-                <w:lang w:eastAsia="pt-BR"/>
-              </w:rPr>
-              <w:t>]</w:t>
-            </w:r>
-          </w:p>
-        </w:tc>
-      </w:tr>
-    </w:tbl>
-    <w:p>
-      <w:pPr>
-        <w:spacing w:after="0"/>
-        <w:rPr>
-          <w:vanish/>
-        </w:rPr>
-      </w:pPr>
-    </w:p>
-    <w:p>
-      <w:pPr>
-        <w:spacing w:after="0"/>
-        <w:rPr>
-          <w:vanish/>
-        </w:rPr>
-      </w:pPr>
-    </w:p>
-    <w:p>
-      <w:pPr>
-        <w:spacing w:after="0"/>
-        <w:rPr>
-          <w:vanish/>
-        </w:rPr>
-      </w:pPr>
-    </w:p>
-    <w:p>
-      <w:pPr>
-        <w:spacing w:after="0"/>
-        <w:rPr>
-          <w:vanish/>
-        </w:rPr>
-      </w:pPr>
-    </w:p>
-    <w:p>
-      <w:pPr>
-        <w:spacing w:after="0"/>
-        <w:rPr>
-          <w:vanish/>
-        </w:rPr>
-      </w:pPr>
-    </w:p>
-    <w:p>
-      <w:pPr>
-        <w:spacing w:after="0"/>
-        <w:rPr>
-          <w:vanish/>
-        </w:rPr>
-      </w:pPr>
-    </w:p>
-    <w:p>
-      <w:pPr>
-        <w:tabs>
-          <w:tab w:val="left" w:pos="3587"/>
-        </w:tabs>
-        <w:spacing w:after="0"/>
-        <w:jc w:val="both"/>
-        <w:rPr>
-          <w:rFonts w:ascii="Times New Roman" w:hAnsi="Times New Roman"/>
-          <w:b/>
-          <w:sz w:val="22"/>
-          <w:szCs w:val="22"/>
-        </w:rPr>
-      </w:pPr>
-    </w:p>
-    <w:sectPr>
-      <w:headerReference w:type="even" r:id="rId7"/>
-      <w:headerReference w:type="default" r:id="rId8"/>
-      <w:headerReference w:type="first" r:id="rId9"/>
-      <w:pgSz w:w="11900" w:h="16840"/>
-      <w:pgMar w:top="1418" w:right="1134" w:bottom="1560" w:left="1418" w:header="397" w:footer="567" w:gutter="0"/>
-      <w:cols w:space="708"/>
-      <w:docGrid w:linePitch="326"/>
-    </w:sectPr>
-  </w:body>
-</w:document>
+<ns0:document xmlns:ns0="http://schemas.openxmlformats.org/wordprocessingml/2006/main" xmlns:ns1="http://schemas.openxmlformats.org/markup-compatibility/2006" xmlns:ns10="http://schemas.openxmlformats.org/officeDocument/2006/relationships" xmlns:ns2="http://schemas.microsoft.com/office/word/2010/wordml" xmlns:ns3="http://schemas.openxmlformats.org/drawingml/2006/wordprocessingDrawing" xmlns:ns4="http://schemas.microsoft.com/office/word/2010/wordprocessingDrawing" xmlns:ns5="http://schemas.openxmlformats.org/drawingml/2006/main" xmlns:ns6="http://schemas.microsoft.com/office/word/2010/wordprocessingShape" xmlns:ns7="http://schemas.microsoft.com/office/drawing/2010/main" xmlns:ns8="urn:schemas-microsoft-com:vml" xmlns:ns9="urn:schemas-microsoft-com:office:office" ns1:Ignorable="w14 w15 w16se w16cid w16 w16cex w16sdtdh w16sdtfl w16du wp14">
+  <ns0:body>
+    <ns0:tbl>
+      <ns0:tblPr>
+        <ns0:tblW ns0:w="9348" ns0:type="dxa"/>
+        <ns0:jc ns0:val="center"/>
+        <ns0:shd ns0:val="clear" ns0:color="auto" ns0:fill="FFFFFF"/>
+        <ns0:tblLayout ns0:type="fixed"/>
+        <ns0:tblCellMar>
+          <ns0:left ns0:w="70" ns0:type="dxa"/>
+          <ns0:right ns0:w="70" ns0:type="dxa"/>
+        </ns0:tblCellMar>
+        <ns0:tblLook ns0:val="04A0" ns0:firstRow="1" ns0:lastRow="0" ns0:firstColumn="1" ns0:lastColumn="0" ns0:noHBand="0" ns0:noVBand="1"/>
+      </ns0:tblPr>
+      <ns0:tblGrid>
+        <ns0:gridCol ns0:w="2337"/>
+        <ns0:gridCol ns0:w="1330"/>
+        <ns0:gridCol ns0:w="1770"/>
+        <ns0:gridCol ns0:w="126"/>
+        <ns0:gridCol ns0:w="1138"/>
+        <ns0:gridCol ns0:w="759"/>
+        <ns0:gridCol ns0:w="1888"/>
+      </ns0:tblGrid>
+      <ns0:tr ns0:rsidR="003B0023" ns2:paraId="076FAD70" ns2:textId="77777777" ns0:rsidTr="007F5E4E">
+        <ns0:trPr>
+          <ns0:cantSplit/>
+          <ns0:trHeight ns0:val="454"/>
+          <ns0:jc ns0:val="center"/>
+        </ns0:trPr>
+        <ns0:tc>
+          <ns0:tcPr>
+            <ns0:tcW ns0:w="9348" ns0:type="dxa"/>
+            <ns0:gridSpan ns0:val="7"/>
+            <ns0:tcBorders>
+              <ns0:top ns0:val="single" ns0:sz="4" ns0:space="0" ns0:color="auto"/>
+              <ns0:left ns0:val="single" ns0:sz="4" ns0:space="0" ns0:color="auto"/>
+              <ns0:bottom ns0:val="single" ns0:sz="4" ns0:space="0" ns0:color="auto"/>
+              <ns0:right ns0:val="single" ns0:sz="4" ns0:space="0" ns0:color="auto"/>
+            </ns0:tcBorders>
+            <ns0:shd ns0:val="clear" ns0:color="auto" ns0:fill="002060"/>
+            <ns0:vAlign ns0:val="center"/>
+          </ns0:tcPr>
+          <ns0:p ns2:paraId="2E5ED720" ns2:textId="77777777" ns0:rsidR="003B0023" ns0:rsidRDefault="003B0023" ns0:rsidP="006D3A5C">
+            <ns0:pPr>
+              <ns0:keepNext/>
+              <ns0:keepLines/>
+              <ns0:suppressLineNumbers/>
+              <ns0:suppressAutoHyphens/>
+              <ns0:spacing ns0:after="0" ns0:line="256" ns0:lineRule="auto"/>
+              <ns0:jc ns0:val="center"/>
+              <ns0:rPr>
+                <ns0:rFonts ns0:ascii="Times New Roman" ns0:hAnsi="Times New Roman"/>
+                <ns0:b/>
+                <ns0:color ns0:val="FFFFFF"/>
+                <ns0:sz ns0:val="20"/>
+                <ns0:szCs ns0:val="20"/>
+              </ns0:rPr>
+            </ns0:pPr>
+            <ns0:r>
+              <ns0:rPr>
+                <ns0:rFonts ns0:ascii="Times New Roman" ns0:hAnsi="Times New Roman"/>
+                <ns0:b/>
+                <ns0:color ns0:val="FFFFFF"/>
+                <ns0:sz ns0:val="20"/>
+                <ns0:szCs ns0:val="20"/>
+              </ns0:rPr>
+              <ns0:t>INFORMAÇÕES DA TRATATIVA</ns0:t>
+            </ns0:r>
+          </ns0:p>
+        </ns0:tc>
+      </ns0:tr>
+      <ns0:tr ns0:rsidR="003B0023" ns2:paraId="07CAA121" ns2:textId="77777777" ns0:rsidTr="007F5E4E">
+        <ns0:trPr>
+          <ns0:cantSplit/>
+          <ns0:trHeight ns0:val="454"/>
+          <ns0:jc ns0:val="center"/>
+        </ns0:trPr>
+        <ns0:tc>
+          <ns0:tcPr>
+            <ns0:tcW ns0:w="3667" ns0:type="dxa"/>
+            <ns0:gridSpan ns0:val="2"/>
+            <ns0:tcBorders>
+              <ns0:top ns0:val="single" ns0:sz="4" ns0:space="0" ns0:color="auto"/>
+              <ns0:left ns0:val="single" ns0:sz="4" ns0:space="0" ns0:color="auto"/>
+              <ns0:bottom ns0:val="single" ns0:sz="4" ns0:space="0" ns0:color="auto"/>
+              <ns0:right ns0:val="single" ns0:sz="4" ns0:space="0" ns0:color="auto"/>
+            </ns0:tcBorders>
+            <ns0:shd ns0:val="clear" ns0:color="auto" ns0:fill="002060"/>
+            <ns0:vAlign ns0:val="center"/>
+          </ns0:tcPr>
+          <ns0:p ns2:paraId="625D47C0" ns2:textId="77777777" ns0:rsidR="003B0023" ns0:rsidRDefault="003B0023" ns0:rsidP="006D3A5C">
+            <ns0:pPr>
+              <ns0:keepNext/>
+              <ns0:keepLines/>
+              <ns0:suppressLineNumbers/>
+              <ns0:suppressAutoHyphens/>
+              <ns0:spacing ns0:after="0" ns0:line="256" ns0:lineRule="auto"/>
+              <ns0:jc ns0:val="center"/>
+              <ns0:rPr>
+                <ns0:rFonts ns0:ascii="Times New Roman" ns0:hAnsi="Times New Roman"/>
+                <ns0:b/>
+                <ns0:color ns0:val="FFFFFF"/>
+                <ns0:sz ns0:val="20"/>
+                <ns0:szCs ns0:val="20"/>
+              </ns0:rPr>
+            </ns0:pPr>
+            <ns0:r>
+              <ns0:rPr>
+                <ns0:rFonts ns0:ascii="Times New Roman" ns0:hAnsi="Times New Roman"/>
+                <ns0:b/>
+                <ns0:color ns0:val="FFFFFF"/>
+                <ns0:sz ns0:val="20"/>
+                <ns0:szCs ns0:val="20"/>
+              </ns0:rPr>
+              <ns0:t>RNC Nº:</ns0:t>
+            </ns0:r>
+          </ns0:p>
+        </ns0:tc>
+        <ns0:tc>
+          <ns0:tcPr>
+            <ns0:tcW ns0:w="3033" ns0:type="dxa"/>
+            <ns0:gridSpan ns0:val="3"/>
+            <ns0:tcBorders>
+              <ns0:top ns0:val="single" ns0:sz="4" ns0:space="0" ns0:color="auto"/>
+              <ns0:left ns0:val="single" ns0:sz="4" ns0:space="0" ns0:color="auto"/>
+              <ns0:bottom ns0:val="single" ns0:sz="4" ns0:space="0" ns0:color="auto"/>
+              <ns0:right ns0:val="single" ns0:sz="4" ns0:space="0" ns0:color="auto"/>
+            </ns0:tcBorders>
+            <ns0:shd ns0:val="clear" ns0:color="auto" ns0:fill="002060"/>
+            <ns0:vAlign ns0:val="center"/>
+          </ns0:tcPr>
+          <ns0:p ns2:paraId="2F967515" ns2:textId="77777777" ns0:rsidR="003B0023" ns0:rsidRDefault="003B0023" ns0:rsidP="006D3A5C">
+            <ns0:pPr>
+              <ns0:keepNext/>
+              <ns0:keepLines/>
+              <ns0:suppressLineNumbers/>
+              <ns0:suppressAutoHyphens/>
+              <ns0:spacing ns0:after="0" ns0:line="256" ns0:lineRule="auto"/>
+              <ns0:jc ns0:val="center"/>
+              <ns0:rPr>
+                <ns0:rFonts ns0:ascii="Times New Roman" ns0:hAnsi="Times New Roman"/>
+                <ns0:b/>
+                <ns0:color ns0:val="FFFFFF"/>
+                <ns0:sz ns0:val="20"/>
+                <ns0:szCs ns0:val="20"/>
+              </ns0:rPr>
+            </ns0:pPr>
+            <ns0:r>
+              <ns0:rPr>
+                <ns0:rFonts ns0:ascii="Times New Roman" ns0:hAnsi="Times New Roman"/>
+                <ns0:b/>
+                <ns0:color ns0:val="FFFFFF"/>
+                <ns0:sz ns0:val="20"/>
+                <ns0:szCs ns0:val="20"/>
+              </ns0:rPr>
+              <ns0:t>DATA DA EMISSÃO DA RNC:</ns0:t>
+            </ns0:r>
+          </ns0:p>
+        </ns0:tc>
+        <ns0:tc>
+          <ns0:tcPr>
+            <ns0:tcW ns0:w="2648" ns0:type="dxa"/>
+            <ns0:gridSpan ns0:val="2"/>
+            <ns0:tcBorders>
+              <ns0:top ns0:val="single" ns0:sz="4" ns0:space="0" ns0:color="auto"/>
+              <ns0:left ns0:val="single" ns0:sz="4" ns0:space="0" ns0:color="auto"/>
+              <ns0:bottom ns0:val="single" ns0:sz="4" ns0:space="0" ns0:color="auto"/>
+              <ns0:right ns0:val="single" ns0:sz="4" ns0:space="0" ns0:color="auto"/>
+            </ns0:tcBorders>
+            <ns0:shd ns0:val="clear" ns0:color="auto" ns0:fill="002060"/>
+            <ns0:vAlign ns0:val="center"/>
+          </ns0:tcPr>
+          <ns0:p ns2:paraId="3A16626C" ns2:textId="77777777" ns0:rsidR="003B0023" ns0:rsidRDefault="003B0023" ns0:rsidP="006D3A5C">
+            <ns0:pPr>
+              <ns0:keepNext/>
+              <ns0:keepLines/>
+              <ns0:suppressLineNumbers/>
+              <ns0:suppressAutoHyphens/>
+              <ns0:spacing ns0:after="0" ns0:line="256" ns0:lineRule="auto"/>
+              <ns0:jc ns0:val="center"/>
+              <ns0:rPr>
+                <ns0:rFonts ns0:ascii="Times New Roman" ns0:hAnsi="Times New Roman"/>
+                <ns0:b/>
+                <ns0:color ns0:val="FFFFFF"/>
+                <ns0:sz ns0:val="20"/>
+                <ns0:szCs ns0:val="20"/>
+              </ns0:rPr>
+            </ns0:pPr>
+            <ns0:r>
+              <ns0:rPr>
+                <ns0:rFonts ns0:ascii="Times New Roman" ns0:hAnsi="Times New Roman"/>
+                <ns0:b/>
+                <ns0:color ns0:val="FFFFFF"/>
+                <ns0:sz ns0:val="20"/>
+                <ns0:szCs ns0:val="20"/>
+              </ns0:rPr>
+              <ns0:t>DATA DA EMISSÃO DA TRATATIVA:</ns0:t>
+            </ns0:r>
+          </ns0:p>
+        </ns0:tc>
+      </ns0:tr>
+      <ns0:tr ns0:rsidR="003B0023" ns0:rsidRPr="003B0023" ns2:paraId="0BEA369F" ns2:textId="77777777" ns0:rsidTr="00967D7E">
+        <ns0:trPr>
+          <ns0:cantSplit/>
+          <ns0:trHeight ns0:val="623"/>
+          <ns0:jc ns0:val="center"/>
+        </ns0:trPr>
+        <ns0:tc>
+          <ns0:tcPr>
+            <ns0:tcW ns0:w="3667" ns0:type="dxa"/>
+            <ns0:gridSpan ns0:val="2"/>
+            <ns0:tcBorders>
+              <ns0:top ns0:val="single" ns0:sz="4" ns0:space="0" ns0:color="auto"/>
+              <ns0:left ns0:val="single" ns0:sz="4" ns0:space="0" ns0:color="auto"/>
+              <ns0:bottom ns0:val="single" ns0:sz="4" ns0:space="0" ns0:color="auto"/>
+              <ns0:right ns0:val="single" ns0:sz="4" ns0:space="0" ns0:color="auto"/>
+            </ns0:tcBorders>
+            <ns0:shd ns0:val="clear" ns0:color="auto" ns0:fill="FFFFFF"/>
+            <ns0:vAlign ns0:val="center"/>
+          </ns0:tcPr>
+          <ns0:p ns2:paraId="039424F1" ns2:textId="77777777" ns0:rsidR="003B0023" ns0:rsidRPr="003B0023" ns0:rsidRDefault="00967D7E" ns0:rsidP="003B0023">
+            <ns0:pPr>
+              <ns0:keepNext/>
+              <ns0:keepLines/>
+              <ns0:suppressLineNumbers/>
+              <ns0:suppressAutoHyphens/>
+              <ns0:spacing ns0:after="0" ns0:line="256" ns0:lineRule="auto"/>
+              <ns0:jc ns0:val="center"/>
+              <ns0:rPr>
+                <ns0:rFonts ns0:ascii="Times New Roman" ns0:hAnsi="Times New Roman"/>
+                <ns0:b/>
+                <ns0:sz ns0:val="20"/>
+                <ns0:szCs ns0:val="20"/>
+              </ns0:rPr>
+            </ns0:pPr>
+            <ns0:r ns0:rsidRPr="00967D7E">
+              <ns0:rPr>
+                <ns0:rFonts ns0:ascii="Times New Roman" ns0:hAnsi="Times New Roman"/>
+                <ns0:b/>
+                <ns0:sz ns0:val="20"/>
+                <ns0:szCs ns0:val="20"/>
+              </ns0:rPr>
+              <ns0:t>[NÚMERO_RNC]</ns0:t>
+            </ns0:r>
+          </ns0:p>
+        </ns0:tc>
+        <ns0:tc>
+          <ns0:tcPr>
+            <ns0:tcW ns0:w="3033" ns0:type="dxa"/>
+            <ns0:gridSpan ns0:val="3"/>
+            <ns0:tcBorders>
+              <ns0:top ns0:val="single" ns0:sz="4" ns0:space="0" ns0:color="auto"/>
+              <ns0:left ns0:val="single" ns0:sz="4" ns0:space="0" ns0:color="auto"/>
+              <ns0:bottom ns0:val="single" ns0:sz="4" ns0:space="0" ns0:color="auto"/>
+              <ns0:right ns0:val="single" ns0:sz="4" ns0:space="0" ns0:color="auto"/>
+            </ns0:tcBorders>
+            <ns0:shd ns0:val="clear" ns0:color="auto" ns0:fill="FFFFFF"/>
+            <ns0:vAlign ns0:val="center"/>
+          </ns0:tcPr>
+          <ns0:p ns2:paraId="6559DCA2" ns2:textId="77777777" ns0:rsidR="003B0023" ns0:rsidRPr="003B0023" ns0:rsidRDefault="00967D7E" ns0:rsidP="00967D7E">
+            <ns0:pPr>
+              <ns0:keepNext/>
+              <ns0:keepLines/>
+              <ns0:suppressLineNumbers/>
+              <ns0:suppressAutoHyphens/>
+              <ns0:spacing ns0:after="0" ns0:line="256" ns0:lineRule="auto"/>
+              <ns0:rPr>
+                <ns0:rFonts ns0:ascii="Times New Roman" ns0:hAnsi="Times New Roman"/>
+                <ns0:b/>
+                <ns0:sz ns0:val="20"/>
+                <ns0:szCs ns0:val="20"/>
+              </ns0:rPr>
+            </ns0:pPr>
+            <ns0:r ns0:rsidRPr="00967D7E">
+              <ns0:rPr>
+                <ns0:rFonts ns0:ascii="Times New Roman" ns0:hAnsi="Times New Roman"/>
+                <ns0:b/>
+                <ns0:sz ns0:val="20"/>
+                <ns0:szCs ns0:val="20"/>
+              </ns0:rPr>
+              <ns0:t>[DATA_EMISSÃO]</ns0:t>
+            </ns0:r>
+          </ns0:p>
+        </ns0:tc>
+        <ns0:tc>
+          <ns0:tcPr>
+            <ns0:tcW ns0:w="2648" ns0:type="dxa"/>
+            <ns0:gridSpan ns0:val="2"/>
+            <ns0:tcBorders>
+              <ns0:top ns0:val="single" ns0:sz="4" ns0:space="0" ns0:color="auto"/>
+              <ns0:left ns0:val="single" ns0:sz="4" ns0:space="0" ns0:color="auto"/>
+              <ns0:bottom ns0:val="single" ns0:sz="4" ns0:space="0" ns0:color="auto"/>
+              <ns0:right ns0:val="single" ns0:sz="4" ns0:space="0" ns0:color="auto"/>
+            </ns0:tcBorders>
+            <ns0:shd ns0:val="clear" ns0:color="auto" ns0:fill="FFFFFF"/>
+            <ns0:vAlign ns0:val="center"/>
+          </ns0:tcPr>
+          <ns0:p ns2:paraId="43721DB3" ns2:textId="77777777" ns0:rsidR="003B0023" ns0:rsidRPr="003B0023" ns0:rsidRDefault="00967D7E" ns0:rsidP="00967D7E">
+            <ns0:pPr>
+              <ns0:keepNext/>
+              <ns0:keepLines/>
+              <ns0:suppressLineNumbers/>
+              <ns0:suppressAutoHyphens/>
+              <ns0:spacing ns0:after="0" ns0:line="256" ns0:lineRule="auto"/>
+              <ns0:jc ns0:val="center"/>
+              <ns0:rPr>
+                <ns0:rFonts ns0:ascii="Times New Roman" ns0:hAnsi="Times New Roman"/>
+                <ns0:b/>
+                <ns0:sz ns0:val="20"/>
+                <ns0:szCs ns0:val="20"/>
+              </ns0:rPr>
+            </ns0:pPr>
+            <ns0:r ns0:rsidRPr="00967D7E">
+              <ns0:rPr>
+                <ns0:rFonts ns0:ascii="Times New Roman" ns0:hAnsi="Times New Roman"/>
+                <ns0:b/>
+                <ns0:sz ns0:val="20"/>
+                <ns0:szCs ns0:val="20"/>
+              </ns0:rPr>
+              <ns0:t>[DATA_HOJE]</ns0:t>
+            </ns0:r>
+          </ns0:p>
+        </ns0:tc>
+      </ns0:tr>
+      <ns0:tr ns0:rsidR="003B0023" ns0:rsidRPr="003B0023" ns2:paraId="533F04C7" ns2:textId="77777777" ns0:rsidTr="006D3A5C">
+        <ns0:trPr>
+          <ns0:cantSplit/>
+          <ns0:trHeight ns0:val="844"/>
+          <ns0:jc ns0:val="center"/>
+        </ns0:trPr>
+        <ns0:tc>
+          <ns0:tcPr>
+            <ns0:tcW ns0:w="5562" ns0:type="dxa"/>
+            <ns0:gridSpan ns0:val="4"/>
+            <ns0:tcBorders>
+              <ns0:top ns0:val="single" ns0:sz="4" ns0:space="0" ns0:color="auto"/>
+              <ns0:left ns0:val="single" ns0:sz="4" ns0:space="0" ns0:color="auto"/>
+              <ns0:bottom ns0:val="single" ns0:sz="4" ns0:space="0" ns0:color="auto"/>
+              <ns0:right ns0:val="single" ns0:sz="4" ns0:space="0" ns0:color="auto"/>
+            </ns0:tcBorders>
+            <ns0:hideMark/>
+          </ns0:tcPr>
+          <ns0:p ns2:paraId="333E1607" ns2:textId="77777777" ns0:rsidR="003B0023" ns0:rsidRPr="003B0023" ns0:rsidRDefault="003B0023" ns0:rsidP="003B0023">
+            <ns0:pPr>
+              <ns0:keepNext/>
+              <ns0:keepLines/>
+              <ns0:suppressLineNumbers/>
+              <ns0:suppressAutoHyphens/>
+              <ns0:spacing ns0:after="0" ns0:line="256" ns0:lineRule="auto"/>
+              <ns0:rPr>
+                <ns0:rFonts ns0:ascii="Times New Roman" ns0:hAnsi="Times New Roman"/>
+                <ns0:b/>
+                <ns0:sz ns0:val="20"/>
+                <ns0:szCs ns0:val="20"/>
+              </ns0:rPr>
+            </ns0:pPr>
+            <ns0:r>
+              <ns0:rPr>
+                <ns0:rFonts ns0:ascii="Times New Roman" ns0:hAnsi="Times New Roman"/>
+                <ns0:b/>
+                <ns0:sz ns0:val="20"/>
+                <ns0:szCs ns0:val="20"/>
+              </ns0:rPr>
+              <ns0:t>LOCAL/ FRENTE:</ns0:t>
+            </ns0:r>
+            <ns0:r ns0:rsidR="00967D7E">
+              <ns0:rPr>
+                <ns0:rFonts ns0:ascii="Times New Roman" ns0:hAnsi="Times New Roman"/>
+                <ns0:b/>
+                <ns0:sz ns0:val="20"/>
+                <ns0:szCs ns0:val="20"/>
+              </ns0:rPr>
+              <ns0:t xml:space="preserve"> </ns0:t>
+            </ns0:r>
+            <ns0:r ns0:rsidR="00967D7E" ns0:rsidRPr="00967D7E">
+              <ns0:rPr>
+                <ns0:rFonts ns0:ascii="Times New Roman" ns0:hAnsi="Times New Roman"/>
+                <ns0:b/>
+                <ns0:sz ns0:val="20"/>
+                <ns0:szCs ns0:val="20"/>
+              </ns0:rPr>
+              <ns0:t>[LOCAL/ FRENTE]</ns0:t>
+            </ns0:r>
+          </ns0:p>
+          <ns0:p ns2:paraId="6FDFE115" ns2:textId="77777777" ns0:rsidR="003B0023" ns0:rsidRPr="003B0023" ns0:rsidRDefault="003B0023" ns0:rsidP="003B0023">
+            <ns0:pPr>
+              <ns0:keepNext/>
+              <ns0:keepLines/>
+              <ns0:suppressLineNumbers/>
+              <ns0:suppressAutoHyphens/>
+              <ns0:spacing ns0:after="0" ns0:line="256" ns0:lineRule="auto"/>
+              <ns0:rPr>
+                <ns0:rFonts ns0:ascii="Times New Roman" ns0:hAnsi="Times New Roman"/>
+                <ns0:b/>
+                <ns0:sz ns0:val="20"/>
+                <ns0:szCs ns0:val="20"/>
+              </ns0:rPr>
+            </ns0:pPr>
+          </ns0:p>
+        </ns0:tc>
+        <ns0:tc>
+          <ns0:tcPr>
+            <ns0:tcW ns0:w="3786" ns0:type="dxa"/>
+            <ns0:gridSpan ns0:val="3"/>
+            <ns0:tcBorders>
+              <ns0:top ns0:val="single" ns0:sz="4" ns0:space="0" ns0:color="auto"/>
+              <ns0:left ns0:val="single" ns0:sz="4" ns0:space="0" ns0:color="auto"/>
+              <ns0:bottom ns0:val="single" ns0:sz="4" ns0:space="0" ns0:color="auto"/>
+              <ns0:right ns0:val="single" ns0:sz="4" ns0:space="0" ns0:color="auto"/>
+            </ns0:tcBorders>
+          </ns0:tcPr>
+          <ns0:p ns2:paraId="7ACADAF6" ns2:textId="77777777" ns0:rsidR="003B0023" ns0:rsidRPr="003B0023" ns0:rsidRDefault="003B0023" ns0:rsidP="00C41824">
+            <ns0:pPr>
+              <ns0:keepNext/>
+              <ns0:keepLines/>
+              <ns0:suppressLineNumbers/>
+              <ns0:suppressAutoHyphens/>
+              <ns0:spacing ns0:after="0" ns0:line="256" ns0:lineRule="auto"/>
+              <ns0:rPr>
+                <ns0:rFonts ns0:ascii="Times New Roman" ns0:hAnsi="Times New Roman"/>
+                <ns0:b/>
+                <ns0:sz ns0:val="20"/>
+                <ns0:szCs ns0:val="20"/>
+              </ns0:rPr>
+            </ns0:pPr>
+            <ns0:r>
+              <ns0:rPr>
+                <ns0:rFonts ns0:ascii="Times New Roman" ns0:hAnsi="Times New Roman"/>
+                <ns0:b/>
+                <ns0:sz ns0:val="20"/>
+                <ns0:szCs ns0:val="20"/>
+              </ns0:rPr>
+              <ns0:t>CONTRATO:</ns0:t>
+            </ns0:r>
+            <ns0:r ns0:rsidR="00967D7E">
+              <ns0:rPr>
+                <ns0:rFonts ns0:ascii="Times New Roman" ns0:hAnsi="Times New Roman"/>
+                <ns0:b/>
+                <ns0:sz ns0:val="20"/>
+                <ns0:szCs ns0:val="20"/>
+              </ns0:rPr>
+              <ns0:t xml:space="preserve"> </ns0:t>
+            </ns0:r>
+            <ns0:r ns0:rsidR="00967D7E" ns0:rsidRPr="00967D7E">
+              <ns0:rPr>
+                <ns0:rFonts ns0:ascii="Times New Roman" ns0:hAnsi="Times New Roman"/>
+                <ns0:b/>
+                <ns0:sz ns0:val="20"/>
+                <ns0:szCs ns0:val="20"/>
+              </ns0:rPr>
+              <ns0:t>[CONTRATO]</ns0:t>
+            </ns0:r>
+          </ns0:p>
+        </ns0:tc>
+      </ns0:tr>
+      <ns0:tr ns0:rsidR="003B0023" ns0:rsidRPr="003B0023" ns2:paraId="312BE020" ns2:textId="77777777" ns0:rsidTr="003B0023">
+        <ns0:trPr>
+          <ns0:cantSplit/>
+          <ns0:trHeight ns0:val="1134"/>
+          <ns0:jc ns0:val="center"/>
+        </ns0:trPr>
+        <ns0:tc>
+          <ns0:tcPr>
+            <ns0:tcW ns0:w="9348" ns0:type="dxa"/>
+            <ns0:gridSpan ns0:val="7"/>
+            <ns0:tcBorders>
+              <ns0:top ns0:val="single" ns0:sz="4" ns0:space="0" ns0:color="auto"/>
+              <ns0:left ns0:val="single" ns0:sz="4" ns0:space="0" ns0:color="auto"/>
+              <ns0:bottom ns0:val="single" ns0:sz="4" ns0:space="0" ns0:color="auto"/>
+              <ns0:right ns0:val="single" ns0:sz="4" ns0:space="0" ns0:color="auto"/>
+            </ns0:tcBorders>
+            <ns0:hideMark/>
+          </ns0:tcPr>
+          <ns0:p ns2:paraId="33A73869" ns2:textId="77777777" ns0:rsidR="003B0023" ns0:rsidRPr="003B0023" ns0:rsidRDefault="003B0023" ns0:rsidP="003B0023">
+            <ns0:pPr>
+              <ns0:keepNext/>
+              <ns0:keepLines/>
+              <ns0:suppressLineNumbers/>
+              <ns0:shd ns0:val="clear" ns0:color="auto" ns0:fill="FFFFFF"/>
+              <ns0:suppressAutoHyphens/>
+              <ns0:spacing ns0:after="0" ns0:line="256" ns0:lineRule="auto"/>
+              <ns0:rPr>
+                <ns0:rFonts ns0:ascii="Times New Roman" ns0:eastAsia="Times New Roman" ns0:hAnsi="Times New Roman"/>
+                <ns0:color ns0:val="000000"/>
+                <ns0:sz ns0:val="20"/>
+                <ns0:szCs ns0:val="20"/>
+                <ns0:lang ns0:eastAsia="pt-BR"/>
+              </ns0:rPr>
+            </ns0:pPr>
+            <ns0:r ns0:rsidRPr="003B0023">
+              <ns0:rPr>
+                <ns0:rFonts ns0:ascii="Times New Roman" ns0:hAnsi="Times New Roman"/>
+                <ns0:b/>
+                <ns0:sz ns0:val="20"/>
+                <ns0:szCs ns0:val="20"/>
+              </ns0:rPr>
+              <ns0:t>RESPONSÁVEL PELA ÁREA:</ns0:t>
+            </ns0:r>
+            <ns0:r ns0:rsidR="00967D7E">
+              <ns0:rPr>
+                <ns0:rFonts ns0:ascii="Times New Roman" ns0:hAnsi="Times New Roman"/>
+                <ns0:b/>
+                <ns0:sz ns0:val="20"/>
+                <ns0:szCs ns0:val="20"/>
+              </ns0:rPr>
+              <ns0:t xml:space="preserve"> </ns0:t>
+            </ns0:r>
+            <ns0:r ns0:rsidR="00967D7E" ns0:rsidRPr="00967D7E">
+              <ns0:rPr>
+                <ns0:rFonts ns0:ascii="Times New Roman" ns0:hAnsi="Times New Roman"/>
+                <ns0:b/>
+                <ns0:sz ns0:val="20"/>
+                <ns0:szCs ns0:val="20"/>
+              </ns0:rPr>
+              <ns0:t>[RESPONSÁVEL PELA ÁREA]</ns0:t>
+            </ns0:r>
+          </ns0:p>
+        </ns0:tc>
+      </ns0:tr>
+      <ns0:tr ns0:rsidR="003B0023" ns2:paraId="2A26EDF6" ns2:textId="77777777" ns0:rsidTr="007F5E4E">
+        <ns0:trPr>
+          <ns0:trHeight ns0:val="411"/>
+          <ns0:jc ns0:val="center"/>
+        </ns0:trPr>
+        <ns0:tc>
+          <ns0:tcPr>
+            <ns0:tcW ns0:w="9348" ns0:type="dxa"/>
+            <ns0:gridSpan ns0:val="7"/>
+            <ns0:tcBorders>
+              <ns0:top ns0:val="single" ns0:sz="4" ns0:space="0" ns0:color="auto"/>
+              <ns0:left ns0:val="single" ns0:sz="4" ns0:space="0" ns0:color="auto"/>
+              <ns0:bottom ns0:val="single" ns0:sz="4" ns0:space="0" ns0:color="auto"/>
+              <ns0:right ns0:val="single" ns0:sz="4" ns0:space="0" ns0:color="auto"/>
+            </ns0:tcBorders>
+            <ns0:shd ns0:val="clear" ns0:color="auto" ns0:fill="002060"/>
+            <ns0:vAlign ns0:val="center"/>
+            <ns0:hideMark/>
+          </ns0:tcPr>
+          <ns0:p ns2:paraId="7B41E624" ns2:textId="77777777" ns0:rsidR="003B0023" ns0:rsidRDefault="003B0023" ns0:rsidP="003B0023">
+            <ns0:pPr>
+              <ns0:keepNext/>
+              <ns0:keepLines/>
+              <ns0:suppressLineNumbers/>
+              <ns0:suppressAutoHyphens/>
+              <ns0:spacing ns0:after="0" ns0:line="256" ns0:lineRule="auto"/>
+              <ns0:jc ns0:val="center"/>
+              <ns0:rPr>
+                <ns0:rFonts ns0:ascii="Times New Roman" ns0:hAnsi="Times New Roman"/>
+                <ns0:b/>
+                <ns0:color ns0:val="FFFFFF"/>
+                <ns0:sz ns0:val="20"/>
+                <ns0:szCs ns0:val="20"/>
+              </ns0:rPr>
+            </ns0:pPr>
+            <ns0:r>
+              <ns0:rPr>
+                <ns0:rFonts ns0:ascii="Times New Roman" ns0:hAnsi="Times New Roman"/>
+                <ns0:b/>
+                <ns0:color ns0:val="FFFFFF"/>
+                <ns0:sz ns0:val="20"/>
+                <ns0:szCs ns0:val="20"/>
+              </ns0:rPr>
+              <ns0:t>TIPO DE OCORRÊNCIA</ns0:t>
+            </ns0:r>
+          </ns0:p>
+        </ns0:tc>
+      </ns0:tr>
+      <ns0:tr ns0:rsidR="003B0023" ns0:rsidRPr="003B0023" ns2:paraId="0CA7804F" ns2:textId="77777777" ns0:rsidTr="00F67F0E">
+        <ns0:trPr>
+          <ns0:trHeight ns0:val="425"/>
+          <ns0:jc ns0:val="center"/>
+        </ns0:trPr>
+        <ns0:tc>
+          <ns0:tcPr>
+            <ns0:tcW ns0:w="2337" ns0:type="dxa"/>
+            <ns0:tcBorders>
+              <ns0:top ns0:val="single" ns0:sz="4" ns0:space="0" ns0:color="auto"/>
+              <ns0:left ns0:val="single" ns0:sz="4" ns0:space="0" ns0:color="auto"/>
+              <ns0:bottom ns0:val="single" ns0:sz="4" ns0:space="0" ns0:color="auto"/>
+              <ns0:right ns0:val="single" ns0:sz="4" ns0:space="0" ns0:color="auto"/>
+            </ns0:tcBorders>
+            <ns0:vAlign ns0:val="center"/>
+          </ns0:tcPr>
+          <ns0:p ns2:paraId="3283CC03" ns2:textId="566A858A" ns0:rsidR="003B0023" ns0:rsidRPr="003B0023" ns0:rsidRDefault="00224B87" ns0:rsidP="001135B9">
+            <ns0:pPr>
+              <ns0:keepNext/>
+              <ns0:keepLines/>
+              <ns0:suppressLineNumbers/>
+              <ns0:suppressAutoHyphens/>
+              <ns0:spacing ns0:after="0" ns0:line="256" ns0:lineRule="auto"/>
+              <ns0:rPr>
+                <ns0:rFonts ns0:ascii="Times New Roman" ns0:hAnsi="Times New Roman"/>
+                <ns0:b/>
+                <ns0:sz ns0:val="20"/>
+                <ns0:szCs ns0:val="20"/>
+              </ns0:rPr>
+            </ns0:pPr>
+            <ns0:r>
+              <ns0:rPr>
+                <ns0:rFonts ns0:ascii="Times New Roman" ns0:hAnsi="Times New Roman"/>
+                <ns0:b/>
+                <ns0:noProof/>
+                <ns0:sz ns0:val="20"/>
+                <ns0:szCs ns0:val="20"/>
+              </ns0:rPr>
+              <ns1:AlternateContent>
+                <ns1:Choice Requires="wps">
+                  <ns0:drawing>
+                    <ns3:anchor distT="0" distB="0" distL="114300" distR="114300" simplePos="0" relativeHeight="251656192" behindDoc="0" locked="0" layoutInCell="1" allowOverlap="1" ns4:anchorId="76BF7F04" ns4:editId="09AD3F85">
+                      <ns3:simplePos x="0" y="0"/>
+                      <ns3:positionH relativeFrom="column">
+                        <ns3:posOffset>1148715</ns3:posOffset>
+                      </ns3:positionH>
+                      <ns3:positionV relativeFrom="paragraph">
+                        <ns3:posOffset>19050</ns3:posOffset>
+                      </ns3:positionV>
+                      <ns3:extent cx="195580" cy="140335"/>
+                      <ns3:effectExtent l="8255" t="8255" r="5715" b="13335"/>
+                      <ns3:wrapNone/>
+                      <ns3:docPr id="1557458591" name="AutoShape 18"/>
+                      <ns3:cNvGraphicFramePr>
+                        <ns5:graphicFrameLocks/>
+                      </ns3:cNvGraphicFramePr>
+                      <ns5:graphic>
+                        <ns5:graphicData uri="http://schemas.microsoft.com/office/word/2010/wordprocessingShape">
+                          <ns6:wsp>
+                            <ns6:cNvSpPr>
+                              <ns5:spLocks noChangeArrowheads="1"/>
+                            </ns6:cNvSpPr>
+                            <ns6:spPr bwMode="auto">
+                              <ns5:xfrm>
+                                <ns5:off x="0" y="0"/>
+                                <ns5:ext cx="195580" cy="140335"/>
+                              </ns5:xfrm>
+                              <ns5:prstGeom prst="roundRect">
+                                <ns5:avLst>
+                                  <ns5:gd name="adj" fmla="val 16667"/>
+                                </ns5:avLst>
+                              </ns5:prstGeom>
+                              <ns5:noFill/>
+                              <ns5:ln w="9525">
+                                <ns5:solidFill>
+                                  <ns5:srgbClr val="196B24"/>
+                                </ns5:solidFill>
+                                <ns5:round/>
+                                <ns5:headEnd/>
+                                <ns5:tailEnd/>
+                              </ns5:ln>
+                              <ns5:effectLst/>
+                              <ns5:extLst>
+                                <ns5:ext uri="{909E8E84-426E-40DD-AFC4-6F175D3DCCD1}">
+                                  <ns7:hiddenFill>
+                                    <ns5:solidFill>
+                                      <ns5:srgbClr val="FFFFFF"/>
+                                    </ns5:solidFill>
+                                  </ns7:hiddenFill>
+                                </ns5:ext>
+                                <ns5:ext uri="{AF507438-7753-43E0-B8FC-AC1667EBCBE1}">
+                                  <ns7:hiddenEffects>
+                                    <ns5:effectLst>
+                                      <ns5:outerShdw dist="35921" dir="2700000" algn="ctr" rotWithShape="0">
+                                        <ns5:srgbClr val="868686"/>
+                                      </ns5:outerShdw>
+                                    </ns5:effectLst>
+                                  </ns7:hiddenEffects>
+                                </ns5:ext>
+                              </ns5:extLst>
+                            </ns6:spPr>
+                            <ns6:bodyPr rot="0" vert="horz" wrap="square" lIns="91440" tIns="45720" rIns="91440" bIns="45720" anchor="t" anchorCtr="0" upright="1">
+                              <ns5:noAutofit/>
+                            </ns6:bodyPr>
+                          </ns6:wsp>
+                        </ns5:graphicData>
+                      </ns5:graphic>
+                      <ns4:sizeRelH relativeFrom="page">
+                        <ns4:pctWidth>0</ns4:pctWidth>
+                      </ns4:sizeRelH>
+                      <ns4:sizeRelV relativeFrom="page">
+                        <ns4:pctHeight>0</ns4:pctHeight>
+                      </ns4:sizeRelV>
+                    </ns3:anchor>
+                  </ns0:drawing>
+                </ns1:Choice>
+                <ns1:Fallback>
+                  <ns0:pict>
+                    <ns8:roundrect ns2:anchorId="2EBDF774" id="AutoShape 18" ns9:spid="_x0000_s1026" style="position:absolute;margin-left:90.45pt;margin-top:1.5pt;width:15.4pt;height:11.05pt;z-index:251656192;visibility:visible;mso-wrap-style:square;mso-width-percent:0;mso-height-percent:0;mso-wrap-distance-left:9pt;mso-wrap-distance-top:0;mso-wrap-distance-right:9pt;mso-wrap-distance-bottom:0;mso-position-horizontal:absolute;mso-position-horizontal-relative:text;mso-position-vertical:absolute;mso-position-vertical-relative:text;mso-width-percent:0;mso-height-percent:0;mso-width-relative:page;mso-height-relative:page;v-text-anchor:top" arcsize="10923f" ns9:gfxdata="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" filled="f" strokecolor="#196b24">
+                      <ns8:shadow color="#868686"/>
+                    </ns8:roundrect>
+                  </ns0:pict>
+                </ns1:Fallback>
+              </ns1:AlternateContent>
+            </ns0:r>
+            <ns0:r ns0:rsidR="003B0023">
+              <ns0:rPr>
+                <ns0:rFonts ns0:ascii="Times New Roman" ns0:hAnsi="Times New Roman"/>
+                <ns0:b/>
+                <ns0:sz ns0:val="20"/>
+                <ns0:szCs ns0:val="20"/>
+              </ns0:rPr>
+              <ns0:t>MEIO AMBIENTE</ns0:t>
+            </ns0:r>
+            <ns0:r ns0:rsidR="0013288F">
+              <ns0:rPr>
+                <ns0:rFonts ns0:ascii="Times New Roman" ns0:hAnsi="Times New Roman"/>
+                <ns0:b/>
+                <ns0:sz ns0:val="20"/>
+                <ns0:szCs ns0:val="20"/>
+              </ns0:rPr>
+              <ns0:t>:</ns0:t>
+            </ns0:r>
+          </ns0:p>
+        </ns0:tc>
+        <ns0:tc>
+          <ns0:tcPr>
+            <ns0:tcW ns0:w="3100" ns0:type="dxa"/>
+            <ns0:gridSpan ns0:val="2"/>
+            <ns0:tcBorders>
+              <ns0:top ns0:val="single" ns0:sz="4" ns0:space="0" ns0:color="auto"/>
+              <ns0:left ns0:val="single" ns0:sz="4" ns0:space="0" ns0:color="auto"/>
+              <ns0:bottom ns0:val="single" ns0:sz="4" ns0:space="0" ns0:color="auto"/>
+              <ns0:right ns0:val="single" ns0:sz="4" ns0:space="0" ns0:color="auto"/>
+            </ns0:tcBorders>
+            <ns0:vAlign ns0:val="center"/>
+          </ns0:tcPr>
+          <ns0:p ns2:paraId="05365A2C" ns2:textId="66C6E180" ns0:rsidR="003B0023" ns0:rsidRPr="003B0023" ns0:rsidRDefault="00224B87" ns0:rsidP="001135B9">
+            <ns0:pPr>
+              <ns0:keepNext/>
+              <ns0:keepLines/>
+              <ns0:suppressLineNumbers/>
+              <ns0:suppressAutoHyphens/>
+              <ns0:spacing ns0:after="0" ns0:line="256" ns0:lineRule="auto"/>
+              <ns0:rPr>
+                <ns0:rFonts ns0:ascii="Times New Roman" ns0:hAnsi="Times New Roman"/>
+                <ns0:b/>
+                <ns0:sz ns0:val="20"/>
+                <ns0:szCs ns0:val="20"/>
+              </ns0:rPr>
+            </ns0:pPr>
+            <ns0:r>
+              <ns0:rPr>
+                <ns0:rFonts ns0:ascii="Times New Roman" ns0:hAnsi="Times New Roman"/>
+                <ns0:b/>
+                <ns0:noProof/>
+                <ns0:sz ns0:val="20"/>
+                <ns0:szCs ns0:val="20"/>
+              </ns0:rPr>
+              <ns1:AlternateContent>
+                <ns1:Choice Requires="wps">
+                  <ns0:drawing>
+                    <ns3:anchor distT="0" distB="0" distL="114300" distR="114300" simplePos="0" relativeHeight="251657216" behindDoc="0" locked="0" layoutInCell="1" allowOverlap="1" ns4:anchorId="2B78AE7F" ns4:editId="71DA8255">
+                      <ns3:simplePos x="0" y="0"/>
+                      <ns3:positionH relativeFrom="column">
+                        <ns3:posOffset>1858645</ns3:posOffset>
+                      </ns3:positionH>
+                      <ns3:positionV relativeFrom="paragraph">
+                        <ns3:posOffset>15240</ns3:posOffset>
+                      </ns3:positionV>
+                      <ns3:extent cx="195580" cy="140335"/>
+                      <ns3:effectExtent l="10795" t="13970" r="12700" b="7620"/>
+                      <ns3:wrapNone/>
+                      <ns3:docPr id="801053956" name="AutoShape 19"/>
+                      <ns3:cNvGraphicFramePr>
+                        <ns5:graphicFrameLocks/>
+                      </ns3:cNvGraphicFramePr>
+                      <ns5:graphic>
+                        <ns5:graphicData uri="http://schemas.microsoft.com/office/word/2010/wordprocessingShape">
+                          <ns6:wsp>
+                            <ns6:cNvSpPr>
+                              <ns5:spLocks noChangeArrowheads="1"/>
+                            </ns6:cNvSpPr>
+                            <ns6:spPr bwMode="auto">
+                              <ns5:xfrm>
+                                <ns5:off x="0" y="0"/>
+                                <ns5:ext cx="195580" cy="140335"/>
+                              </ns5:xfrm>
+                              <ns5:prstGeom prst="roundRect">
+                                <ns5:avLst>
+                                  <ns5:gd name="adj" fmla="val 16667"/>
+                                </ns5:avLst>
+                              </ns5:prstGeom>
+                              <ns5:noFill/>
+                              <ns5:ln w="9525">
+                                <ns5:solidFill>
+                                  <ns5:srgbClr val="196B24"/>
+                                </ns5:solidFill>
+                                <ns5:round/>
+                                <ns5:headEnd/>
+                                <ns5:tailEnd/>
+                              </ns5:ln>
+                              <ns5:effectLst/>
+                              <ns5:extLst>
+                                <ns5:ext uri="{909E8E84-426E-40DD-AFC4-6F175D3DCCD1}">
+                                  <ns7:hiddenFill>
+                                    <ns5:solidFill>
+                                      <ns5:srgbClr val="FFFFFF"/>
+                                    </ns5:solidFill>
+                                  </ns7:hiddenFill>
+                                </ns5:ext>
+                                <ns5:ext uri="{AF507438-7753-43E0-B8FC-AC1667EBCBE1}">
+                                  <ns7:hiddenEffects>
+                                    <ns5:effectLst>
+                                      <ns5:outerShdw dist="35921" dir="2700000" algn="ctr" rotWithShape="0">
+                                        <ns5:srgbClr val="868686"/>
+                                      </ns5:outerShdw>
+                                    </ns5:effectLst>
+                                  </ns7:hiddenEffects>
+                                </ns5:ext>
+                              </ns5:extLst>
+                            </ns6:spPr>
+                            <ns6:bodyPr rot="0" vert="horz" wrap="square" lIns="91440" tIns="45720" rIns="91440" bIns="45720" anchor="t" anchorCtr="0" upright="1">
+                              <ns5:noAutofit/>
+                            </ns6:bodyPr>
+                          </ns6:wsp>
+                        </ns5:graphicData>
+                      </ns5:graphic>
+                      <ns4:sizeRelH relativeFrom="page">
+                        <ns4:pctWidth>0</ns4:pctWidth>
+                      </ns4:sizeRelH>
+                      <ns4:sizeRelV relativeFrom="page">
+                        <ns4:pctHeight>0</ns4:pctHeight>
+                      </ns4:sizeRelV>
+                    </ns3:anchor>
+                  </ns0:drawing>
+                </ns1:Choice>
+                <ns1:Fallback>
+                  <ns0:pict>
+                    <ns8:roundrect ns2:anchorId="33B94A96" id="AutoShape 19" ns9:spid="_x0000_s1026" style="position:absolute;margin-left:146.35pt;margin-top:1.2pt;width:15.4pt;height:11.05pt;z-index:251657216;visibility:visible;mso-wrap-style:square;mso-width-percent:0;mso-height-percent:0;mso-wrap-distance-left:9pt;mso-wrap-distance-top:0;mso-wrap-distance-right:9pt;mso-wrap-distance-bottom:0;mso-position-horizontal:absolute;mso-position-horizontal-relative:text;mso-position-vertical:absolute;mso-position-vertical-relative:text;mso-width-percent:0;mso-height-percent:0;mso-width-relative:page;mso-height-relative:page;v-text-anchor:top" arcsize="10923f" ns9:gfxdata="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" filled="f" strokecolor="#196b24">
+                      <ns8:shadow color="#868686"/>
+                    </ns8:roundrect>
+                  </ns0:pict>
+                </ns1:Fallback>
+              </ns1:AlternateContent>
+            </ns0:r>
+            <ns0:r ns0:rsidR="003B0023">
+              <ns0:rPr>
+                <ns0:rFonts ns0:ascii="Times New Roman" ns0:hAnsi="Times New Roman"/>
+                <ns0:b/>
+                <ns0:sz ns0:val="20"/>
+                <ns0:szCs ns0:val="20"/>
+              </ns0:rPr>
+              <ns0:t>SEGURANÇA DO TRABALHO</ns0:t>
+            </ns0:r>
+            <ns0:r ns0:rsidR="0013288F">
+              <ns0:rPr>
+                <ns0:rFonts ns0:ascii="Times New Roman" ns0:hAnsi="Times New Roman"/>
+                <ns0:b/>
+                <ns0:sz ns0:val="20"/>
+                <ns0:szCs ns0:val="20"/>
+              </ns0:rPr>
+              <ns0:t>:</ns0:t>
+            </ns0:r>
+          </ns0:p>
+        </ns0:tc>
+        <ns0:tc>
+          <ns0:tcPr>
+            <ns0:tcW ns0:w="2022" ns0:type="dxa"/>
+            <ns0:gridSpan ns0:val="3"/>
+            <ns0:tcBorders>
+              <ns0:top ns0:val="single" ns0:sz="4" ns0:space="0" ns0:color="auto"/>
+              <ns0:left ns0:val="single" ns0:sz="4" ns0:space="0" ns0:color="auto"/>
+              <ns0:bottom ns0:val="single" ns0:sz="4" ns0:space="0" ns0:color="auto"/>
+              <ns0:right ns0:val="single" ns0:sz="4" ns0:space="0" ns0:color="auto"/>
+            </ns0:tcBorders>
+            <ns0:vAlign ns0:val="center"/>
+          </ns0:tcPr>
+          <ns0:p ns2:paraId="112DFD9D" ns2:textId="273B4A5E" ns0:rsidR="003B0023" ns0:rsidRPr="003B0023" ns0:rsidRDefault="00224B87" ns0:rsidP="001135B9">
+            <ns0:pPr>
+              <ns0:keepNext/>
+              <ns0:keepLines/>
+              <ns0:suppressLineNumbers/>
+              <ns0:suppressAutoHyphens/>
+              <ns0:spacing ns0:after="0" ns0:line="256" ns0:lineRule="auto"/>
+              <ns0:rPr>
+                <ns0:rFonts ns0:ascii="Times New Roman" ns0:hAnsi="Times New Roman"/>
+                <ns0:b/>
+                <ns0:sz ns0:val="20"/>
+                <ns0:szCs ns0:val="20"/>
+              </ns0:rPr>
+            </ns0:pPr>
+            <ns0:r>
+              <ns0:rPr>
+                <ns0:rFonts ns0:ascii="Times New Roman" ns0:hAnsi="Times New Roman"/>
+                <ns0:b/>
+                <ns0:noProof/>
+                <ns0:sz ns0:val="20"/>
+                <ns0:szCs ns0:val="20"/>
+              </ns0:rPr>
+              <ns1:AlternateContent>
+                <ns1:Choice Requires="wps">
+                  <ns0:drawing>
+                    <ns3:anchor distT="0" distB="0" distL="114300" distR="114300" simplePos="0" relativeHeight="251658240" behindDoc="0" locked="0" layoutInCell="1" allowOverlap="1" ns4:anchorId="4FCB034B" ns4:editId="4842015E">
+                      <ns3:simplePos x="0" y="0"/>
+                      <ns3:positionH relativeFrom="column">
+                        <ns3:posOffset>964565</ns3:posOffset>
+                      </ns3:positionH>
+                      <ns3:positionV relativeFrom="paragraph">
+                        <ns3:posOffset>15240</ns3:posOffset>
+                      </ns3:positionV>
+                      <ns3:extent cx="195580" cy="140335"/>
+                      <ns3:effectExtent l="10160" t="13970" r="13335" b="7620"/>
+                      <ns3:wrapNone/>
+                      <ns3:docPr id="1760387860" name="AutoShape 20"/>
+                      <ns3:cNvGraphicFramePr>
+                        <ns5:graphicFrameLocks/>
+                      </ns3:cNvGraphicFramePr>
+                      <ns5:graphic>
+                        <ns5:graphicData uri="http://schemas.microsoft.com/office/word/2010/wordprocessingShape">
+                          <ns6:wsp>
+                            <ns6:cNvSpPr>
+                              <ns5:spLocks noChangeArrowheads="1"/>
+                            </ns6:cNvSpPr>
+                            <ns6:spPr bwMode="auto">
+                              <ns5:xfrm>
+                                <ns5:off x="0" y="0"/>
+                                <ns5:ext cx="195580" cy="140335"/>
+                              </ns5:xfrm>
+                              <ns5:prstGeom prst="roundRect">
+                                <ns5:avLst>
+                                  <ns5:gd name="adj" fmla="val 16667"/>
+                                </ns5:avLst>
+                              </ns5:prstGeom>
+                              <ns5:noFill/>
+                              <ns5:ln w="9525">
+                                <ns5:solidFill>
+                                  <ns5:srgbClr val="196B24"/>
+                                </ns5:solidFill>
+                                <ns5:round/>
+                                <ns5:headEnd/>
+                                <ns5:tailEnd/>
+                              </ns5:ln>
+                              <ns5:effectLst/>
+                              <ns5:extLst>
+                                <ns5:ext uri="{909E8E84-426E-40DD-AFC4-6F175D3DCCD1}">
+                                  <ns7:hiddenFill>
+                                    <ns5:solidFill>
+                                      <ns5:srgbClr val="FFFFFF"/>
+                                    </ns5:solidFill>
+                                  </ns7:hiddenFill>
+                                </ns5:ext>
+                                <ns5:ext uri="{AF507438-7753-43E0-B8FC-AC1667EBCBE1}">
+                                  <ns7:hiddenEffects>
+                                    <ns5:effectLst>
+                                      <ns5:outerShdw dist="35921" dir="2700000" algn="ctr" rotWithShape="0">
+                                        <ns5:srgbClr val="868686"/>
+                                      </ns5:outerShdw>
+                                    </ns5:effectLst>
+                                  </ns7:hiddenEffects>
+                                </ns5:ext>
+                              </ns5:extLst>
+                            </ns6:spPr>
+                            <ns6:bodyPr rot="0" vert="horz" wrap="square" lIns="91440" tIns="45720" rIns="91440" bIns="45720" anchor="t" anchorCtr="0" upright="1">
+                              <ns5:noAutofit/>
+                            </ns6:bodyPr>
+                          </ns6:wsp>
+                        </ns5:graphicData>
+                      </ns5:graphic>
+                      <ns4:sizeRelH relativeFrom="page">
+                        <ns4:pctWidth>0</ns4:pctWidth>
+                      </ns4:sizeRelH>
+                      <ns4:sizeRelV relativeFrom="page">
+                        <ns4:pctHeight>0</ns4:pctHeight>
+                      </ns4:sizeRelV>
+                    </ns3:anchor>
+                  </ns0:drawing>
+                </ns1:Choice>
+                <ns1:Fallback>
+                  <ns0:pict>
+                    <ns8:roundrect ns2:anchorId="22AEBB71" id="AutoShape 20" ns9:spid="_x0000_s1026" style="position:absolute;margin-left:75.95pt;margin-top:1.2pt;width:15.4pt;height:11.05pt;z-index:251658240;visibility:visible;mso-wrap-style:square;mso-width-percent:0;mso-height-percent:0;mso-wrap-distance-left:9pt;mso-wrap-distance-top:0;mso-wrap-distance-right:9pt;mso-wrap-distance-bottom:0;mso-position-horizontal:absolute;mso-position-horizontal-relative:text;mso-position-vertical:absolute;mso-position-vertical-relative:text;mso-width-percent:0;mso-height-percent:0;mso-width-relative:page;mso-height-relative:page;v-text-anchor:top" arcsize="10923f" ns9:gfxdata="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" filled="f" strokecolor="#196b24">
+                      <ns8:shadow color="#868686"/>
+                    </ns8:roundrect>
+                  </ns0:pict>
+                </ns1:Fallback>
+              </ns1:AlternateContent>
+            </ns0:r>
+            <ns0:r ns0:rsidR="003B0023">
+              <ns0:rPr>
+                <ns0:rFonts ns0:ascii="Times New Roman" ns0:hAnsi="Times New Roman"/>
+                <ns0:b/>
+                <ns0:sz ns0:val="20"/>
+                <ns0:szCs ns0:val="20"/>
+              </ns0:rPr>
+              <ns0:t>ENGENHARIA</ns0:t>
+            </ns0:r>
+            <ns0:r ns0:rsidR="0013288F">
+              <ns0:rPr>
+                <ns0:rFonts ns0:ascii="Times New Roman" ns0:hAnsi="Times New Roman"/>
+                <ns0:b/>
+                <ns0:sz ns0:val="20"/>
+                <ns0:szCs ns0:val="20"/>
+              </ns0:rPr>
+              <ns0:t>:</ns0:t>
+            </ns0:r>
+          </ns0:p>
+        </ns0:tc>
+        <ns0:tc>
+          <ns0:tcPr>
+            <ns0:tcW ns0:w="1889" ns0:type="dxa"/>
+            <ns0:tcBorders>
+              <ns0:top ns0:val="single" ns0:sz="4" ns0:space="0" ns0:color="auto"/>
+              <ns0:left ns0:val="single" ns0:sz="4" ns0:space="0" ns0:color="auto"/>
+              <ns0:bottom ns0:val="single" ns0:sz="4" ns0:space="0" ns0:color="auto"/>
+              <ns0:right ns0:val="single" ns0:sz="4" ns0:space="0" ns0:color="auto"/>
+            </ns0:tcBorders>
+            <ns0:vAlign ns0:val="center"/>
+          </ns0:tcPr>
+          <ns0:p ns2:paraId="2C672948" ns2:textId="52FED1F8" ns0:rsidR="003B0023" ns0:rsidRPr="003B0023" ns0:rsidRDefault="00224B87" ns0:rsidP="001135B9">
+            <ns0:pPr>
+              <ns0:keepNext/>
+              <ns0:keepLines/>
+              <ns0:suppressLineNumbers/>
+              <ns0:suppressAutoHyphens/>
+              <ns0:spacing ns0:after="0" ns0:line="256" ns0:lineRule="auto"/>
+              <ns0:rPr>
+                <ns0:rFonts ns0:ascii="Times New Roman" ns0:hAnsi="Times New Roman"/>
+                <ns0:b/>
+                <ns0:sz ns0:val="20"/>
+                <ns0:szCs ns0:val="20"/>
+              </ns0:rPr>
+            </ns0:pPr>
+            <ns0:r>
+              <ns0:rPr>
+                <ns0:rFonts ns0:ascii="Times New Roman" ns0:hAnsi="Times New Roman"/>
+                <ns0:b/>
+                <ns0:noProof/>
+                <ns0:sz ns0:val="20"/>
+                <ns0:szCs ns0:val="20"/>
+              </ns0:rPr>
+              <ns1:AlternateContent>
+                <ns1:Choice Requires="wps">
+                  <ns0:drawing>
+                    <ns3:anchor distT="0" distB="0" distL="114300" distR="114300" simplePos="0" relativeHeight="251659264" behindDoc="0" locked="0" layoutInCell="1" allowOverlap="1" ns4:anchorId="3A4A4730" ns4:editId="1DD36CBA">
+                      <ns3:simplePos x="0" y="0"/>
+                      <ns3:positionH relativeFrom="column">
+                        <ns3:posOffset>567690</ns3:posOffset>
+                      </ns3:positionH>
+                      <ns3:positionV relativeFrom="paragraph">
+                        <ns3:posOffset>24765</ns3:posOffset>
+                      </ns3:positionV>
+                      <ns3:extent cx="195580" cy="140335"/>
+                      <ns3:effectExtent l="5715" t="13970" r="8255" b="7620"/>
+                      <ns3:wrapNone/>
+                      <ns3:docPr id="476071933" name="AutoShape 21"/>
+                      <ns3:cNvGraphicFramePr>
+                        <ns5:graphicFrameLocks/>
+                      </ns3:cNvGraphicFramePr>
+                      <ns5:graphic>
+                        <ns5:graphicData uri="http://schemas.microsoft.com/office/word/2010/wordprocessingShape">
+                          <ns6:wsp>
+                            <ns6:cNvSpPr>
+                              <ns5:spLocks noChangeArrowheads="1"/>
+                            </ns6:cNvSpPr>
+                            <ns6:spPr bwMode="auto">
+                              <ns5:xfrm>
+                                <ns5:off x="0" y="0"/>
+                                <ns5:ext cx="195580" cy="140335"/>
+                              </ns5:xfrm>
+                              <ns5:prstGeom prst="roundRect">
+                                <ns5:avLst>
+                                  <ns5:gd name="adj" fmla="val 16667"/>
+                                </ns5:avLst>
+                              </ns5:prstGeom>
+                              <ns5:noFill/>
+                              <ns5:ln w="9525">
+                                <ns5:solidFill>
+                                  <ns5:srgbClr val="196B24"/>
+                                </ns5:solidFill>
+                                <ns5:round/>
+                                <ns5:headEnd/>
+                                <ns5:tailEnd/>
+                              </ns5:ln>
+                              <ns5:effectLst/>
+                              <ns5:extLst>
+                                <ns5:ext uri="{909E8E84-426E-40DD-AFC4-6F175D3DCCD1}">
+                                  <ns7:hiddenFill>
+                                    <ns5:solidFill>
+                                      <ns5:srgbClr val="FFFFFF"/>
+                                    </ns5:solidFill>
+                                  </ns7:hiddenFill>
+                                </ns5:ext>
+                                <ns5:ext uri="{AF507438-7753-43E0-B8FC-AC1667EBCBE1}">
+                                  <ns7:hiddenEffects>
+                                    <ns5:effectLst>
+                                      <ns5:outerShdw dist="35921" dir="2700000" algn="ctr" rotWithShape="0">
+                                        <ns5:srgbClr val="868686"/>
+                                      </ns5:outerShdw>
+                                    </ns5:effectLst>
+                                  </ns7:hiddenEffects>
+                                </ns5:ext>
+                              </ns5:extLst>
+                            </ns6:spPr>
+                            <ns6:bodyPr rot="0" vert="horz" wrap="square" lIns="91440" tIns="45720" rIns="91440" bIns="45720" anchor="t" anchorCtr="0" upright="1">
+                              <ns5:noAutofit/>
+                            </ns6:bodyPr>
+                          </ns6:wsp>
+                        </ns5:graphicData>
+                      </ns5:graphic>
+                      <ns4:sizeRelH relativeFrom="page">
+                        <ns4:pctWidth>0</ns4:pctWidth>
+                      </ns4:sizeRelH>
+                      <ns4:sizeRelV relativeFrom="page">
+                        <ns4:pctHeight>0</ns4:pctHeight>
+                      </ns4:sizeRelV>
+                    </ns3:anchor>
+                  </ns0:drawing>
+                </ns1:Choice>
+                <ns1:Fallback>
+                  <ns0:pict>
+                    <ns8:roundrect ns2:anchorId="0C1EC122" id="AutoShape 21" ns9:spid="_x0000_s1026" style="position:absolute;margin-left:44.7pt;margin-top:1.95pt;width:15.4pt;height:11.05pt;z-index:251659264;visibility:visible;mso-wrap-style:square;mso-width-percent:0;mso-height-percent:0;mso-wrap-distance-left:9pt;mso-wrap-distance-top:0;mso-wrap-distance-right:9pt;mso-wrap-distance-bottom:0;mso-position-horizontal:absolute;mso-position-horizontal-relative:text;mso-position-vertical:absolute;mso-position-vertical-relative:text;mso-width-percent:0;mso-height-percent:0;mso-width-relative:page;mso-height-relative:page;v-text-anchor:top" arcsize="10923f" ns9:gfxdata="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" filled="f" strokecolor="#196b24">
+                      <ns8:shadow color="#868686"/>
+                    </ns8:roundrect>
+                  </ns0:pict>
+                </ns1:Fallback>
+              </ns1:AlternateContent>
+            </ns0:r>
+            <ns0:r ns0:rsidR="003B0023">
+              <ns0:rPr>
+                <ns0:rFonts ns0:ascii="Times New Roman" ns0:hAnsi="Times New Roman"/>
+                <ns0:b/>
+                <ns0:sz ns0:val="20"/>
+                <ns0:szCs ns0:val="20"/>
+              </ns0:rPr>
+              <ns0:t>SOCIAL</ns0:t>
+            </ns0:r>
+            <ns0:r ns0:rsidR="0013288F">
+              <ns0:rPr>
+                <ns0:rFonts ns0:ascii="Times New Roman" ns0:hAnsi="Times New Roman"/>
+                <ns0:b/>
+                <ns0:sz ns0:val="20"/>
+                <ns0:szCs ns0:val="20"/>
+              </ns0:rPr>
+              <ns0:t>:</ns0:t>
+            </ns0:r>
+          </ns0:p>
+        </ns0:tc>
+      </ns0:tr>
+      <ns0:tr ns0:rsidR="001135B9" ns0:rsidRPr="003B0023" ns2:paraId="2EDC64C6" ns2:textId="77777777" ns0:rsidTr="001135B9">
+        <ns0:trPr>
+          <ns0:cantSplit/>
+          <ns0:trHeight ns0:val="1977"/>
+          <ns0:jc ns0:val="center"/>
+        </ns0:trPr>
+        <ns0:tc>
+          <ns0:tcPr>
+            <ns0:tcW ns0:w="9348" ns0:type="dxa"/>
+            <ns0:gridSpan ns0:val="7"/>
+            <ns0:tcBorders>
+              <ns0:top ns0:val="single" ns0:sz="4" ns0:space="0" ns0:color="auto"/>
+              <ns0:left ns0:val="single" ns0:sz="4" ns0:space="0" ns0:color="auto"/>
+              <ns0:bottom ns0:val="single" ns0:sz="4" ns0:space="0" ns0:color="auto"/>
+              <ns0:right ns0:val="single" ns0:sz="4" ns0:space="0" ns0:color="auto"/>
+            </ns0:tcBorders>
+            <ns0:hideMark/>
+          </ns0:tcPr>
+          <ns0:p ns2:paraId="10F1FF50" ns2:textId="77777777" ns0:rsidR="001135B9" ns0:rsidRPr="003B0023" ns0:rsidRDefault="001135B9" ns0:rsidP="0013288F">
+            <ns0:pPr>
+              <ns0:keepNext/>
+              <ns0:keepLines/>
+              <ns0:suppressLineNumbers/>
+              <ns0:suppressAutoHyphens/>
+              <ns0:spacing ns0:before="240" ns0:after="0" ns0:line="256" ns0:lineRule="auto"/>
+              <ns0:rPr>
+                <ns0:rFonts ns0:ascii="Times New Roman" ns0:hAnsi="Times New Roman"/>
+                <ns0:b/>
+                <ns0:sz ns0:val="20"/>
+                <ns0:szCs ns0:val="20"/>
+              </ns0:rPr>
+            </ns0:pPr>
+            <ns0:r ns0:rsidRPr="003B0023">
+              <ns0:rPr>
+                <ns0:rFonts ns0:ascii="Times New Roman" ns0:eastAsia="Times New Roman" ns0:hAnsi="Times New Roman"/>
+                <ns0:b/>
+                <ns0:color ns0:val="000000"/>
+                <ns0:sz ns0:val="20"/>
+                <ns0:szCs ns0:val="20"/>
+                <ns0:lang ns0:eastAsia="pt-BR"/>
+              </ns0:rPr>
+              <ns0:t>ANÁLISE DA OCORRÊNCIA</ns0:t>
+            </ns0:r>
+            <ns0:r>
+              <ns0:rPr>
+                <ns0:rFonts ns0:ascii="Times New Roman" ns0:eastAsia="Times New Roman" ns0:hAnsi="Times New Roman"/>
+                <ns0:b/>
+                <ns0:color ns0:val="000000"/>
+                <ns0:sz ns0:val="20"/>
+                <ns0:szCs ns0:val="20"/>
+                <ns0:lang ns0:eastAsia="pt-BR"/>
+              </ns0:rPr>
+              <ns0:t>:</ns0:t>
+            </ns0:r>
+            <ns0:r ns0:rsidR="00967D7E" ns0:rsidRPr="00967D7E">
+              <ns0:t xml:space="preserve"> </ns0:t>
+            </ns0:r>
+            <ns0:r ns0:rsidR="00967D7E" ns0:rsidRPr="00967D7E">
+              <ns0:rPr>
+                <ns0:rFonts ns0:ascii="Times New Roman" ns0:eastAsia="Times New Roman" ns0:hAnsi="Times New Roman"/>
+                <ns0:b/>
+                <ns0:color ns0:val="000000"/>
+                <ns0:sz ns0:val="20"/>
+                <ns0:szCs ns0:val="20"/>
+                <ns0:lang ns0:eastAsia="pt-BR"/>
+              </ns0:rPr>
+              <ns0:t>[DESCRIÇÃO_OCORRÊNCIA]</ns0:t>
+            </ns0:r>
+          </ns0:p>
+        </ns0:tc>
+      </ns0:tr>
+      <ns0:tr ns0:rsidR="001135B9" ns0:rsidRPr="003B0023" ns2:paraId="63B82913" ns2:textId="77777777" ns0:rsidTr="001135B9">
+        <ns0:trPr>
+          <ns0:cantSplit/>
+          <ns0:trHeight ns0:val="2171"/>
+          <ns0:jc ns0:val="center"/>
+        </ns0:trPr>
+        <ns0:tc>
+          <ns0:tcPr>
+            <ns0:tcW ns0:w="9348" ns0:type="dxa"/>
+            <ns0:gridSpan ns0:val="7"/>
+            <ns0:tcBorders>
+              <ns0:top ns0:val="single" ns0:sz="4" ns0:space="0" ns0:color="auto"/>
+              <ns0:left ns0:val="single" ns0:sz="4" ns0:space="0" ns0:color="auto"/>
+              <ns0:bottom ns0:val="single" ns0:sz="4" ns0:space="0" ns0:color="auto"/>
+              <ns0:right ns0:val="single" ns0:sz="4" ns0:space="0" ns0:color="auto"/>
+            </ns0:tcBorders>
+            <ns0:hideMark/>
+          </ns0:tcPr>
+          <ns0:p ns2:paraId="5812C90F" ns2:textId="77777777" ns0:rsidR="001135B9" ns0:rsidRPr="003B0023" ns0:rsidRDefault="001135B9" ns0:rsidP="0013288F">
+            <ns0:pPr>
+              <ns0:keepNext/>
+              <ns0:keepLines/>
+              <ns0:suppressLineNumbers/>
+              <ns0:suppressAutoHyphens/>
+              <ns0:spacing ns0:before="240" ns0:after="0" ns0:line="256" ns0:lineRule="auto"/>
+              <ns0:rPr>
+                <ns0:rFonts ns0:ascii="Times New Roman" ns0:hAnsi="Times New Roman"/>
+                <ns0:b/>
+                <ns0:sz ns0:val="20"/>
+                <ns0:szCs ns0:val="20"/>
+              </ns0:rPr>
+            </ns0:pPr>
+            <ns0:r ns0:rsidRPr="003B0023">
+              <ns0:rPr>
+                <ns0:rFonts ns0:ascii="Times New Roman" ns0:eastAsia="Times New Roman" ns0:hAnsi="Times New Roman"/>
+                <ns0:b/>
+                <ns0:color ns0:val="000000"/>
+                <ns0:sz ns0:val="20"/>
+                <ns0:szCs ns0:val="20"/>
+                <ns0:lang ns0:eastAsia="pt-BR"/>
+              </ns0:rPr>
+              <ns0:t>MEDIDAS CORRETIVAS</ns0:t>
+            </ns0:r>
+            <ns0:r>
+              <ns0:rPr>
+                <ns0:rFonts ns0:ascii="Times New Roman" ns0:eastAsia="Times New Roman" ns0:hAnsi="Times New Roman"/>
+                <ns0:b/>
+                <ns0:color ns0:val="000000"/>
+                <ns0:sz ns0:val="20"/>
+                <ns0:szCs ns0:val="20"/>
+                <ns0:lang ns0:eastAsia="pt-BR"/>
+              </ns0:rPr>
+              <ns0:t>:</ns0:t>
+            </ns0:r>
+            <ns0:r ns0:rsidR="00967D7E">
+              <ns0:rPr>
+                <ns0:rFonts ns0:ascii="Times New Roman" ns0:eastAsia="Times New Roman" ns0:hAnsi="Times New Roman"/>
+                <ns0:b/>
+                <ns0:color ns0:val="000000"/>
+                <ns0:sz ns0:val="20"/>
+                <ns0:szCs ns0:val="20"/>
+                <ns0:lang ns0:eastAsia="pt-BR"/>
+              </ns0:rPr>
+              <ns0:t xml:space="preserve"> </ns0:t>
+            </ns0:r>
+            <ns0:r ns0:rsidR="00967D7E" ns0:rsidRPr="00967D7E">
+              <ns0:rPr>
+                <ns0:rFonts ns0:ascii="Times New Roman" ns0:eastAsia="Times New Roman" ns0:hAnsi="Times New Roman"/>
+                <ns0:b/>
+                <ns0:color ns0:val="000000"/>
+                <ns0:sz ns0:val="20"/>
+                <ns0:szCs ns0:val="20"/>
+                <ns0:lang ns0:eastAsia="pt-BR"/>
+              </ns0:rPr>
+              <ns0:t>[MEDIDAS_CORRETIVAS]</ns0:t>
+            </ns0:r>
+          </ns0:p>
+        </ns0:tc>
+      </ns0:tr>
+      <ns0:tr ns0:rsidR="001135B9" ns0:rsidRPr="003B0023" ns2:paraId="2292873C" ns2:textId="77777777" ns0:rsidTr="001135B9">
+        <ns0:trPr>
+          <ns0:cantSplit/>
+          <ns0:trHeight ns0:val="2394"/>
+          <ns0:jc ns0:val="center"/>
+        </ns0:trPr>
+        <ns0:tc>
+          <ns0:tcPr>
+            <ns0:tcW ns0:w="9348" ns0:type="dxa"/>
+            <ns0:gridSpan ns0:val="7"/>
+            <ns0:tcBorders>
+              <ns0:top ns0:val="single" ns0:sz="4" ns0:space="0" ns0:color="auto"/>
+              <ns0:left ns0:val="single" ns0:sz="4" ns0:space="0" ns0:color="auto"/>
+              <ns0:bottom ns0:val="single" ns0:sz="4" ns0:space="0" ns0:color="auto"/>
+              <ns0:right ns0:val="single" ns0:sz="4" ns0:space="0" ns0:color="auto"/>
+            </ns0:tcBorders>
+            <ns0:hideMark/>
+          </ns0:tcPr>
+          <ns0:p ns2:paraId="2B0CBBEF" ns2:textId="77777777" ns0:rsidR="001135B9" ns0:rsidRPr="003B0023" ns0:rsidRDefault="001135B9" ns0:rsidP="0013288F">
+            <ns0:pPr>
+              <ns0:spacing ns0:before="240" ns0:after="0"/>
+              <ns0:rPr>
+                <ns0:rFonts ns0:ascii="Times New Roman" ns0:eastAsia="Times New Roman" ns0:hAnsi="Times New Roman"/>
+                <ns0:b/>
+                <ns0:color ns0:val="000000"/>
+                <ns0:sz ns0:val="20"/>
+                <ns0:szCs ns0:val="20"/>
+                <ns0:lang ns0:eastAsia="pt-BR"/>
+              </ns0:rPr>
+            </ns0:pPr>
+            <ns0:r ns0:rsidRPr="003B0023">
+              <ns0:rPr>
+                <ns0:rFonts ns0:ascii="Times New Roman" ns0:eastAsia="Times New Roman" ns0:hAnsi="Times New Roman"/>
+                <ns0:b/>
+                <ns0:color ns0:val="000000"/>
+                <ns0:sz ns0:val="20"/>
+                <ns0:szCs ns0:val="20"/>
+                <ns0:lang ns0:eastAsia="pt-BR"/>
+              </ns0:rPr>
+              <ns0:t>OBSERVAÇÕES (SE HOUVER)</ns0:t>
+            </ns0:r>
+            <ns0:r>
+              <ns0:rPr>
+                <ns0:rFonts ns0:ascii="Times New Roman" ns0:eastAsia="Times New Roman" ns0:hAnsi="Times New Roman"/>
+                <ns0:b/>
+                <ns0:color ns0:val="000000"/>
+                <ns0:sz ns0:val="20"/>
+                <ns0:szCs ns0:val="20"/>
+                <ns0:lang ns0:eastAsia="pt-BR"/>
+              </ns0:rPr>
+              <ns0:t>:</ns0:t>
+            </ns0:r>
+            <ns0:r ns0:rsidR="00967D7E">
+              <ns0:rPr>
+                <ns0:rFonts ns0:ascii="Times New Roman" ns0:eastAsia="Times New Roman" ns0:hAnsi="Times New Roman"/>
+                <ns0:b/>
+                <ns0:color ns0:val="000000"/>
+                <ns0:sz ns0:val="20"/>
+                <ns0:szCs ns0:val="20"/>
+                <ns0:lang ns0:eastAsia="pt-BR"/>
+              </ns0:rPr>
+              <ns0:t xml:space="preserve"> </ns0:t>
+            </ns0:r>
+            <ns0:r ns0:rsidR="00967D7E" ns0:rsidRPr="00967D7E">
+              <ns0:rPr>
+                <ns0:rFonts ns0:ascii="Times New Roman" ns0:eastAsia="Times New Roman" ns0:hAnsi="Times New Roman"/>
+                <ns0:b/>
+                <ns0:color ns0:val="000000"/>
+                <ns0:sz ns0:val="20"/>
+                <ns0:szCs ns0:val="20"/>
+                <ns0:lang ns0:eastAsia="pt-BR"/>
+              </ns0:rPr>
+              <ns0:t>[OBSERVAÇÕES]</ns0:t>
+            </ns0:r>
+          </ns0:p>
+        </ns0:tc>
+      </ns0:tr>
+    </ns0:tbl>
+    <ns0:p ns2:paraId="6A5AC03E" ns2:textId="77777777" ns0:rsidR="004050A3" ns0:rsidRDefault="004050A3" ns0:rsidP="006E61DB">
+      <ns0:pPr>
+        <ns0:pStyle ns0:val="Corpodetexto"/>
+        <ns0:spacing ns0:before="9" ns0:line="360" ns0:lineRule="auto"/>
+        <ns0:rPr>
+          <ns0:rFonts ns0:ascii="Times New Roman" ns0:hAnsi="Times New Roman" ns0:cs="Times New Roman"/>
+          <ns0:color ns0:val="000000"/>
+        </ns0:rPr>
+      </ns0:pPr>
+    </ns0:p>
+    <ns0:p ns2:paraId="368DF440" ns2:textId="77777777" ns0:rsidR="0013288F" ns0:rsidRPr="004050A3" ns0:rsidRDefault="0013288F" ns0:rsidP="006E61DB">
+      <ns0:pPr>
+        <ns0:pStyle ns0:val="Corpodetexto"/>
+        <ns0:spacing ns0:before="9" ns0:line="360" ns0:lineRule="auto"/>
+        <ns0:rPr>
+          <ns0:rFonts ns0:ascii="Times New Roman" ns0:hAnsi="Times New Roman" ns0:cs="Times New Roman"/>
+          <ns0:color ns0:val="000000"/>
+        </ns0:rPr>
+      </ns0:pPr>
+      <ns0:r>
+        <ns0:rPr>
+          <ns0:rFonts ns0:ascii="Times New Roman" ns0:hAnsi="Times New Roman" ns0:cs="Times New Roman"/>
+          <ns0:color ns0:val="000000"/>
+        </ns0:rPr>
+        <ns0:br ns0:type="page"/>
+      </ns0:r>
+    </ns0:p>
+    <ns0:tbl>
+      <ns0:tblPr>
+        <ns0:tblW ns0:w="0" ns0:type="auto"/>
+        <ns0:tblInd ns0:w="817" ns0:type="dxa"/>
+        <ns0:tblBorders>
+          <ns0:top ns0:val="single" ns0:sz="4" ns0:space="0" ns0:color="000000"/>
+          <ns0:left ns0:val="single" ns0:sz="4" ns0:space="0" ns0:color="000000"/>
+          <ns0:bottom ns0:val="single" ns0:sz="4" ns0:space="0" ns0:color="000000"/>
+          <ns0:right ns0:val="single" ns0:sz="4" ns0:space="0" ns0:color="000000"/>
+          <ns0:insideH ns0:val="single" ns0:sz="4" ns0:space="0" ns0:color="000000"/>
+          <ns0:insideV ns0:val="single" ns0:sz="4" ns0:space="0" ns0:color="000000"/>
+        </ns0:tblBorders>
+        <ns0:tblLook ns0:val="04A0" ns0:firstRow="1" ns0:lastRow="0" ns0:firstColumn="1" ns0:lastColumn="0" ns0:noHBand="0" ns0:noVBand="1"/>
+      </ns0:tblPr>
+      <ns0:tblGrid>
+        <ns0:gridCol ns0:w="4193"/>
+        <ns0:gridCol ns0:w="4193"/>
+      </ns0:tblGrid>
+      <ns0:tr ns0:rsidR="004050A3" ns2:paraId="718833B6" ns2:textId="77777777" ns0:rsidTr="007F5E4E">
+        <ns0:trPr>
+          <ns0:trHeight ns0:val="236"/>
+        </ns0:trPr>
+        <ns0:tc>
+          <ns0:tcPr>
+            <ns0:tcW ns0:w="8386" ns0:type="dxa"/>
+            <ns0:gridSpan ns0:val="2"/>
+            <ns0:tcBorders>
+              <ns0:top ns0:val="single" ns0:sz="4" ns0:space="0" ns0:color="000000"/>
+              <ns0:left ns0:val="single" ns0:sz="4" ns0:space="0" ns0:color="000000"/>
+              <ns0:bottom ns0:val="single" ns0:sz="4" ns0:space="0" ns0:color="000000"/>
+              <ns0:right ns0:val="single" ns0:sz="4" ns0:space="0" ns0:color="000000"/>
+            </ns0:tcBorders>
+            <ns0:shd ns0:val="clear" ns0:color="auto" ns0:fill="002060"/>
+            <ns0:vAlign ns0:val="center"/>
+            <ns0:hideMark/>
+          </ns0:tcPr>
+          <ns0:p ns2:paraId="7EDFFA09" ns2:textId="77777777" ns0:rsidR="004050A3" ns0:rsidRDefault="004050A3" ns0:rsidP="0013288F">
+            <ns0:pPr>
+              <ns0:jc ns0:val="center"/>
+              <ns0:rPr>
+                <ns0:rFonts ns0:ascii="Times New Roman" ns0:hAnsi="Times New Roman"/>
+                <ns0:b/>
+                <ns0:bCs/>
+                <ns0:color ns0:val="FFFFFF"/>
+              </ns0:rPr>
+            </ns0:pPr>
+            <ns0:r>
+              <ns0:rPr>
+                <ns0:rFonts ns0:ascii="Times New Roman" ns0:hAnsi="Times New Roman"/>
+                <ns0:b/>
+                <ns0:bCs/>
+                <ns0:color ns0:val="FFFFFF"/>
+              </ns0:rPr>
+              <ns0:t>REGISTRO FOTOGRÁFICO DA AÇÃO CORRETIVA</ns0:t>
+            </ns0:r>
+          </ns0:p>
+        </ns0:tc>
+      </ns0:tr>
+      <ns0:tr ns0:rsidR="0013288F" ns2:paraId="499B5D07" ns2:textId="77777777" ns0:rsidTr="007F5E4E">
+        <ns0:trPr>
+          <ns0:trHeight ns0:val="236"/>
+        </ns0:trPr>
+        <ns0:tc>
+          <ns0:tcPr>
+            <ns0:tcW ns0:w="4193" ns0:type="dxa"/>
+            <ns0:tcBorders>
+              <ns0:top ns0:val="single" ns0:sz="4" ns0:space="0" ns0:color="000000"/>
+              <ns0:left ns0:val="single" ns0:sz="4" ns0:space="0" ns0:color="000000"/>
+              <ns0:bottom ns0:val="single" ns0:sz="4" ns0:space="0" ns0:color="000000"/>
+              <ns0:right ns0:val="single" ns0:sz="4" ns0:space="0" ns0:color="000000"/>
+            </ns0:tcBorders>
+            <ns0:shd ns0:val="clear" ns0:color="auto" ns0:fill="002060"/>
+            <ns0:vAlign ns0:val="center"/>
+          </ns0:tcPr>
+          <ns0:p ns2:paraId="1134C47B" ns2:textId="77777777" ns0:rsidR="0013288F" ns0:rsidRDefault="0013288F" ns0:rsidP="0013288F">
+            <ns0:pPr>
+              <ns0:jc ns0:val="center"/>
+              <ns0:rPr>
+                <ns0:rFonts ns0:ascii="Times New Roman" ns0:hAnsi="Times New Roman"/>
+                <ns0:b/>
+                <ns0:bCs/>
+                <ns0:color ns0:val="FFFFFF"/>
+              </ns0:rPr>
+            </ns0:pPr>
+            <ns0:r>
+              <ns0:rPr>
+                <ns0:rFonts ns0:ascii="Times New Roman" ns0:hAnsi="Times New Roman"/>
+                <ns0:b/>
+                <ns0:color ns0:val="FFFFFF"/>
+                <ns0:lang ns0:eastAsia="pt-BR"/>
+              </ns0:rPr>
+              <ns0:t>FOTO 1 –</ns0:t>
+            </ns0:r>
+            <ns0:r>
+              <ns0:rPr>
+                <ns0:rFonts ns0:ascii="Times New Roman" ns0:hAnsi="Times New Roman"/>
+                <ns0:color ns0:val="FFFFFF"/>
+                <ns0:lang ns0:eastAsia="pt-BR"/>
+              </ns0:rPr>
+              <ns0:t xml:space="preserve"> </ns0:t>
+            </ns0:r>
+            <ns0:r ns0:rsidR="00967D7E" ns0:rsidRPr="00967D7E">
+              <ns0:rPr>
+                <ns0:rFonts ns0:ascii="Times New Roman" ns0:hAnsi="Times New Roman"/>
+                <ns0:color ns0:val="FFFFFF"/>
+                <ns0:lang ns0:eastAsia="pt-BR"/>
+              </ns0:rPr>
+              <ns0:t>[LEGENDA</ns0:t>
+            </ns0:r>
+            <ns0:r ns0:rsidR="00967D7E">
+              <ns0:rPr>
+                <ns0:rFonts ns0:ascii="Times New Roman" ns0:hAnsi="Times New Roman"/>
+                <ns0:color ns0:val="FFFFFF"/>
+                <ns0:lang ns0:eastAsia="pt-BR"/>
+              </ns0:rPr>
+              <ns0:t>1</ns0:t>
+            </ns0:r>
+            <ns0:r ns0:rsidR="00967D7E" ns0:rsidRPr="00967D7E">
+              <ns0:rPr>
+                <ns0:rFonts ns0:ascii="Times New Roman" ns0:hAnsi="Times New Roman"/>
+                <ns0:color ns0:val="FFFFFF"/>
+                <ns0:lang ns0:eastAsia="pt-BR"/>
+              </ns0:rPr>
+              <ns0:t>]</ns0:t>
+            </ns0:r>
+          </ns0:p>
+        </ns0:tc>
+        <ns0:tc>
+          <ns0:tcPr>
+            <ns0:tcW ns0:w="4193" ns0:type="dxa"/>
+            <ns0:tcBorders>
+              <ns0:top ns0:val="single" ns0:sz="4" ns0:space="0" ns0:color="000000"/>
+              <ns0:left ns0:val="single" ns0:sz="4" ns0:space="0" ns0:color="000000"/>
+              <ns0:bottom ns0:val="single" ns0:sz="4" ns0:space="0" ns0:color="000000"/>
+              <ns0:right ns0:val="single" ns0:sz="4" ns0:space="0" ns0:color="000000"/>
+            </ns0:tcBorders>
+            <ns0:shd ns0:val="clear" ns0:color="auto" ns0:fill="002060"/>
+            <ns0:vAlign ns0:val="center"/>
+          </ns0:tcPr>
+          <ns0:p ns2:paraId="306263CC" ns2:textId="77777777" ns0:rsidR="0013288F" ns0:rsidRDefault="0013288F" ns0:rsidP="0013288F">
+            <ns0:pPr>
+              <ns0:jc ns0:val="center"/>
+              <ns0:rPr>
+                <ns0:rFonts ns0:ascii="Times New Roman" ns0:hAnsi="Times New Roman"/>
+                <ns0:b/>
+                <ns0:bCs/>
+                <ns0:color ns0:val="FFFFFF"/>
+              </ns0:rPr>
+            </ns0:pPr>
+            <ns0:r>
+              <ns0:rPr>
+                <ns0:rFonts ns0:ascii="Times New Roman" ns0:hAnsi="Times New Roman"/>
+                <ns0:b/>
+                <ns0:color ns0:val="FFFFFF"/>
+                <ns0:lang ns0:eastAsia="pt-BR"/>
+              </ns0:rPr>
+              <ns0:t>FOTO 2 –</ns0:t>
+            </ns0:r>
+            <ns0:r>
+              <ns0:rPr>
+                <ns0:rFonts ns0:ascii="Times New Roman" ns0:hAnsi="Times New Roman"/>
+                <ns0:color ns0:val="FFFFFF"/>
+                <ns0:lang ns0:eastAsia="pt-BR"/>
+              </ns0:rPr>
+              <ns0:t xml:space="preserve"> </ns0:t>
+            </ns0:r>
+            <ns0:r ns0:rsidR="00967D7E" ns0:rsidRPr="00967D7E">
+              <ns0:rPr>
+                <ns0:rFonts ns0:ascii="Times New Roman" ns0:hAnsi="Times New Roman"/>
+                <ns0:color ns0:val="FFFFFF"/>
+                <ns0:lang ns0:eastAsia="pt-BR"/>
+              </ns0:rPr>
+              <ns0:t>[LEGENDA</ns0:t>
+            </ns0:r>
+            <ns0:r ns0:rsidR="00967D7E">
+              <ns0:rPr>
+                <ns0:rFonts ns0:ascii="Times New Roman" ns0:hAnsi="Times New Roman"/>
+                <ns0:color ns0:val="FFFFFF"/>
+                <ns0:lang ns0:eastAsia="pt-BR"/>
+              </ns0:rPr>
+              <ns0:t>2</ns0:t>
+            </ns0:r>
+            <ns0:r ns0:rsidR="00967D7E" ns0:rsidRPr="00967D7E">
+              <ns0:rPr>
+                <ns0:rFonts ns0:ascii="Times New Roman" ns0:hAnsi="Times New Roman"/>
+                <ns0:color ns0:val="FFFFFF"/>
+                <ns0:lang ns0:eastAsia="pt-BR"/>
+              </ns0:rPr>
+              <ns0:t>]</ns0:t>
+            </ns0:r>
+          </ns0:p>
+        </ns0:tc>
+      </ns0:tr>
+      <ns0:tr ns0:rsidR="0013288F" ns0:rsidRPr="00E32823" ns2:paraId="19404255" ns2:textId="77777777">
+        <ns0:trPr>
+          <ns0:trHeight ns0:val="2671"/>
+        </ns0:trPr>
+        <ns0:tc>
+          <ns0:tcPr>
+            <ns0:tcW ns0:w="4193" ns0:type="dxa"/>
+            <ns0:tcBorders>
+              <ns0:top ns0:val="single" ns0:sz="4" ns0:space="0" ns0:color="000000"/>
+              <ns0:left ns0:val="single" ns0:sz="4" ns0:space="0" ns0:color="000000"/>
+              <ns0:bottom ns0:val="single" ns0:sz="4" ns0:space="0" ns0:color="000000"/>
+              <ns0:right ns0:val="single" ns0:sz="4" ns0:space="0" ns0:color="000000"/>
+            </ns0:tcBorders>
+          </ns0:tcPr>
+          <ns0:p ns2:paraId="684CC02A" ns2:textId="77777777" ns0:rsidR="0013288F" ns0:rsidRPr="00E32823" ns0:rsidRDefault="00602B53" ns0:rsidP="00E32823">
+            <ns0:pPr>
+              <ns0:shd ns0:val="clear" ns0:color="auto" ns0:fill="FFFFFF"/>
+              <ns0:spacing ns0:before="240"/>
+              <ns0:rPr>
+                <ns0:rFonts ns0:ascii="Times New Roman" ns0:hAnsi="Times New Roman"/>
+                <ns0:lang ns0:eastAsia="pt-BR"/>
+              </ns0:rPr>
+            </ns0:pPr>
+            <ns0:r ns0:rsidRPr="00602B53">
+              <ns0:rPr>
+                <ns0:rFonts ns0:ascii="Times New Roman" ns0:hAnsi="Times New Roman"/>
+                <ns0:lang ns0:eastAsia="pt-BR"/>
+              </ns0:rPr>
+              <ns0:t>[FOTO_1]</ns0:t>
+            </ns0:r>
+          </ns0:p>
+        </ns0:tc>
+        <ns0:tc>
+          <ns0:tcPr>
+            <ns0:tcW ns0:w="4193" ns0:type="dxa"/>
+            <ns0:tcBorders>
+              <ns0:top ns0:val="single" ns0:sz="4" ns0:space="0" ns0:color="000000"/>
+              <ns0:left ns0:val="single" ns0:sz="4" ns0:space="0" ns0:color="000000"/>
+              <ns0:bottom ns0:val="single" ns0:sz="4" ns0:space="0" ns0:color="000000"/>
+              <ns0:right ns0:val="single" ns0:sz="4" ns0:space="0" ns0:color="000000"/>
+            </ns0:tcBorders>
+          </ns0:tcPr>
+          <ns0:p ns2:paraId="6374F74D" ns2:textId="77777777" ns0:rsidR="0013288F" ns0:rsidRPr="00E32823" ns0:rsidRDefault="00602B53" ns0:rsidP="00E32823">
+            <ns0:pPr>
+              <ns0:shd ns0:val="clear" ns0:color="auto" ns0:fill="FFFFFF"/>
+              <ns0:spacing ns0:before="240"/>
+              <ns0:rPr>
+                <ns0:rFonts ns0:ascii="Times New Roman" ns0:hAnsi="Times New Roman"/>
+                <ns0:lang ns0:eastAsia="pt-BR"/>
+              </ns0:rPr>
+            </ns0:pPr>
+            <ns0:r ns0:rsidRPr="00602B53">
+              <ns0:rPr>
+                <ns0:rFonts ns0:ascii="Times New Roman" ns0:hAnsi="Times New Roman"/>
+                <ns0:lang ns0:eastAsia="pt-BR"/>
+              </ns0:rPr>
+              <ns0:t>[FOTO_</ns0:t>
+            </ns0:r>
+            <ns0:r>
+              <ns0:rPr>
+                <ns0:rFonts ns0:ascii="Times New Roman" ns0:hAnsi="Times New Roman"/>
+                <ns0:lang ns0:eastAsia="pt-BR"/>
+              </ns0:rPr>
+              <ns0:t>2</ns0:t>
+            </ns0:r>
+            <ns0:r ns0:rsidRPr="00602B53">
+              <ns0:rPr>
+                <ns0:rFonts ns0:ascii="Times New Roman" ns0:hAnsi="Times New Roman"/>
+                <ns0:lang ns0:eastAsia="pt-BR"/>
+              </ns0:rPr>
+              <ns0:t>]</ns0:t>
+            </ns0:r>
+          </ns0:p>
+        </ns0:tc>
+      </ns0:tr>
+      <ns0:tr ns0:rsidR="0013288F" ns2:paraId="2D3CD5C7" ns2:textId="77777777" ns0:rsidTr="007F5E4E">
+        <ns0:trPr>
+          <ns0:trHeight ns0:val="381"/>
+        </ns0:trPr>
+        <ns0:tc>
+          <ns0:tcPr>
+            <ns0:tcW ns0:w="4193" ns0:type="dxa"/>
+            <ns0:tcBorders>
+              <ns0:top ns0:val="single" ns0:sz="4" ns0:space="0" ns0:color="000000"/>
+              <ns0:left ns0:val="single" ns0:sz="4" ns0:space="0" ns0:color="000000"/>
+              <ns0:bottom ns0:val="single" ns0:sz="4" ns0:space="0" ns0:color="000000"/>
+              <ns0:right ns0:val="single" ns0:sz="4" ns0:space="0" ns0:color="000000"/>
+            </ns0:tcBorders>
+            <ns0:shd ns0:val="clear" ns0:color="auto" ns0:fill="002060"/>
+            <ns0:hideMark/>
+          </ns0:tcPr>
+          <ns0:p ns2:paraId="513D65EF" ns2:textId="77777777" ns0:rsidR="0013288F" ns0:rsidRDefault="0013288F" ns0:rsidP="00E32823">
+            <ns0:pPr>
+              <ns0:jc ns0:val="center"/>
+              <ns0:rPr>
+                <ns0:rFonts ns0:ascii="Times New Roman" ns0:hAnsi="Times New Roman"/>
+                <ns0:color ns0:val="FFFFFF"/>
+                <ns0:lang ns0:eastAsia="pt-BR"/>
+              </ns0:rPr>
+            </ns0:pPr>
+            <ns0:r>
+              <ns0:rPr>
+                <ns0:rFonts ns0:ascii="Times New Roman" ns0:hAnsi="Times New Roman"/>
+                <ns0:b/>
+                <ns0:color ns0:val="FFFFFF"/>
+                <ns0:lang ns0:eastAsia="pt-BR"/>
+              </ns0:rPr>
+              <ns0:t>FOTO 3 –</ns0:t>
+            </ns0:r>
+            <ns0:r>
+              <ns0:rPr>
+                <ns0:rFonts ns0:ascii="Times New Roman" ns0:hAnsi="Times New Roman"/>
+                <ns0:color ns0:val="FFFFFF"/>
+                <ns0:lang ns0:eastAsia="pt-BR"/>
+              </ns0:rPr>
+              <ns0:t xml:space="preserve"> </ns0:t>
+            </ns0:r>
+            <ns0:r ns0:rsidR="00967D7E" ns0:rsidRPr="00967D7E">
+              <ns0:rPr>
+                <ns0:rFonts ns0:ascii="Times New Roman" ns0:hAnsi="Times New Roman"/>
+                <ns0:color ns0:val="FFFFFF"/>
+                <ns0:lang ns0:eastAsia="pt-BR"/>
+              </ns0:rPr>
+              <ns0:t>[LEGENDA</ns0:t>
+            </ns0:r>
+            <ns0:r ns0:rsidR="00967D7E">
+              <ns0:rPr>
+                <ns0:rFonts ns0:ascii="Times New Roman" ns0:hAnsi="Times New Roman"/>
+                <ns0:color ns0:val="FFFFFF"/>
+                <ns0:lang ns0:eastAsia="pt-BR"/>
+              </ns0:rPr>
+              <ns0:t>3</ns0:t>
+            </ns0:r>
+            <ns0:r ns0:rsidR="00967D7E" ns0:rsidRPr="00967D7E">
+              <ns0:rPr>
+                <ns0:rFonts ns0:ascii="Times New Roman" ns0:hAnsi="Times New Roman"/>
+                <ns0:color ns0:val="FFFFFF"/>
+                <ns0:lang ns0:eastAsia="pt-BR"/>
+              </ns0:rPr>
+              <ns0:t>]</ns0:t>
+            </ns0:r>
+          </ns0:p>
+        </ns0:tc>
+        <ns0:tc>
+          <ns0:tcPr>
+            <ns0:tcW ns0:w="4193" ns0:type="dxa"/>
+            <ns0:tcBorders>
+              <ns0:top ns0:val="single" ns0:sz="4" ns0:space="0" ns0:color="000000"/>
+              <ns0:left ns0:val="single" ns0:sz="4" ns0:space="0" ns0:color="000000"/>
+              <ns0:bottom ns0:val="single" ns0:sz="4" ns0:space="0" ns0:color="000000"/>
+              <ns0:right ns0:val="single" ns0:sz="4" ns0:space="0" ns0:color="000000"/>
+            </ns0:tcBorders>
+            <ns0:shd ns0:val="clear" ns0:color="auto" ns0:fill="002060"/>
+          </ns0:tcPr>
+          <ns0:p ns2:paraId="3B7C5E5C" ns2:textId="77777777" ns0:rsidR="0013288F" ns0:rsidRDefault="0013288F" ns0:rsidP="00E32823">
+            <ns0:pPr>
+              <ns0:jc ns0:val="center"/>
+              <ns0:rPr>
+                <ns0:rFonts ns0:ascii="Times New Roman" ns0:hAnsi="Times New Roman"/>
+                <ns0:color ns0:val="FFFFFF"/>
+                <ns0:lang ns0:eastAsia="pt-BR"/>
+              </ns0:rPr>
+            </ns0:pPr>
+            <ns0:r>
+              <ns0:rPr>
+                <ns0:rFonts ns0:ascii="Times New Roman" ns0:hAnsi="Times New Roman"/>
+                <ns0:b/>
+                <ns0:color ns0:val="FFFFFF"/>
+                <ns0:lang ns0:eastAsia="pt-BR"/>
+              </ns0:rPr>
+              <ns0:t>FOTO 4 –</ns0:t>
+            </ns0:r>
+            <ns0:r>
+              <ns0:rPr>
+                <ns0:rFonts ns0:ascii="Times New Roman" ns0:hAnsi="Times New Roman"/>
+                <ns0:color ns0:val="FFFFFF"/>
+                <ns0:lang ns0:eastAsia="pt-BR"/>
+              </ns0:rPr>
+              <ns0:t xml:space="preserve"> </ns0:t>
+            </ns0:r>
+            <ns0:r ns0:rsidR="00967D7E" ns0:rsidRPr="00967D7E">
+              <ns0:rPr>
+                <ns0:rFonts ns0:ascii="Times New Roman" ns0:hAnsi="Times New Roman"/>
+                <ns0:color ns0:val="FFFFFF"/>
+                <ns0:lang ns0:eastAsia="pt-BR"/>
+              </ns0:rPr>
+              <ns0:t>[LEGENDA</ns0:t>
+            </ns0:r>
+            <ns0:r ns0:rsidR="00967D7E">
+              <ns0:rPr>
+                <ns0:rFonts ns0:ascii="Times New Roman" ns0:hAnsi="Times New Roman"/>
+                <ns0:color ns0:val="FFFFFF"/>
+                <ns0:lang ns0:eastAsia="pt-BR"/>
+              </ns0:rPr>
+              <ns0:t>4</ns0:t>
+            </ns0:r>
+            <ns0:r ns0:rsidR="00967D7E" ns0:rsidRPr="00967D7E">
+              <ns0:rPr>
+                <ns0:rFonts ns0:ascii="Times New Roman" ns0:hAnsi="Times New Roman"/>
+                <ns0:color ns0:val="FFFFFF"/>
+                <ns0:lang ns0:eastAsia="pt-BR"/>
+              </ns0:rPr>
+              <ns0:t>]</ns0:t>
+            </ns0:r>
+          </ns0:p>
+        </ns0:tc>
+      </ns0:tr>
+      <ns0:tr ns0:rsidR="0013288F" ns0:rsidRPr="00E32823" ns2:paraId="629AD3C5" ns2:textId="77777777" ns0:rsidTr="00967D7E">
+        <ns0:trPr>
+          <ns0:trHeight ns0:val="2835"/>
+        </ns0:trPr>
+        <ns0:tc>
+          <ns0:tcPr>
+            <ns0:tcW ns0:w="4193" ns0:type="dxa"/>
+            <ns0:tcBorders>
+              <ns0:top ns0:val="single" ns0:sz="4" ns0:space="0" ns0:color="000000"/>
+              <ns0:left ns0:val="single" ns0:sz="4" ns0:space="0" ns0:color="000000"/>
+              <ns0:bottom ns0:val="single" ns0:sz="4" ns0:space="0" ns0:color="000000"/>
+              <ns0:right ns0:val="single" ns0:sz="4" ns0:space="0" ns0:color="000000"/>
+            </ns0:tcBorders>
+          </ns0:tcPr>
+          <ns0:p ns2:paraId="11E1EB6B" ns2:textId="77777777" ns0:rsidR="0013288F" ns0:rsidRPr="00E32823" ns0:rsidRDefault="00602B53" ns0:rsidP="00967D7E">
+            <ns0:pPr>
+              <ns0:shd ns0:val="clear" ns0:color="auto" ns0:fill="FFFFFF"/>
+              <ns0:spacing ns0:before="240"/>
+              <ns0:rPr>
+                <ns0:rFonts ns0:ascii="Times New Roman" ns0:hAnsi="Times New Roman"/>
+                <ns0:b/>
+                <ns0:lang ns0:eastAsia="pt-BR"/>
+              </ns0:rPr>
+            </ns0:pPr>
+            <ns0:r ns0:rsidRPr="00602B53">
+              <ns0:rPr>
+                <ns0:rFonts ns0:ascii="Times New Roman" ns0:hAnsi="Times New Roman"/>
+                <ns0:lang ns0:eastAsia="pt-BR"/>
+              </ns0:rPr>
+              <ns0:t>[FOTO_3]</ns0:t>
+            </ns0:r>
+          </ns0:p>
+        </ns0:tc>
+        <ns0:tc>
+          <ns0:tcPr>
+            <ns0:tcW ns0:w="4193" ns0:type="dxa"/>
+            <ns0:tcBorders>
+              <ns0:top ns0:val="single" ns0:sz="4" ns0:space="0" ns0:color="000000"/>
+              <ns0:left ns0:val="single" ns0:sz="4" ns0:space="0" ns0:color="000000"/>
+              <ns0:bottom ns0:val="single" ns0:sz="4" ns0:space="0" ns0:color="000000"/>
+              <ns0:right ns0:val="single" ns0:sz="4" ns0:space="0" ns0:color="000000"/>
+            </ns0:tcBorders>
+          </ns0:tcPr>
+          <ns0:p ns2:paraId="23111D39" ns2:textId="77777777" ns0:rsidR="0013288F" ns0:rsidRPr="00E32823" ns0:rsidRDefault="00602B53" ns0:rsidP="00967D7E">
+            <ns0:pPr>
+              <ns0:shd ns0:val="clear" ns0:color="auto" ns0:fill="FFFFFF"/>
+              <ns0:spacing ns0:before="240"/>
+              <ns0:rPr>
+                <ns0:rFonts ns0:ascii="Times New Roman" ns0:hAnsi="Times New Roman"/>
+                <ns0:b/>
+                <ns0:lang ns0:eastAsia="pt-BR"/>
+              </ns0:rPr>
+            </ns0:pPr>
+            <ns0:r ns0:rsidRPr="00602B53">
+              <ns0:rPr>
+                <ns0:rFonts ns0:ascii="Times New Roman" ns0:hAnsi="Times New Roman"/>
+                <ns0:lang ns0:eastAsia="pt-BR"/>
+              </ns0:rPr>
+              <ns0:t>[FOTO_</ns0:t>
+            </ns0:r>
+            <ns0:r>
+              <ns0:rPr>
+                <ns0:rFonts ns0:ascii="Times New Roman" ns0:hAnsi="Times New Roman"/>
+                <ns0:lang ns0:eastAsia="pt-BR"/>
+              </ns0:rPr>
+              <ns0:t>4</ns0:t>
+            </ns0:r>
+            <ns0:r ns0:rsidRPr="00602B53">
+              <ns0:rPr>
+                <ns0:rFonts ns0:ascii="Times New Roman" ns0:hAnsi="Times New Roman"/>
+                <ns0:lang ns0:eastAsia="pt-BR"/>
+              </ns0:rPr>
+              <ns0:t>]</ns0:t>
+            </ns0:r>
+          </ns0:p>
+        </ns0:tc>
+      </ns0:tr>
+    </ns0:tbl>
+    <ns0:p ns2:paraId="68BB1204" ns2:textId="77777777" ns0:rsidR="00553A7F" ns0:rsidRDefault="00553A7F" ns0:rsidP="00553A7F">
+      <ns0:pPr>
+        <ns0:spacing ns0:after="0"/>
+        <ns0:rPr>
+          <ns0:vanish/>
+        </ns0:rPr>
+      </ns0:pPr>
+    </ns0:p>
+    <ns0:p ns2:paraId="6BAF2168" ns2:textId="77777777" ns0:rsidR="00F67F0E" ns0:rsidRDefault="00F67F0E" ns0:rsidP="00553A7F">
+      <ns0:pPr>
+        <ns0:spacing ns0:after="0"/>
+        <ns0:rPr>
+          <ns0:vanish/>
+        </ns0:rPr>
+      </ns0:pPr>
+    </ns0:p>
+    <ns0:p ns2:paraId="38A17995" ns2:textId="77777777" ns0:rsidR="00F67F0E" ns0:rsidRDefault="00F67F0E" ns0:rsidP="00553A7F">
+      <ns0:pPr>
+        <ns0:spacing ns0:after="0"/>
+        <ns0:rPr>
+          <ns0:vanish/>
+        </ns0:rPr>
+      </ns0:pPr>
+    </ns0:p>
+    <ns0:p ns2:paraId="25C22B10" ns2:textId="77777777" ns0:rsidR="00F67F0E" ns0:rsidRDefault="00F67F0E" ns0:rsidP="00553A7F">
+      <ns0:pPr>
+        <ns0:spacing ns0:after="0"/>
+        <ns0:rPr>
+          <ns0:vanish/>
+        </ns0:rPr>
+      </ns0:pPr>
+    </ns0:p>
+    <ns0:p ns2:paraId="24FAC7CD" ns2:textId="77777777" ns0:rsidR="00F67F0E" ns0:rsidRDefault="00F67F0E" ns0:rsidP="00553A7F">
+      <ns0:pPr>
+        <ns0:spacing ns0:after="0"/>
+        <ns0:rPr>
+          <ns0:vanish/>
+        </ns0:rPr>
+      </ns0:pPr>
+    </ns0:p>
+    <ns0:p ns2:paraId="43CFC5C9" ns2:textId="77777777" ns0:rsidR="00F67F0E" ns0:rsidRPr="00553A7F" ns0:rsidRDefault="00F67F0E" ns0:rsidP="00553A7F">
+      <ns0:pPr>
+        <ns0:spacing ns0:after="0"/>
+        <ns0:rPr>
+          <ns0:vanish/>
+        </ns0:rPr>
+      </ns0:pPr>
+    </ns0:p>
+    <ns0:p ns2:paraId="14E38058" ns2:textId="77777777" ns0:rsidR="0022486B" ns0:rsidRPr="007E3444" ns0:rsidRDefault="0022486B" ns0:rsidP="00AD1CCB">
+      <ns0:pPr>
+        <ns0:tabs>
+          <ns0:tab ns0:val="left" ns0:pos="3587"/>
+        </ns0:tabs>
+        <ns0:spacing ns0:after="0"/>
+        <ns0:jc ns0:val="both"/>
+        <ns0:rPr>
+          <ns0:rFonts ns0:ascii="Times New Roman" ns0:hAnsi="Times New Roman"/>
+          <ns0:b/>
+          <ns0:sz ns0:val="22"/>
+          <ns0:szCs ns0:val="22"/>
+        </ns0:rPr>
+      </ns0:pPr>
+    </ns0:p>
+    <ns0:sectPr ns0:rsidR="0022486B" ns0:rsidRPr="007E3444" ns0:rsidSect="006E61DB">
+      <ns0:headerReference ns0:type="even" ns10:id="rId7"/>
+      <ns0:headerReference ns0:type="default" ns10:id="rId8"/>
+      <ns0:headerReference ns0:type="first" ns10:id="rId9"/>
+      <ns0:pgSz ns0:w="11900" ns0:h="16840"/>
+      <ns0:pgMar ns0:top="1418" ns0:right="1134" ns0:bottom="1560" ns0:left="1418" ns0:header="397" ns0:footer="567" ns0:gutter="0"/>
+      <ns0:cols ns0:space="708"/>
+      <ns0:docGrid ns0:linePitch="326"/>
+    </ns0:sectPr>
+  </ns0:body>
+</ns0:document>
 </file>
 
 <file path=word/endnotes.xml><?xml version="1.0" encoding="utf-8"?>

</xml_diff>

<commit_message>
Restaura preenchimento do modelo Word
</commit_message>
<xml_diff>
--- a/templates/modelo-tratativa-rnc.docx
+++ b/templates/modelo-tratativa-rnc.docx
@@ -1,1947 +1,1947 @@
 
 <file path=word/document.xml><?xml version="1.0" encoding="utf-8"?>
-<ns0:document xmlns:ns0="http://schemas.openxmlformats.org/wordprocessingml/2006/main" xmlns:ns1="http://schemas.openxmlformats.org/markup-compatibility/2006" xmlns:ns10="http://schemas.openxmlformats.org/officeDocument/2006/relationships" xmlns:ns2="http://schemas.microsoft.com/office/word/2010/wordml" xmlns:ns3="http://schemas.openxmlformats.org/drawingml/2006/wordprocessingDrawing" xmlns:ns4="http://schemas.microsoft.com/office/word/2010/wordprocessingDrawing" xmlns:ns5="http://schemas.openxmlformats.org/drawingml/2006/main" xmlns:ns6="http://schemas.microsoft.com/office/word/2010/wordprocessingShape" xmlns:ns7="http://schemas.microsoft.com/office/drawing/2010/main" xmlns:ns8="urn:schemas-microsoft-com:vml" xmlns:ns9="urn:schemas-microsoft-com:office:office" ns1:Ignorable="w14 w15 w16se w16cid w16 w16cex w16sdtdh w16sdtfl w16du wp14">
-  <ns0:body>
-    <ns0:tbl>
-      <ns0:tblPr>
-        <ns0:tblW ns0:w="9348" ns0:type="dxa"/>
-        <ns0:jc ns0:val="center"/>
-        <ns0:shd ns0:val="clear" ns0:color="auto" ns0:fill="FFFFFF"/>
-        <ns0:tblLayout ns0:type="fixed"/>
-        <ns0:tblCellMar>
-          <ns0:left ns0:w="70" ns0:type="dxa"/>
-          <ns0:right ns0:w="70" ns0:type="dxa"/>
-        </ns0:tblCellMar>
-        <ns0:tblLook ns0:val="04A0" ns0:firstRow="1" ns0:lastRow="0" ns0:firstColumn="1" ns0:lastColumn="0" ns0:noHBand="0" ns0:noVBand="1"/>
-      </ns0:tblPr>
-      <ns0:tblGrid>
-        <ns0:gridCol ns0:w="2337"/>
-        <ns0:gridCol ns0:w="1330"/>
-        <ns0:gridCol ns0:w="1770"/>
-        <ns0:gridCol ns0:w="126"/>
-        <ns0:gridCol ns0:w="1138"/>
-        <ns0:gridCol ns0:w="759"/>
-        <ns0:gridCol ns0:w="1888"/>
-      </ns0:tblGrid>
-      <ns0:tr ns0:rsidR="003B0023" ns2:paraId="076FAD70" ns2:textId="77777777" ns0:rsidTr="007F5E4E">
-        <ns0:trPr>
-          <ns0:cantSplit/>
-          <ns0:trHeight ns0:val="454"/>
-          <ns0:jc ns0:val="center"/>
-        </ns0:trPr>
-        <ns0:tc>
-          <ns0:tcPr>
-            <ns0:tcW ns0:w="9348" ns0:type="dxa"/>
-            <ns0:gridSpan ns0:val="7"/>
-            <ns0:tcBorders>
-              <ns0:top ns0:val="single" ns0:sz="4" ns0:space="0" ns0:color="auto"/>
-              <ns0:left ns0:val="single" ns0:sz="4" ns0:space="0" ns0:color="auto"/>
-              <ns0:bottom ns0:val="single" ns0:sz="4" ns0:space="0" ns0:color="auto"/>
-              <ns0:right ns0:val="single" ns0:sz="4" ns0:space="0" ns0:color="auto"/>
-            </ns0:tcBorders>
-            <ns0:shd ns0:val="clear" ns0:color="auto" ns0:fill="002060"/>
-            <ns0:vAlign ns0:val="center"/>
-          </ns0:tcPr>
-          <ns0:p ns2:paraId="2E5ED720" ns2:textId="77777777" ns0:rsidR="003B0023" ns0:rsidRDefault="003B0023" ns0:rsidP="006D3A5C">
-            <ns0:pPr>
-              <ns0:keepNext/>
-              <ns0:keepLines/>
-              <ns0:suppressLineNumbers/>
-              <ns0:suppressAutoHyphens/>
-              <ns0:spacing ns0:after="0" ns0:line="256" ns0:lineRule="auto"/>
-              <ns0:jc ns0:val="center"/>
-              <ns0:rPr>
-                <ns0:rFonts ns0:ascii="Times New Roman" ns0:hAnsi="Times New Roman"/>
-                <ns0:b/>
-                <ns0:color ns0:val="FFFFFF"/>
-                <ns0:sz ns0:val="20"/>
-                <ns0:szCs ns0:val="20"/>
-              </ns0:rPr>
-            </ns0:pPr>
-            <ns0:r>
-              <ns0:rPr>
-                <ns0:rFonts ns0:ascii="Times New Roman" ns0:hAnsi="Times New Roman"/>
-                <ns0:b/>
-                <ns0:color ns0:val="FFFFFF"/>
-                <ns0:sz ns0:val="20"/>
-                <ns0:szCs ns0:val="20"/>
-              </ns0:rPr>
-              <ns0:t>INFORMAÇÕES DA TRATATIVA</ns0:t>
-            </ns0:r>
-          </ns0:p>
-        </ns0:tc>
-      </ns0:tr>
-      <ns0:tr ns0:rsidR="003B0023" ns2:paraId="07CAA121" ns2:textId="77777777" ns0:rsidTr="007F5E4E">
-        <ns0:trPr>
-          <ns0:cantSplit/>
-          <ns0:trHeight ns0:val="454"/>
-          <ns0:jc ns0:val="center"/>
-        </ns0:trPr>
-        <ns0:tc>
-          <ns0:tcPr>
-            <ns0:tcW ns0:w="3667" ns0:type="dxa"/>
-            <ns0:gridSpan ns0:val="2"/>
-            <ns0:tcBorders>
-              <ns0:top ns0:val="single" ns0:sz="4" ns0:space="0" ns0:color="auto"/>
-              <ns0:left ns0:val="single" ns0:sz="4" ns0:space="0" ns0:color="auto"/>
-              <ns0:bottom ns0:val="single" ns0:sz="4" ns0:space="0" ns0:color="auto"/>
-              <ns0:right ns0:val="single" ns0:sz="4" ns0:space="0" ns0:color="auto"/>
-            </ns0:tcBorders>
-            <ns0:shd ns0:val="clear" ns0:color="auto" ns0:fill="002060"/>
-            <ns0:vAlign ns0:val="center"/>
-          </ns0:tcPr>
-          <ns0:p ns2:paraId="625D47C0" ns2:textId="77777777" ns0:rsidR="003B0023" ns0:rsidRDefault="003B0023" ns0:rsidP="006D3A5C">
-            <ns0:pPr>
-              <ns0:keepNext/>
-              <ns0:keepLines/>
-              <ns0:suppressLineNumbers/>
-              <ns0:suppressAutoHyphens/>
-              <ns0:spacing ns0:after="0" ns0:line="256" ns0:lineRule="auto"/>
-              <ns0:jc ns0:val="center"/>
-              <ns0:rPr>
-                <ns0:rFonts ns0:ascii="Times New Roman" ns0:hAnsi="Times New Roman"/>
-                <ns0:b/>
-                <ns0:color ns0:val="FFFFFF"/>
-                <ns0:sz ns0:val="20"/>
-                <ns0:szCs ns0:val="20"/>
-              </ns0:rPr>
-            </ns0:pPr>
-            <ns0:r>
-              <ns0:rPr>
-                <ns0:rFonts ns0:ascii="Times New Roman" ns0:hAnsi="Times New Roman"/>
-                <ns0:b/>
-                <ns0:color ns0:val="FFFFFF"/>
-                <ns0:sz ns0:val="20"/>
-                <ns0:szCs ns0:val="20"/>
-              </ns0:rPr>
-              <ns0:t>RNC Nº:</ns0:t>
-            </ns0:r>
-          </ns0:p>
-        </ns0:tc>
-        <ns0:tc>
-          <ns0:tcPr>
-            <ns0:tcW ns0:w="3033" ns0:type="dxa"/>
-            <ns0:gridSpan ns0:val="3"/>
-            <ns0:tcBorders>
-              <ns0:top ns0:val="single" ns0:sz="4" ns0:space="0" ns0:color="auto"/>
-              <ns0:left ns0:val="single" ns0:sz="4" ns0:space="0" ns0:color="auto"/>
-              <ns0:bottom ns0:val="single" ns0:sz="4" ns0:space="0" ns0:color="auto"/>
-              <ns0:right ns0:val="single" ns0:sz="4" ns0:space="0" ns0:color="auto"/>
-            </ns0:tcBorders>
-            <ns0:shd ns0:val="clear" ns0:color="auto" ns0:fill="002060"/>
-            <ns0:vAlign ns0:val="center"/>
-          </ns0:tcPr>
-          <ns0:p ns2:paraId="2F967515" ns2:textId="77777777" ns0:rsidR="003B0023" ns0:rsidRDefault="003B0023" ns0:rsidP="006D3A5C">
-            <ns0:pPr>
-              <ns0:keepNext/>
-              <ns0:keepLines/>
-              <ns0:suppressLineNumbers/>
-              <ns0:suppressAutoHyphens/>
-              <ns0:spacing ns0:after="0" ns0:line="256" ns0:lineRule="auto"/>
-              <ns0:jc ns0:val="center"/>
-              <ns0:rPr>
-                <ns0:rFonts ns0:ascii="Times New Roman" ns0:hAnsi="Times New Roman"/>
-                <ns0:b/>
-                <ns0:color ns0:val="FFFFFF"/>
-                <ns0:sz ns0:val="20"/>
-                <ns0:szCs ns0:val="20"/>
-              </ns0:rPr>
-            </ns0:pPr>
-            <ns0:r>
-              <ns0:rPr>
-                <ns0:rFonts ns0:ascii="Times New Roman" ns0:hAnsi="Times New Roman"/>
-                <ns0:b/>
-                <ns0:color ns0:val="FFFFFF"/>
-                <ns0:sz ns0:val="20"/>
-                <ns0:szCs ns0:val="20"/>
-              </ns0:rPr>
-              <ns0:t>DATA DA EMISSÃO DA RNC:</ns0:t>
-            </ns0:r>
-          </ns0:p>
-        </ns0:tc>
-        <ns0:tc>
-          <ns0:tcPr>
-            <ns0:tcW ns0:w="2648" ns0:type="dxa"/>
-            <ns0:gridSpan ns0:val="2"/>
-            <ns0:tcBorders>
-              <ns0:top ns0:val="single" ns0:sz="4" ns0:space="0" ns0:color="auto"/>
-              <ns0:left ns0:val="single" ns0:sz="4" ns0:space="0" ns0:color="auto"/>
-              <ns0:bottom ns0:val="single" ns0:sz="4" ns0:space="0" ns0:color="auto"/>
-              <ns0:right ns0:val="single" ns0:sz="4" ns0:space="0" ns0:color="auto"/>
-            </ns0:tcBorders>
-            <ns0:shd ns0:val="clear" ns0:color="auto" ns0:fill="002060"/>
-            <ns0:vAlign ns0:val="center"/>
-          </ns0:tcPr>
-          <ns0:p ns2:paraId="3A16626C" ns2:textId="77777777" ns0:rsidR="003B0023" ns0:rsidRDefault="003B0023" ns0:rsidP="006D3A5C">
-            <ns0:pPr>
-              <ns0:keepNext/>
-              <ns0:keepLines/>
-              <ns0:suppressLineNumbers/>
-              <ns0:suppressAutoHyphens/>
-              <ns0:spacing ns0:after="0" ns0:line="256" ns0:lineRule="auto"/>
-              <ns0:jc ns0:val="center"/>
-              <ns0:rPr>
-                <ns0:rFonts ns0:ascii="Times New Roman" ns0:hAnsi="Times New Roman"/>
-                <ns0:b/>
-                <ns0:color ns0:val="FFFFFF"/>
-                <ns0:sz ns0:val="20"/>
-                <ns0:szCs ns0:val="20"/>
-              </ns0:rPr>
-            </ns0:pPr>
-            <ns0:r>
-              <ns0:rPr>
-                <ns0:rFonts ns0:ascii="Times New Roman" ns0:hAnsi="Times New Roman"/>
-                <ns0:b/>
-                <ns0:color ns0:val="FFFFFF"/>
-                <ns0:sz ns0:val="20"/>
-                <ns0:szCs ns0:val="20"/>
-              </ns0:rPr>
-              <ns0:t>DATA DA EMISSÃO DA TRATATIVA:</ns0:t>
-            </ns0:r>
-          </ns0:p>
-        </ns0:tc>
-      </ns0:tr>
-      <ns0:tr ns0:rsidR="003B0023" ns0:rsidRPr="003B0023" ns2:paraId="0BEA369F" ns2:textId="77777777" ns0:rsidTr="00967D7E">
-        <ns0:trPr>
-          <ns0:cantSplit/>
-          <ns0:trHeight ns0:val="623"/>
-          <ns0:jc ns0:val="center"/>
-        </ns0:trPr>
-        <ns0:tc>
-          <ns0:tcPr>
-            <ns0:tcW ns0:w="3667" ns0:type="dxa"/>
-            <ns0:gridSpan ns0:val="2"/>
-            <ns0:tcBorders>
-              <ns0:top ns0:val="single" ns0:sz="4" ns0:space="0" ns0:color="auto"/>
-              <ns0:left ns0:val="single" ns0:sz="4" ns0:space="0" ns0:color="auto"/>
-              <ns0:bottom ns0:val="single" ns0:sz="4" ns0:space="0" ns0:color="auto"/>
-              <ns0:right ns0:val="single" ns0:sz="4" ns0:space="0" ns0:color="auto"/>
-            </ns0:tcBorders>
-            <ns0:shd ns0:val="clear" ns0:color="auto" ns0:fill="FFFFFF"/>
-            <ns0:vAlign ns0:val="center"/>
-          </ns0:tcPr>
-          <ns0:p ns2:paraId="039424F1" ns2:textId="77777777" ns0:rsidR="003B0023" ns0:rsidRPr="003B0023" ns0:rsidRDefault="00967D7E" ns0:rsidP="003B0023">
-            <ns0:pPr>
-              <ns0:keepNext/>
-              <ns0:keepLines/>
-              <ns0:suppressLineNumbers/>
-              <ns0:suppressAutoHyphens/>
-              <ns0:spacing ns0:after="0" ns0:line="256" ns0:lineRule="auto"/>
-              <ns0:jc ns0:val="center"/>
-              <ns0:rPr>
-                <ns0:rFonts ns0:ascii="Times New Roman" ns0:hAnsi="Times New Roman"/>
-                <ns0:b/>
-                <ns0:sz ns0:val="20"/>
-                <ns0:szCs ns0:val="20"/>
-              </ns0:rPr>
-            </ns0:pPr>
-            <ns0:r ns0:rsidRPr="00967D7E">
-              <ns0:rPr>
-                <ns0:rFonts ns0:ascii="Times New Roman" ns0:hAnsi="Times New Roman"/>
-                <ns0:b/>
-                <ns0:sz ns0:val="20"/>
-                <ns0:szCs ns0:val="20"/>
-              </ns0:rPr>
-              <ns0:t>[NÚMERO_RNC]</ns0:t>
-            </ns0:r>
-          </ns0:p>
-        </ns0:tc>
-        <ns0:tc>
-          <ns0:tcPr>
-            <ns0:tcW ns0:w="3033" ns0:type="dxa"/>
-            <ns0:gridSpan ns0:val="3"/>
-            <ns0:tcBorders>
-              <ns0:top ns0:val="single" ns0:sz="4" ns0:space="0" ns0:color="auto"/>
-              <ns0:left ns0:val="single" ns0:sz="4" ns0:space="0" ns0:color="auto"/>
-              <ns0:bottom ns0:val="single" ns0:sz="4" ns0:space="0" ns0:color="auto"/>
-              <ns0:right ns0:val="single" ns0:sz="4" ns0:space="0" ns0:color="auto"/>
-            </ns0:tcBorders>
-            <ns0:shd ns0:val="clear" ns0:color="auto" ns0:fill="FFFFFF"/>
-            <ns0:vAlign ns0:val="center"/>
-          </ns0:tcPr>
-          <ns0:p ns2:paraId="6559DCA2" ns2:textId="77777777" ns0:rsidR="003B0023" ns0:rsidRPr="003B0023" ns0:rsidRDefault="00967D7E" ns0:rsidP="00967D7E">
-            <ns0:pPr>
-              <ns0:keepNext/>
-              <ns0:keepLines/>
-              <ns0:suppressLineNumbers/>
-              <ns0:suppressAutoHyphens/>
-              <ns0:spacing ns0:after="0" ns0:line="256" ns0:lineRule="auto"/>
-              <ns0:rPr>
-                <ns0:rFonts ns0:ascii="Times New Roman" ns0:hAnsi="Times New Roman"/>
-                <ns0:b/>
-                <ns0:sz ns0:val="20"/>
-                <ns0:szCs ns0:val="20"/>
-              </ns0:rPr>
-            </ns0:pPr>
-            <ns0:r ns0:rsidRPr="00967D7E">
-              <ns0:rPr>
-                <ns0:rFonts ns0:ascii="Times New Roman" ns0:hAnsi="Times New Roman"/>
-                <ns0:b/>
-                <ns0:sz ns0:val="20"/>
-                <ns0:szCs ns0:val="20"/>
-              </ns0:rPr>
-              <ns0:t>[DATA_EMISSÃO]</ns0:t>
-            </ns0:r>
-          </ns0:p>
-        </ns0:tc>
-        <ns0:tc>
-          <ns0:tcPr>
-            <ns0:tcW ns0:w="2648" ns0:type="dxa"/>
-            <ns0:gridSpan ns0:val="2"/>
-            <ns0:tcBorders>
-              <ns0:top ns0:val="single" ns0:sz="4" ns0:space="0" ns0:color="auto"/>
-              <ns0:left ns0:val="single" ns0:sz="4" ns0:space="0" ns0:color="auto"/>
-              <ns0:bottom ns0:val="single" ns0:sz="4" ns0:space="0" ns0:color="auto"/>
-              <ns0:right ns0:val="single" ns0:sz="4" ns0:space="0" ns0:color="auto"/>
-            </ns0:tcBorders>
-            <ns0:shd ns0:val="clear" ns0:color="auto" ns0:fill="FFFFFF"/>
-            <ns0:vAlign ns0:val="center"/>
-          </ns0:tcPr>
-          <ns0:p ns2:paraId="43721DB3" ns2:textId="77777777" ns0:rsidR="003B0023" ns0:rsidRPr="003B0023" ns0:rsidRDefault="00967D7E" ns0:rsidP="00967D7E">
-            <ns0:pPr>
-              <ns0:keepNext/>
-              <ns0:keepLines/>
-              <ns0:suppressLineNumbers/>
-              <ns0:suppressAutoHyphens/>
-              <ns0:spacing ns0:after="0" ns0:line="256" ns0:lineRule="auto"/>
-              <ns0:jc ns0:val="center"/>
-              <ns0:rPr>
-                <ns0:rFonts ns0:ascii="Times New Roman" ns0:hAnsi="Times New Roman"/>
-                <ns0:b/>
-                <ns0:sz ns0:val="20"/>
-                <ns0:szCs ns0:val="20"/>
-              </ns0:rPr>
-            </ns0:pPr>
-            <ns0:r ns0:rsidRPr="00967D7E">
-              <ns0:rPr>
-                <ns0:rFonts ns0:ascii="Times New Roman" ns0:hAnsi="Times New Roman"/>
-                <ns0:b/>
-                <ns0:sz ns0:val="20"/>
-                <ns0:szCs ns0:val="20"/>
-              </ns0:rPr>
-              <ns0:t>[DATA_HOJE]</ns0:t>
-            </ns0:r>
-          </ns0:p>
-        </ns0:tc>
-      </ns0:tr>
-      <ns0:tr ns0:rsidR="003B0023" ns0:rsidRPr="003B0023" ns2:paraId="533F04C7" ns2:textId="77777777" ns0:rsidTr="006D3A5C">
-        <ns0:trPr>
-          <ns0:cantSplit/>
-          <ns0:trHeight ns0:val="844"/>
-          <ns0:jc ns0:val="center"/>
-        </ns0:trPr>
-        <ns0:tc>
-          <ns0:tcPr>
-            <ns0:tcW ns0:w="5562" ns0:type="dxa"/>
-            <ns0:gridSpan ns0:val="4"/>
-            <ns0:tcBorders>
-              <ns0:top ns0:val="single" ns0:sz="4" ns0:space="0" ns0:color="auto"/>
-              <ns0:left ns0:val="single" ns0:sz="4" ns0:space="0" ns0:color="auto"/>
-              <ns0:bottom ns0:val="single" ns0:sz="4" ns0:space="0" ns0:color="auto"/>
-              <ns0:right ns0:val="single" ns0:sz="4" ns0:space="0" ns0:color="auto"/>
-            </ns0:tcBorders>
-            <ns0:hideMark/>
-          </ns0:tcPr>
-          <ns0:p ns2:paraId="333E1607" ns2:textId="77777777" ns0:rsidR="003B0023" ns0:rsidRPr="003B0023" ns0:rsidRDefault="003B0023" ns0:rsidP="003B0023">
-            <ns0:pPr>
-              <ns0:keepNext/>
-              <ns0:keepLines/>
-              <ns0:suppressLineNumbers/>
-              <ns0:suppressAutoHyphens/>
-              <ns0:spacing ns0:after="0" ns0:line="256" ns0:lineRule="auto"/>
-              <ns0:rPr>
-                <ns0:rFonts ns0:ascii="Times New Roman" ns0:hAnsi="Times New Roman"/>
-                <ns0:b/>
-                <ns0:sz ns0:val="20"/>
-                <ns0:szCs ns0:val="20"/>
-              </ns0:rPr>
-            </ns0:pPr>
-            <ns0:r>
-              <ns0:rPr>
-                <ns0:rFonts ns0:ascii="Times New Roman" ns0:hAnsi="Times New Roman"/>
-                <ns0:b/>
-                <ns0:sz ns0:val="20"/>
-                <ns0:szCs ns0:val="20"/>
-              </ns0:rPr>
-              <ns0:t>LOCAL/ FRENTE:</ns0:t>
-            </ns0:r>
-            <ns0:r ns0:rsidR="00967D7E">
-              <ns0:rPr>
-                <ns0:rFonts ns0:ascii="Times New Roman" ns0:hAnsi="Times New Roman"/>
-                <ns0:b/>
-                <ns0:sz ns0:val="20"/>
-                <ns0:szCs ns0:val="20"/>
-              </ns0:rPr>
-              <ns0:t xml:space="preserve"> </ns0:t>
-            </ns0:r>
-            <ns0:r ns0:rsidR="00967D7E" ns0:rsidRPr="00967D7E">
-              <ns0:rPr>
-                <ns0:rFonts ns0:ascii="Times New Roman" ns0:hAnsi="Times New Roman"/>
-                <ns0:b/>
-                <ns0:sz ns0:val="20"/>
-                <ns0:szCs ns0:val="20"/>
-              </ns0:rPr>
-              <ns0:t>[LOCAL/ FRENTE]</ns0:t>
-            </ns0:r>
-          </ns0:p>
-          <ns0:p ns2:paraId="6FDFE115" ns2:textId="77777777" ns0:rsidR="003B0023" ns0:rsidRPr="003B0023" ns0:rsidRDefault="003B0023" ns0:rsidP="003B0023">
-            <ns0:pPr>
-              <ns0:keepNext/>
-              <ns0:keepLines/>
-              <ns0:suppressLineNumbers/>
-              <ns0:suppressAutoHyphens/>
-              <ns0:spacing ns0:after="0" ns0:line="256" ns0:lineRule="auto"/>
-              <ns0:rPr>
-                <ns0:rFonts ns0:ascii="Times New Roman" ns0:hAnsi="Times New Roman"/>
-                <ns0:b/>
-                <ns0:sz ns0:val="20"/>
-                <ns0:szCs ns0:val="20"/>
-              </ns0:rPr>
-            </ns0:pPr>
-          </ns0:p>
-        </ns0:tc>
-        <ns0:tc>
-          <ns0:tcPr>
-            <ns0:tcW ns0:w="3786" ns0:type="dxa"/>
-            <ns0:gridSpan ns0:val="3"/>
-            <ns0:tcBorders>
-              <ns0:top ns0:val="single" ns0:sz="4" ns0:space="0" ns0:color="auto"/>
-              <ns0:left ns0:val="single" ns0:sz="4" ns0:space="0" ns0:color="auto"/>
-              <ns0:bottom ns0:val="single" ns0:sz="4" ns0:space="0" ns0:color="auto"/>
-              <ns0:right ns0:val="single" ns0:sz="4" ns0:space="0" ns0:color="auto"/>
-            </ns0:tcBorders>
-          </ns0:tcPr>
-          <ns0:p ns2:paraId="7ACADAF6" ns2:textId="77777777" ns0:rsidR="003B0023" ns0:rsidRPr="003B0023" ns0:rsidRDefault="003B0023" ns0:rsidP="00C41824">
-            <ns0:pPr>
-              <ns0:keepNext/>
-              <ns0:keepLines/>
-              <ns0:suppressLineNumbers/>
-              <ns0:suppressAutoHyphens/>
-              <ns0:spacing ns0:after="0" ns0:line="256" ns0:lineRule="auto"/>
-              <ns0:rPr>
-                <ns0:rFonts ns0:ascii="Times New Roman" ns0:hAnsi="Times New Roman"/>
-                <ns0:b/>
-                <ns0:sz ns0:val="20"/>
-                <ns0:szCs ns0:val="20"/>
-              </ns0:rPr>
-            </ns0:pPr>
-            <ns0:r>
-              <ns0:rPr>
-                <ns0:rFonts ns0:ascii="Times New Roman" ns0:hAnsi="Times New Roman"/>
-                <ns0:b/>
-                <ns0:sz ns0:val="20"/>
-                <ns0:szCs ns0:val="20"/>
-              </ns0:rPr>
-              <ns0:t>CONTRATO:</ns0:t>
-            </ns0:r>
-            <ns0:r ns0:rsidR="00967D7E">
-              <ns0:rPr>
-                <ns0:rFonts ns0:ascii="Times New Roman" ns0:hAnsi="Times New Roman"/>
-                <ns0:b/>
-                <ns0:sz ns0:val="20"/>
-                <ns0:szCs ns0:val="20"/>
-              </ns0:rPr>
-              <ns0:t xml:space="preserve"> </ns0:t>
-            </ns0:r>
-            <ns0:r ns0:rsidR="00967D7E" ns0:rsidRPr="00967D7E">
-              <ns0:rPr>
-                <ns0:rFonts ns0:ascii="Times New Roman" ns0:hAnsi="Times New Roman"/>
-                <ns0:b/>
-                <ns0:sz ns0:val="20"/>
-                <ns0:szCs ns0:val="20"/>
-              </ns0:rPr>
-              <ns0:t>[CONTRATO]</ns0:t>
-            </ns0:r>
-          </ns0:p>
-        </ns0:tc>
-      </ns0:tr>
-      <ns0:tr ns0:rsidR="003B0023" ns0:rsidRPr="003B0023" ns2:paraId="312BE020" ns2:textId="77777777" ns0:rsidTr="003B0023">
-        <ns0:trPr>
-          <ns0:cantSplit/>
-          <ns0:trHeight ns0:val="1134"/>
-          <ns0:jc ns0:val="center"/>
-        </ns0:trPr>
-        <ns0:tc>
-          <ns0:tcPr>
-            <ns0:tcW ns0:w="9348" ns0:type="dxa"/>
-            <ns0:gridSpan ns0:val="7"/>
-            <ns0:tcBorders>
-              <ns0:top ns0:val="single" ns0:sz="4" ns0:space="0" ns0:color="auto"/>
-              <ns0:left ns0:val="single" ns0:sz="4" ns0:space="0" ns0:color="auto"/>
-              <ns0:bottom ns0:val="single" ns0:sz="4" ns0:space="0" ns0:color="auto"/>
-              <ns0:right ns0:val="single" ns0:sz="4" ns0:space="0" ns0:color="auto"/>
-            </ns0:tcBorders>
-            <ns0:hideMark/>
-          </ns0:tcPr>
-          <ns0:p ns2:paraId="33A73869" ns2:textId="77777777" ns0:rsidR="003B0023" ns0:rsidRPr="003B0023" ns0:rsidRDefault="003B0023" ns0:rsidP="003B0023">
-            <ns0:pPr>
-              <ns0:keepNext/>
-              <ns0:keepLines/>
-              <ns0:suppressLineNumbers/>
-              <ns0:shd ns0:val="clear" ns0:color="auto" ns0:fill="FFFFFF"/>
-              <ns0:suppressAutoHyphens/>
-              <ns0:spacing ns0:after="0" ns0:line="256" ns0:lineRule="auto"/>
-              <ns0:rPr>
-                <ns0:rFonts ns0:ascii="Times New Roman" ns0:eastAsia="Times New Roman" ns0:hAnsi="Times New Roman"/>
-                <ns0:color ns0:val="000000"/>
-                <ns0:sz ns0:val="20"/>
-                <ns0:szCs ns0:val="20"/>
-                <ns0:lang ns0:eastAsia="pt-BR"/>
-              </ns0:rPr>
-            </ns0:pPr>
-            <ns0:r ns0:rsidRPr="003B0023">
-              <ns0:rPr>
-                <ns0:rFonts ns0:ascii="Times New Roman" ns0:hAnsi="Times New Roman"/>
-                <ns0:b/>
-                <ns0:sz ns0:val="20"/>
-                <ns0:szCs ns0:val="20"/>
-              </ns0:rPr>
-              <ns0:t>RESPONSÁVEL PELA ÁREA:</ns0:t>
-            </ns0:r>
-            <ns0:r ns0:rsidR="00967D7E">
-              <ns0:rPr>
-                <ns0:rFonts ns0:ascii="Times New Roman" ns0:hAnsi="Times New Roman"/>
-                <ns0:b/>
-                <ns0:sz ns0:val="20"/>
-                <ns0:szCs ns0:val="20"/>
-              </ns0:rPr>
-              <ns0:t xml:space="preserve"> </ns0:t>
-            </ns0:r>
-            <ns0:r ns0:rsidR="00967D7E" ns0:rsidRPr="00967D7E">
-              <ns0:rPr>
-                <ns0:rFonts ns0:ascii="Times New Roman" ns0:hAnsi="Times New Roman"/>
-                <ns0:b/>
-                <ns0:sz ns0:val="20"/>
-                <ns0:szCs ns0:val="20"/>
-              </ns0:rPr>
-              <ns0:t>[RESPONSÁVEL PELA ÁREA]</ns0:t>
-            </ns0:r>
-          </ns0:p>
-        </ns0:tc>
-      </ns0:tr>
-      <ns0:tr ns0:rsidR="003B0023" ns2:paraId="2A26EDF6" ns2:textId="77777777" ns0:rsidTr="007F5E4E">
-        <ns0:trPr>
-          <ns0:trHeight ns0:val="411"/>
-          <ns0:jc ns0:val="center"/>
-        </ns0:trPr>
-        <ns0:tc>
-          <ns0:tcPr>
-            <ns0:tcW ns0:w="9348" ns0:type="dxa"/>
-            <ns0:gridSpan ns0:val="7"/>
-            <ns0:tcBorders>
-              <ns0:top ns0:val="single" ns0:sz="4" ns0:space="0" ns0:color="auto"/>
-              <ns0:left ns0:val="single" ns0:sz="4" ns0:space="0" ns0:color="auto"/>
-              <ns0:bottom ns0:val="single" ns0:sz="4" ns0:space="0" ns0:color="auto"/>
-              <ns0:right ns0:val="single" ns0:sz="4" ns0:space="0" ns0:color="auto"/>
-            </ns0:tcBorders>
-            <ns0:shd ns0:val="clear" ns0:color="auto" ns0:fill="002060"/>
-            <ns0:vAlign ns0:val="center"/>
-            <ns0:hideMark/>
-          </ns0:tcPr>
-          <ns0:p ns2:paraId="7B41E624" ns2:textId="77777777" ns0:rsidR="003B0023" ns0:rsidRDefault="003B0023" ns0:rsidP="003B0023">
-            <ns0:pPr>
-              <ns0:keepNext/>
-              <ns0:keepLines/>
-              <ns0:suppressLineNumbers/>
-              <ns0:suppressAutoHyphens/>
-              <ns0:spacing ns0:after="0" ns0:line="256" ns0:lineRule="auto"/>
-              <ns0:jc ns0:val="center"/>
-              <ns0:rPr>
-                <ns0:rFonts ns0:ascii="Times New Roman" ns0:hAnsi="Times New Roman"/>
-                <ns0:b/>
-                <ns0:color ns0:val="FFFFFF"/>
-                <ns0:sz ns0:val="20"/>
-                <ns0:szCs ns0:val="20"/>
-              </ns0:rPr>
-            </ns0:pPr>
-            <ns0:r>
-              <ns0:rPr>
-                <ns0:rFonts ns0:ascii="Times New Roman" ns0:hAnsi="Times New Roman"/>
-                <ns0:b/>
-                <ns0:color ns0:val="FFFFFF"/>
-                <ns0:sz ns0:val="20"/>
-                <ns0:szCs ns0:val="20"/>
-              </ns0:rPr>
-              <ns0:t>TIPO DE OCORRÊNCIA</ns0:t>
-            </ns0:r>
-          </ns0:p>
-        </ns0:tc>
-      </ns0:tr>
-      <ns0:tr ns0:rsidR="003B0023" ns0:rsidRPr="003B0023" ns2:paraId="0CA7804F" ns2:textId="77777777" ns0:rsidTr="00F67F0E">
-        <ns0:trPr>
-          <ns0:trHeight ns0:val="425"/>
-          <ns0:jc ns0:val="center"/>
-        </ns0:trPr>
-        <ns0:tc>
-          <ns0:tcPr>
-            <ns0:tcW ns0:w="2337" ns0:type="dxa"/>
-            <ns0:tcBorders>
-              <ns0:top ns0:val="single" ns0:sz="4" ns0:space="0" ns0:color="auto"/>
-              <ns0:left ns0:val="single" ns0:sz="4" ns0:space="0" ns0:color="auto"/>
-              <ns0:bottom ns0:val="single" ns0:sz="4" ns0:space="0" ns0:color="auto"/>
-              <ns0:right ns0:val="single" ns0:sz="4" ns0:space="0" ns0:color="auto"/>
-            </ns0:tcBorders>
-            <ns0:vAlign ns0:val="center"/>
-          </ns0:tcPr>
-          <ns0:p ns2:paraId="3283CC03" ns2:textId="566A858A" ns0:rsidR="003B0023" ns0:rsidRPr="003B0023" ns0:rsidRDefault="00224B87" ns0:rsidP="001135B9">
-            <ns0:pPr>
-              <ns0:keepNext/>
-              <ns0:keepLines/>
-              <ns0:suppressLineNumbers/>
-              <ns0:suppressAutoHyphens/>
-              <ns0:spacing ns0:after="0" ns0:line="256" ns0:lineRule="auto"/>
-              <ns0:rPr>
-                <ns0:rFonts ns0:ascii="Times New Roman" ns0:hAnsi="Times New Roman"/>
-                <ns0:b/>
-                <ns0:sz ns0:val="20"/>
-                <ns0:szCs ns0:val="20"/>
-              </ns0:rPr>
-            </ns0:pPr>
-            <ns0:r>
-              <ns0:rPr>
-                <ns0:rFonts ns0:ascii="Times New Roman" ns0:hAnsi="Times New Roman"/>
-                <ns0:b/>
-                <ns0:noProof/>
-                <ns0:sz ns0:val="20"/>
-                <ns0:szCs ns0:val="20"/>
-              </ns0:rPr>
-              <ns1:AlternateContent>
-                <ns1:Choice Requires="wps">
-                  <ns0:drawing>
-                    <ns3:anchor distT="0" distB="0" distL="114300" distR="114300" simplePos="0" relativeHeight="251656192" behindDoc="0" locked="0" layoutInCell="1" allowOverlap="1" ns4:anchorId="76BF7F04" ns4:editId="09AD3F85">
-                      <ns3:simplePos x="0" y="0"/>
-                      <ns3:positionH relativeFrom="column">
-                        <ns3:posOffset>1148715</ns3:posOffset>
-                      </ns3:positionH>
-                      <ns3:positionV relativeFrom="paragraph">
-                        <ns3:posOffset>19050</ns3:posOffset>
-                      </ns3:positionV>
-                      <ns3:extent cx="195580" cy="140335"/>
-                      <ns3:effectExtent l="8255" t="8255" r="5715" b="13335"/>
-                      <ns3:wrapNone/>
-                      <ns3:docPr id="1557458591" name="AutoShape 18"/>
-                      <ns3:cNvGraphicFramePr>
-                        <ns5:graphicFrameLocks/>
-                      </ns3:cNvGraphicFramePr>
-                      <ns5:graphic>
-                        <ns5:graphicData uri="http://schemas.microsoft.com/office/word/2010/wordprocessingShape">
-                          <ns6:wsp>
-                            <ns6:cNvSpPr>
-                              <ns5:spLocks noChangeArrowheads="1"/>
-                            </ns6:cNvSpPr>
-                            <ns6:spPr bwMode="auto">
-                              <ns5:xfrm>
-                                <ns5:off x="0" y="0"/>
-                                <ns5:ext cx="195580" cy="140335"/>
-                              </ns5:xfrm>
-                              <ns5:prstGeom prst="roundRect">
-                                <ns5:avLst>
-                                  <ns5:gd name="adj" fmla="val 16667"/>
-                                </ns5:avLst>
-                              </ns5:prstGeom>
-                              <ns5:noFill/>
-                              <ns5:ln w="9525">
-                                <ns5:solidFill>
-                                  <ns5:srgbClr val="196B24"/>
-                                </ns5:solidFill>
-                                <ns5:round/>
-                                <ns5:headEnd/>
-                                <ns5:tailEnd/>
-                              </ns5:ln>
-                              <ns5:effectLst/>
-                              <ns5:extLst>
-                                <ns5:ext uri="{909E8E84-426E-40DD-AFC4-6F175D3DCCD1}">
-                                  <ns7:hiddenFill>
-                                    <ns5:solidFill>
-                                      <ns5:srgbClr val="FFFFFF"/>
-                                    </ns5:solidFill>
-                                  </ns7:hiddenFill>
-                                </ns5:ext>
-                                <ns5:ext uri="{AF507438-7753-43E0-B8FC-AC1667EBCBE1}">
-                                  <ns7:hiddenEffects>
-                                    <ns5:effectLst>
-                                      <ns5:outerShdw dist="35921" dir="2700000" algn="ctr" rotWithShape="0">
-                                        <ns5:srgbClr val="868686"/>
-                                      </ns5:outerShdw>
-                                    </ns5:effectLst>
-                                  </ns7:hiddenEffects>
-                                </ns5:ext>
-                              </ns5:extLst>
-                            </ns6:spPr>
-                            <ns6:bodyPr rot="0" vert="horz" wrap="square" lIns="91440" tIns="45720" rIns="91440" bIns="45720" anchor="t" anchorCtr="0" upright="1">
-                              <ns5:noAutofit/>
-                            </ns6:bodyPr>
-                          </ns6:wsp>
-                        </ns5:graphicData>
-                      </ns5:graphic>
-                      <ns4:sizeRelH relativeFrom="page">
-                        <ns4:pctWidth>0</ns4:pctWidth>
-                      </ns4:sizeRelH>
-                      <ns4:sizeRelV relativeFrom="page">
-                        <ns4:pctHeight>0</ns4:pctHeight>
-                      </ns4:sizeRelV>
-                    </ns3:anchor>
-                  </ns0:drawing>
-                </ns1:Choice>
-                <ns1:Fallback>
-                  <ns0:pict>
-                    <ns8:roundrect ns2:anchorId="2EBDF774" id="AutoShape 18" ns9:spid="_x0000_s1026" style="position:absolute;margin-left:90.45pt;margin-top:1.5pt;width:15.4pt;height:11.05pt;z-index:251656192;visibility:visible;mso-wrap-style:square;mso-width-percent:0;mso-height-percent:0;mso-wrap-distance-left:9pt;mso-wrap-distance-top:0;mso-wrap-distance-right:9pt;mso-wrap-distance-bottom:0;mso-position-horizontal:absolute;mso-position-horizontal-relative:text;mso-position-vertical:absolute;mso-position-vertical-relative:text;mso-width-percent:0;mso-height-percent:0;mso-width-relative:page;mso-height-relative:page;v-text-anchor:top" arcsize="10923f" ns9:gfxdata="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" filled="f" strokecolor="#196b24">
-                      <ns8:shadow color="#868686"/>
-                    </ns8:roundrect>
-                  </ns0:pict>
-                </ns1:Fallback>
-              </ns1:AlternateContent>
-            </ns0:r>
-            <ns0:r ns0:rsidR="003B0023">
-              <ns0:rPr>
-                <ns0:rFonts ns0:ascii="Times New Roman" ns0:hAnsi="Times New Roman"/>
-                <ns0:b/>
-                <ns0:sz ns0:val="20"/>
-                <ns0:szCs ns0:val="20"/>
-              </ns0:rPr>
-              <ns0:t>MEIO AMBIENTE</ns0:t>
-            </ns0:r>
-            <ns0:r ns0:rsidR="0013288F">
-              <ns0:rPr>
-                <ns0:rFonts ns0:ascii="Times New Roman" ns0:hAnsi="Times New Roman"/>
-                <ns0:b/>
-                <ns0:sz ns0:val="20"/>
-                <ns0:szCs ns0:val="20"/>
-              </ns0:rPr>
-              <ns0:t>:</ns0:t>
-            </ns0:r>
-          </ns0:p>
-        </ns0:tc>
-        <ns0:tc>
-          <ns0:tcPr>
-            <ns0:tcW ns0:w="3100" ns0:type="dxa"/>
-            <ns0:gridSpan ns0:val="2"/>
-            <ns0:tcBorders>
-              <ns0:top ns0:val="single" ns0:sz="4" ns0:space="0" ns0:color="auto"/>
-              <ns0:left ns0:val="single" ns0:sz="4" ns0:space="0" ns0:color="auto"/>
-              <ns0:bottom ns0:val="single" ns0:sz="4" ns0:space="0" ns0:color="auto"/>
-              <ns0:right ns0:val="single" ns0:sz="4" ns0:space="0" ns0:color="auto"/>
-            </ns0:tcBorders>
-            <ns0:vAlign ns0:val="center"/>
-          </ns0:tcPr>
-          <ns0:p ns2:paraId="05365A2C" ns2:textId="66C6E180" ns0:rsidR="003B0023" ns0:rsidRPr="003B0023" ns0:rsidRDefault="00224B87" ns0:rsidP="001135B9">
-            <ns0:pPr>
-              <ns0:keepNext/>
-              <ns0:keepLines/>
-              <ns0:suppressLineNumbers/>
-              <ns0:suppressAutoHyphens/>
-              <ns0:spacing ns0:after="0" ns0:line="256" ns0:lineRule="auto"/>
-              <ns0:rPr>
-                <ns0:rFonts ns0:ascii="Times New Roman" ns0:hAnsi="Times New Roman"/>
-                <ns0:b/>
-                <ns0:sz ns0:val="20"/>
-                <ns0:szCs ns0:val="20"/>
-              </ns0:rPr>
-            </ns0:pPr>
-            <ns0:r>
-              <ns0:rPr>
-                <ns0:rFonts ns0:ascii="Times New Roman" ns0:hAnsi="Times New Roman"/>
-                <ns0:b/>
-                <ns0:noProof/>
-                <ns0:sz ns0:val="20"/>
-                <ns0:szCs ns0:val="20"/>
-              </ns0:rPr>
-              <ns1:AlternateContent>
-                <ns1:Choice Requires="wps">
-                  <ns0:drawing>
-                    <ns3:anchor distT="0" distB="0" distL="114300" distR="114300" simplePos="0" relativeHeight="251657216" behindDoc="0" locked="0" layoutInCell="1" allowOverlap="1" ns4:anchorId="2B78AE7F" ns4:editId="71DA8255">
-                      <ns3:simplePos x="0" y="0"/>
-                      <ns3:positionH relativeFrom="column">
-                        <ns3:posOffset>1858645</ns3:posOffset>
-                      </ns3:positionH>
-                      <ns3:positionV relativeFrom="paragraph">
-                        <ns3:posOffset>15240</ns3:posOffset>
-                      </ns3:positionV>
-                      <ns3:extent cx="195580" cy="140335"/>
-                      <ns3:effectExtent l="10795" t="13970" r="12700" b="7620"/>
-                      <ns3:wrapNone/>
-                      <ns3:docPr id="801053956" name="AutoShape 19"/>
-                      <ns3:cNvGraphicFramePr>
-                        <ns5:graphicFrameLocks/>
-                      </ns3:cNvGraphicFramePr>
-                      <ns5:graphic>
-                        <ns5:graphicData uri="http://schemas.microsoft.com/office/word/2010/wordprocessingShape">
-                          <ns6:wsp>
-                            <ns6:cNvSpPr>
-                              <ns5:spLocks noChangeArrowheads="1"/>
-                            </ns6:cNvSpPr>
-                            <ns6:spPr bwMode="auto">
-                              <ns5:xfrm>
-                                <ns5:off x="0" y="0"/>
-                                <ns5:ext cx="195580" cy="140335"/>
-                              </ns5:xfrm>
-                              <ns5:prstGeom prst="roundRect">
-                                <ns5:avLst>
-                                  <ns5:gd name="adj" fmla="val 16667"/>
-                                </ns5:avLst>
-                              </ns5:prstGeom>
-                              <ns5:noFill/>
-                              <ns5:ln w="9525">
-                                <ns5:solidFill>
-                                  <ns5:srgbClr val="196B24"/>
-                                </ns5:solidFill>
-                                <ns5:round/>
-                                <ns5:headEnd/>
-                                <ns5:tailEnd/>
-                              </ns5:ln>
-                              <ns5:effectLst/>
-                              <ns5:extLst>
-                                <ns5:ext uri="{909E8E84-426E-40DD-AFC4-6F175D3DCCD1}">
-                                  <ns7:hiddenFill>
-                                    <ns5:solidFill>
-                                      <ns5:srgbClr val="FFFFFF"/>
-                                    </ns5:solidFill>
-                                  </ns7:hiddenFill>
-                                </ns5:ext>
-                                <ns5:ext uri="{AF507438-7753-43E0-B8FC-AC1667EBCBE1}">
-                                  <ns7:hiddenEffects>
-                                    <ns5:effectLst>
-                                      <ns5:outerShdw dist="35921" dir="2700000" algn="ctr" rotWithShape="0">
-                                        <ns5:srgbClr val="868686"/>
-                                      </ns5:outerShdw>
-                                    </ns5:effectLst>
-                                  </ns7:hiddenEffects>
-                                </ns5:ext>
-                              </ns5:extLst>
-                            </ns6:spPr>
-                            <ns6:bodyPr rot="0" vert="horz" wrap="square" lIns="91440" tIns="45720" rIns="91440" bIns="45720" anchor="t" anchorCtr="0" upright="1">
-                              <ns5:noAutofit/>
-                            </ns6:bodyPr>
-                          </ns6:wsp>
-                        </ns5:graphicData>
-                      </ns5:graphic>
-                      <ns4:sizeRelH relativeFrom="page">
-                        <ns4:pctWidth>0</ns4:pctWidth>
-                      </ns4:sizeRelH>
-                      <ns4:sizeRelV relativeFrom="page">
-                        <ns4:pctHeight>0</ns4:pctHeight>
-                      </ns4:sizeRelV>
-                    </ns3:anchor>
-                  </ns0:drawing>
-                </ns1:Choice>
-                <ns1:Fallback>
-                  <ns0:pict>
-                    <ns8:roundrect ns2:anchorId="33B94A96" id="AutoShape 19" ns9:spid="_x0000_s1026" style="position:absolute;margin-left:146.35pt;margin-top:1.2pt;width:15.4pt;height:11.05pt;z-index:251657216;visibility:visible;mso-wrap-style:square;mso-width-percent:0;mso-height-percent:0;mso-wrap-distance-left:9pt;mso-wrap-distance-top:0;mso-wrap-distance-right:9pt;mso-wrap-distance-bottom:0;mso-position-horizontal:absolute;mso-position-horizontal-relative:text;mso-position-vertical:absolute;mso-position-vertical-relative:text;mso-width-percent:0;mso-height-percent:0;mso-width-relative:page;mso-height-relative:page;v-text-anchor:top" arcsize="10923f" ns9:gfxdata="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" filled="f" strokecolor="#196b24">
-                      <ns8:shadow color="#868686"/>
-                    </ns8:roundrect>
-                  </ns0:pict>
-                </ns1:Fallback>
-              </ns1:AlternateContent>
-            </ns0:r>
-            <ns0:r ns0:rsidR="003B0023">
-              <ns0:rPr>
-                <ns0:rFonts ns0:ascii="Times New Roman" ns0:hAnsi="Times New Roman"/>
-                <ns0:b/>
-                <ns0:sz ns0:val="20"/>
-                <ns0:szCs ns0:val="20"/>
-              </ns0:rPr>
-              <ns0:t>SEGURANÇA DO TRABALHO</ns0:t>
-            </ns0:r>
-            <ns0:r ns0:rsidR="0013288F">
-              <ns0:rPr>
-                <ns0:rFonts ns0:ascii="Times New Roman" ns0:hAnsi="Times New Roman"/>
-                <ns0:b/>
-                <ns0:sz ns0:val="20"/>
-                <ns0:szCs ns0:val="20"/>
-              </ns0:rPr>
-              <ns0:t>:</ns0:t>
-            </ns0:r>
-          </ns0:p>
-        </ns0:tc>
-        <ns0:tc>
-          <ns0:tcPr>
-            <ns0:tcW ns0:w="2022" ns0:type="dxa"/>
-            <ns0:gridSpan ns0:val="3"/>
-            <ns0:tcBorders>
-              <ns0:top ns0:val="single" ns0:sz="4" ns0:space="0" ns0:color="auto"/>
-              <ns0:left ns0:val="single" ns0:sz="4" ns0:space="0" ns0:color="auto"/>
-              <ns0:bottom ns0:val="single" ns0:sz="4" ns0:space="0" ns0:color="auto"/>
-              <ns0:right ns0:val="single" ns0:sz="4" ns0:space="0" ns0:color="auto"/>
-            </ns0:tcBorders>
-            <ns0:vAlign ns0:val="center"/>
-          </ns0:tcPr>
-          <ns0:p ns2:paraId="112DFD9D" ns2:textId="273B4A5E" ns0:rsidR="003B0023" ns0:rsidRPr="003B0023" ns0:rsidRDefault="00224B87" ns0:rsidP="001135B9">
-            <ns0:pPr>
-              <ns0:keepNext/>
-              <ns0:keepLines/>
-              <ns0:suppressLineNumbers/>
-              <ns0:suppressAutoHyphens/>
-              <ns0:spacing ns0:after="0" ns0:line="256" ns0:lineRule="auto"/>
-              <ns0:rPr>
-                <ns0:rFonts ns0:ascii="Times New Roman" ns0:hAnsi="Times New Roman"/>
-                <ns0:b/>
-                <ns0:sz ns0:val="20"/>
-                <ns0:szCs ns0:val="20"/>
-              </ns0:rPr>
-            </ns0:pPr>
-            <ns0:r>
-              <ns0:rPr>
-                <ns0:rFonts ns0:ascii="Times New Roman" ns0:hAnsi="Times New Roman"/>
-                <ns0:b/>
-                <ns0:noProof/>
-                <ns0:sz ns0:val="20"/>
-                <ns0:szCs ns0:val="20"/>
-              </ns0:rPr>
-              <ns1:AlternateContent>
-                <ns1:Choice Requires="wps">
-                  <ns0:drawing>
-                    <ns3:anchor distT="0" distB="0" distL="114300" distR="114300" simplePos="0" relativeHeight="251658240" behindDoc="0" locked="0" layoutInCell="1" allowOverlap="1" ns4:anchorId="4FCB034B" ns4:editId="4842015E">
-                      <ns3:simplePos x="0" y="0"/>
-                      <ns3:positionH relativeFrom="column">
-                        <ns3:posOffset>964565</ns3:posOffset>
-                      </ns3:positionH>
-                      <ns3:positionV relativeFrom="paragraph">
-                        <ns3:posOffset>15240</ns3:posOffset>
-                      </ns3:positionV>
-                      <ns3:extent cx="195580" cy="140335"/>
-                      <ns3:effectExtent l="10160" t="13970" r="13335" b="7620"/>
-                      <ns3:wrapNone/>
-                      <ns3:docPr id="1760387860" name="AutoShape 20"/>
-                      <ns3:cNvGraphicFramePr>
-                        <ns5:graphicFrameLocks/>
-                      </ns3:cNvGraphicFramePr>
-                      <ns5:graphic>
-                        <ns5:graphicData uri="http://schemas.microsoft.com/office/word/2010/wordprocessingShape">
-                          <ns6:wsp>
-                            <ns6:cNvSpPr>
-                              <ns5:spLocks noChangeArrowheads="1"/>
-                            </ns6:cNvSpPr>
-                            <ns6:spPr bwMode="auto">
-                              <ns5:xfrm>
-                                <ns5:off x="0" y="0"/>
-                                <ns5:ext cx="195580" cy="140335"/>
-                              </ns5:xfrm>
-                              <ns5:prstGeom prst="roundRect">
-                                <ns5:avLst>
-                                  <ns5:gd name="adj" fmla="val 16667"/>
-                                </ns5:avLst>
-                              </ns5:prstGeom>
-                              <ns5:noFill/>
-                              <ns5:ln w="9525">
-                                <ns5:solidFill>
-                                  <ns5:srgbClr val="196B24"/>
-                                </ns5:solidFill>
-                                <ns5:round/>
-                                <ns5:headEnd/>
-                                <ns5:tailEnd/>
-                              </ns5:ln>
-                              <ns5:effectLst/>
-                              <ns5:extLst>
-                                <ns5:ext uri="{909E8E84-426E-40DD-AFC4-6F175D3DCCD1}">
-                                  <ns7:hiddenFill>
-                                    <ns5:solidFill>
-                                      <ns5:srgbClr val="FFFFFF"/>
-                                    </ns5:solidFill>
-                                  </ns7:hiddenFill>
-                                </ns5:ext>
-                                <ns5:ext uri="{AF507438-7753-43E0-B8FC-AC1667EBCBE1}">
-                                  <ns7:hiddenEffects>
-                                    <ns5:effectLst>
-                                      <ns5:outerShdw dist="35921" dir="2700000" algn="ctr" rotWithShape="0">
-                                        <ns5:srgbClr val="868686"/>
-                                      </ns5:outerShdw>
-                                    </ns5:effectLst>
-                                  </ns7:hiddenEffects>
-                                </ns5:ext>
-                              </ns5:extLst>
-                            </ns6:spPr>
-                            <ns6:bodyPr rot="0" vert="horz" wrap="square" lIns="91440" tIns="45720" rIns="91440" bIns="45720" anchor="t" anchorCtr="0" upright="1">
-                              <ns5:noAutofit/>
-                            </ns6:bodyPr>
-                          </ns6:wsp>
-                        </ns5:graphicData>
-                      </ns5:graphic>
-                      <ns4:sizeRelH relativeFrom="page">
-                        <ns4:pctWidth>0</ns4:pctWidth>
-                      </ns4:sizeRelH>
-                      <ns4:sizeRelV relativeFrom="page">
-                        <ns4:pctHeight>0</ns4:pctHeight>
-                      </ns4:sizeRelV>
-                    </ns3:anchor>
-                  </ns0:drawing>
-                </ns1:Choice>
-                <ns1:Fallback>
-                  <ns0:pict>
-                    <ns8:roundrect ns2:anchorId="22AEBB71" id="AutoShape 20" ns9:spid="_x0000_s1026" style="position:absolute;margin-left:75.95pt;margin-top:1.2pt;width:15.4pt;height:11.05pt;z-index:251658240;visibility:visible;mso-wrap-style:square;mso-width-percent:0;mso-height-percent:0;mso-wrap-distance-left:9pt;mso-wrap-distance-top:0;mso-wrap-distance-right:9pt;mso-wrap-distance-bottom:0;mso-position-horizontal:absolute;mso-position-horizontal-relative:text;mso-position-vertical:absolute;mso-position-vertical-relative:text;mso-width-percent:0;mso-height-percent:0;mso-width-relative:page;mso-height-relative:page;v-text-anchor:top" arcsize="10923f" ns9:gfxdata="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" filled="f" strokecolor="#196b24">
-                      <ns8:shadow color="#868686"/>
-                    </ns8:roundrect>
-                  </ns0:pict>
-                </ns1:Fallback>
-              </ns1:AlternateContent>
-            </ns0:r>
-            <ns0:r ns0:rsidR="003B0023">
-              <ns0:rPr>
-                <ns0:rFonts ns0:ascii="Times New Roman" ns0:hAnsi="Times New Roman"/>
-                <ns0:b/>
-                <ns0:sz ns0:val="20"/>
-                <ns0:szCs ns0:val="20"/>
-              </ns0:rPr>
-              <ns0:t>ENGENHARIA</ns0:t>
-            </ns0:r>
-            <ns0:r ns0:rsidR="0013288F">
-              <ns0:rPr>
-                <ns0:rFonts ns0:ascii="Times New Roman" ns0:hAnsi="Times New Roman"/>
-                <ns0:b/>
-                <ns0:sz ns0:val="20"/>
-                <ns0:szCs ns0:val="20"/>
-              </ns0:rPr>
-              <ns0:t>:</ns0:t>
-            </ns0:r>
-          </ns0:p>
-        </ns0:tc>
-        <ns0:tc>
-          <ns0:tcPr>
-            <ns0:tcW ns0:w="1889" ns0:type="dxa"/>
-            <ns0:tcBorders>
-              <ns0:top ns0:val="single" ns0:sz="4" ns0:space="0" ns0:color="auto"/>
-              <ns0:left ns0:val="single" ns0:sz="4" ns0:space="0" ns0:color="auto"/>
-              <ns0:bottom ns0:val="single" ns0:sz="4" ns0:space="0" ns0:color="auto"/>
-              <ns0:right ns0:val="single" ns0:sz="4" ns0:space="0" ns0:color="auto"/>
-            </ns0:tcBorders>
-            <ns0:vAlign ns0:val="center"/>
-          </ns0:tcPr>
-          <ns0:p ns2:paraId="2C672948" ns2:textId="52FED1F8" ns0:rsidR="003B0023" ns0:rsidRPr="003B0023" ns0:rsidRDefault="00224B87" ns0:rsidP="001135B9">
-            <ns0:pPr>
-              <ns0:keepNext/>
-              <ns0:keepLines/>
-              <ns0:suppressLineNumbers/>
-              <ns0:suppressAutoHyphens/>
-              <ns0:spacing ns0:after="0" ns0:line="256" ns0:lineRule="auto"/>
-              <ns0:rPr>
-                <ns0:rFonts ns0:ascii="Times New Roman" ns0:hAnsi="Times New Roman"/>
-                <ns0:b/>
-                <ns0:sz ns0:val="20"/>
-                <ns0:szCs ns0:val="20"/>
-              </ns0:rPr>
-            </ns0:pPr>
-            <ns0:r>
-              <ns0:rPr>
-                <ns0:rFonts ns0:ascii="Times New Roman" ns0:hAnsi="Times New Roman"/>
-                <ns0:b/>
-                <ns0:noProof/>
-                <ns0:sz ns0:val="20"/>
-                <ns0:szCs ns0:val="20"/>
-              </ns0:rPr>
-              <ns1:AlternateContent>
-                <ns1:Choice Requires="wps">
-                  <ns0:drawing>
-                    <ns3:anchor distT="0" distB="0" distL="114300" distR="114300" simplePos="0" relativeHeight="251659264" behindDoc="0" locked="0" layoutInCell="1" allowOverlap="1" ns4:anchorId="3A4A4730" ns4:editId="1DD36CBA">
-                      <ns3:simplePos x="0" y="0"/>
-                      <ns3:positionH relativeFrom="column">
-                        <ns3:posOffset>567690</ns3:posOffset>
-                      </ns3:positionH>
-                      <ns3:positionV relativeFrom="paragraph">
-                        <ns3:posOffset>24765</ns3:posOffset>
-                      </ns3:positionV>
-                      <ns3:extent cx="195580" cy="140335"/>
-                      <ns3:effectExtent l="5715" t="13970" r="8255" b="7620"/>
-                      <ns3:wrapNone/>
-                      <ns3:docPr id="476071933" name="AutoShape 21"/>
-                      <ns3:cNvGraphicFramePr>
-                        <ns5:graphicFrameLocks/>
-                      </ns3:cNvGraphicFramePr>
-                      <ns5:graphic>
-                        <ns5:graphicData uri="http://schemas.microsoft.com/office/word/2010/wordprocessingShape">
-                          <ns6:wsp>
-                            <ns6:cNvSpPr>
-                              <ns5:spLocks noChangeArrowheads="1"/>
-                            </ns6:cNvSpPr>
-                            <ns6:spPr bwMode="auto">
-                              <ns5:xfrm>
-                                <ns5:off x="0" y="0"/>
-                                <ns5:ext cx="195580" cy="140335"/>
-                              </ns5:xfrm>
-                              <ns5:prstGeom prst="roundRect">
-                                <ns5:avLst>
-                                  <ns5:gd name="adj" fmla="val 16667"/>
-                                </ns5:avLst>
-                              </ns5:prstGeom>
-                              <ns5:noFill/>
-                              <ns5:ln w="9525">
-                                <ns5:solidFill>
-                                  <ns5:srgbClr val="196B24"/>
-                                </ns5:solidFill>
-                                <ns5:round/>
-                                <ns5:headEnd/>
-                                <ns5:tailEnd/>
-                              </ns5:ln>
-                              <ns5:effectLst/>
-                              <ns5:extLst>
-                                <ns5:ext uri="{909E8E84-426E-40DD-AFC4-6F175D3DCCD1}">
-                                  <ns7:hiddenFill>
-                                    <ns5:solidFill>
-                                      <ns5:srgbClr val="FFFFFF"/>
-                                    </ns5:solidFill>
-                                  </ns7:hiddenFill>
-                                </ns5:ext>
-                                <ns5:ext uri="{AF507438-7753-43E0-B8FC-AC1667EBCBE1}">
-                                  <ns7:hiddenEffects>
-                                    <ns5:effectLst>
-                                      <ns5:outerShdw dist="35921" dir="2700000" algn="ctr" rotWithShape="0">
-                                        <ns5:srgbClr val="868686"/>
-                                      </ns5:outerShdw>
-                                    </ns5:effectLst>
-                                  </ns7:hiddenEffects>
-                                </ns5:ext>
-                              </ns5:extLst>
-                            </ns6:spPr>
-                            <ns6:bodyPr rot="0" vert="horz" wrap="square" lIns="91440" tIns="45720" rIns="91440" bIns="45720" anchor="t" anchorCtr="0" upright="1">
-                              <ns5:noAutofit/>
-                            </ns6:bodyPr>
-                          </ns6:wsp>
-                        </ns5:graphicData>
-                      </ns5:graphic>
-                      <ns4:sizeRelH relativeFrom="page">
-                        <ns4:pctWidth>0</ns4:pctWidth>
-                      </ns4:sizeRelH>
-                      <ns4:sizeRelV relativeFrom="page">
-                        <ns4:pctHeight>0</ns4:pctHeight>
-                      </ns4:sizeRelV>
-                    </ns3:anchor>
-                  </ns0:drawing>
-                </ns1:Choice>
-                <ns1:Fallback>
-                  <ns0:pict>
-                    <ns8:roundrect ns2:anchorId="0C1EC122" id="AutoShape 21" ns9:spid="_x0000_s1026" style="position:absolute;margin-left:44.7pt;margin-top:1.95pt;width:15.4pt;height:11.05pt;z-index:251659264;visibility:visible;mso-wrap-style:square;mso-width-percent:0;mso-height-percent:0;mso-wrap-distance-left:9pt;mso-wrap-distance-top:0;mso-wrap-distance-right:9pt;mso-wrap-distance-bottom:0;mso-position-horizontal:absolute;mso-position-horizontal-relative:text;mso-position-vertical:absolute;mso-position-vertical-relative:text;mso-width-percent:0;mso-height-percent:0;mso-width-relative:page;mso-height-relative:page;v-text-anchor:top" arcsize="10923f" ns9:gfxdata="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" filled="f" strokecolor="#196b24">
-                      <ns8:shadow color="#868686"/>
-                    </ns8:roundrect>
-                  </ns0:pict>
-                </ns1:Fallback>
-              </ns1:AlternateContent>
-            </ns0:r>
-            <ns0:r ns0:rsidR="003B0023">
-              <ns0:rPr>
-                <ns0:rFonts ns0:ascii="Times New Roman" ns0:hAnsi="Times New Roman"/>
-                <ns0:b/>
-                <ns0:sz ns0:val="20"/>
-                <ns0:szCs ns0:val="20"/>
-              </ns0:rPr>
-              <ns0:t>SOCIAL</ns0:t>
-            </ns0:r>
-            <ns0:r ns0:rsidR="0013288F">
-              <ns0:rPr>
-                <ns0:rFonts ns0:ascii="Times New Roman" ns0:hAnsi="Times New Roman"/>
-                <ns0:b/>
-                <ns0:sz ns0:val="20"/>
-                <ns0:szCs ns0:val="20"/>
-              </ns0:rPr>
-              <ns0:t>:</ns0:t>
-            </ns0:r>
-          </ns0:p>
-        </ns0:tc>
-      </ns0:tr>
-      <ns0:tr ns0:rsidR="001135B9" ns0:rsidRPr="003B0023" ns2:paraId="2EDC64C6" ns2:textId="77777777" ns0:rsidTr="001135B9">
-        <ns0:trPr>
-          <ns0:cantSplit/>
-          <ns0:trHeight ns0:val="1977"/>
-          <ns0:jc ns0:val="center"/>
-        </ns0:trPr>
-        <ns0:tc>
-          <ns0:tcPr>
-            <ns0:tcW ns0:w="9348" ns0:type="dxa"/>
-            <ns0:gridSpan ns0:val="7"/>
-            <ns0:tcBorders>
-              <ns0:top ns0:val="single" ns0:sz="4" ns0:space="0" ns0:color="auto"/>
-              <ns0:left ns0:val="single" ns0:sz="4" ns0:space="0" ns0:color="auto"/>
-              <ns0:bottom ns0:val="single" ns0:sz="4" ns0:space="0" ns0:color="auto"/>
-              <ns0:right ns0:val="single" ns0:sz="4" ns0:space="0" ns0:color="auto"/>
-            </ns0:tcBorders>
-            <ns0:hideMark/>
-          </ns0:tcPr>
-          <ns0:p ns2:paraId="10F1FF50" ns2:textId="77777777" ns0:rsidR="001135B9" ns0:rsidRPr="003B0023" ns0:rsidRDefault="001135B9" ns0:rsidP="0013288F">
-            <ns0:pPr>
-              <ns0:keepNext/>
-              <ns0:keepLines/>
-              <ns0:suppressLineNumbers/>
-              <ns0:suppressAutoHyphens/>
-              <ns0:spacing ns0:before="240" ns0:after="0" ns0:line="256" ns0:lineRule="auto"/>
-              <ns0:rPr>
-                <ns0:rFonts ns0:ascii="Times New Roman" ns0:hAnsi="Times New Roman"/>
-                <ns0:b/>
-                <ns0:sz ns0:val="20"/>
-                <ns0:szCs ns0:val="20"/>
-              </ns0:rPr>
-            </ns0:pPr>
-            <ns0:r ns0:rsidRPr="003B0023">
-              <ns0:rPr>
-                <ns0:rFonts ns0:ascii="Times New Roman" ns0:eastAsia="Times New Roman" ns0:hAnsi="Times New Roman"/>
-                <ns0:b/>
-                <ns0:color ns0:val="000000"/>
-                <ns0:sz ns0:val="20"/>
-                <ns0:szCs ns0:val="20"/>
-                <ns0:lang ns0:eastAsia="pt-BR"/>
-              </ns0:rPr>
-              <ns0:t>ANÁLISE DA OCORRÊNCIA</ns0:t>
-            </ns0:r>
-            <ns0:r>
-              <ns0:rPr>
-                <ns0:rFonts ns0:ascii="Times New Roman" ns0:eastAsia="Times New Roman" ns0:hAnsi="Times New Roman"/>
-                <ns0:b/>
-                <ns0:color ns0:val="000000"/>
-                <ns0:sz ns0:val="20"/>
-                <ns0:szCs ns0:val="20"/>
-                <ns0:lang ns0:eastAsia="pt-BR"/>
-              </ns0:rPr>
-              <ns0:t>:</ns0:t>
-            </ns0:r>
-            <ns0:r ns0:rsidR="00967D7E" ns0:rsidRPr="00967D7E">
-              <ns0:t xml:space="preserve"> </ns0:t>
-            </ns0:r>
-            <ns0:r ns0:rsidR="00967D7E" ns0:rsidRPr="00967D7E">
-              <ns0:rPr>
-                <ns0:rFonts ns0:ascii="Times New Roman" ns0:eastAsia="Times New Roman" ns0:hAnsi="Times New Roman"/>
-                <ns0:b/>
-                <ns0:color ns0:val="000000"/>
-                <ns0:sz ns0:val="20"/>
-                <ns0:szCs ns0:val="20"/>
-                <ns0:lang ns0:eastAsia="pt-BR"/>
-              </ns0:rPr>
-              <ns0:t>[DESCRIÇÃO_OCORRÊNCIA]</ns0:t>
-            </ns0:r>
-          </ns0:p>
-        </ns0:tc>
-      </ns0:tr>
-      <ns0:tr ns0:rsidR="001135B9" ns0:rsidRPr="003B0023" ns2:paraId="63B82913" ns2:textId="77777777" ns0:rsidTr="001135B9">
-        <ns0:trPr>
-          <ns0:cantSplit/>
-          <ns0:trHeight ns0:val="2171"/>
-          <ns0:jc ns0:val="center"/>
-        </ns0:trPr>
-        <ns0:tc>
-          <ns0:tcPr>
-            <ns0:tcW ns0:w="9348" ns0:type="dxa"/>
-            <ns0:gridSpan ns0:val="7"/>
-            <ns0:tcBorders>
-              <ns0:top ns0:val="single" ns0:sz="4" ns0:space="0" ns0:color="auto"/>
-              <ns0:left ns0:val="single" ns0:sz="4" ns0:space="0" ns0:color="auto"/>
-              <ns0:bottom ns0:val="single" ns0:sz="4" ns0:space="0" ns0:color="auto"/>
-              <ns0:right ns0:val="single" ns0:sz="4" ns0:space="0" ns0:color="auto"/>
-            </ns0:tcBorders>
-            <ns0:hideMark/>
-          </ns0:tcPr>
-          <ns0:p ns2:paraId="5812C90F" ns2:textId="77777777" ns0:rsidR="001135B9" ns0:rsidRPr="003B0023" ns0:rsidRDefault="001135B9" ns0:rsidP="0013288F">
-            <ns0:pPr>
-              <ns0:keepNext/>
-              <ns0:keepLines/>
-              <ns0:suppressLineNumbers/>
-              <ns0:suppressAutoHyphens/>
-              <ns0:spacing ns0:before="240" ns0:after="0" ns0:line="256" ns0:lineRule="auto"/>
-              <ns0:rPr>
-                <ns0:rFonts ns0:ascii="Times New Roman" ns0:hAnsi="Times New Roman"/>
-                <ns0:b/>
-                <ns0:sz ns0:val="20"/>
-                <ns0:szCs ns0:val="20"/>
-              </ns0:rPr>
-            </ns0:pPr>
-            <ns0:r ns0:rsidRPr="003B0023">
-              <ns0:rPr>
-                <ns0:rFonts ns0:ascii="Times New Roman" ns0:eastAsia="Times New Roman" ns0:hAnsi="Times New Roman"/>
-                <ns0:b/>
-                <ns0:color ns0:val="000000"/>
-                <ns0:sz ns0:val="20"/>
-                <ns0:szCs ns0:val="20"/>
-                <ns0:lang ns0:eastAsia="pt-BR"/>
-              </ns0:rPr>
-              <ns0:t>MEDIDAS CORRETIVAS</ns0:t>
-            </ns0:r>
-            <ns0:r>
-              <ns0:rPr>
-                <ns0:rFonts ns0:ascii="Times New Roman" ns0:eastAsia="Times New Roman" ns0:hAnsi="Times New Roman"/>
-                <ns0:b/>
-                <ns0:color ns0:val="000000"/>
-                <ns0:sz ns0:val="20"/>
-                <ns0:szCs ns0:val="20"/>
-                <ns0:lang ns0:eastAsia="pt-BR"/>
-              </ns0:rPr>
-              <ns0:t>:</ns0:t>
-            </ns0:r>
-            <ns0:r ns0:rsidR="00967D7E">
-              <ns0:rPr>
-                <ns0:rFonts ns0:ascii="Times New Roman" ns0:eastAsia="Times New Roman" ns0:hAnsi="Times New Roman"/>
-                <ns0:b/>
-                <ns0:color ns0:val="000000"/>
-                <ns0:sz ns0:val="20"/>
-                <ns0:szCs ns0:val="20"/>
-                <ns0:lang ns0:eastAsia="pt-BR"/>
-              </ns0:rPr>
-              <ns0:t xml:space="preserve"> </ns0:t>
-            </ns0:r>
-            <ns0:r ns0:rsidR="00967D7E" ns0:rsidRPr="00967D7E">
-              <ns0:rPr>
-                <ns0:rFonts ns0:ascii="Times New Roman" ns0:eastAsia="Times New Roman" ns0:hAnsi="Times New Roman"/>
-                <ns0:b/>
-                <ns0:color ns0:val="000000"/>
-                <ns0:sz ns0:val="20"/>
-                <ns0:szCs ns0:val="20"/>
-                <ns0:lang ns0:eastAsia="pt-BR"/>
-              </ns0:rPr>
-              <ns0:t>[MEDIDAS_CORRETIVAS]</ns0:t>
-            </ns0:r>
-          </ns0:p>
-        </ns0:tc>
-      </ns0:tr>
-      <ns0:tr ns0:rsidR="001135B9" ns0:rsidRPr="003B0023" ns2:paraId="2292873C" ns2:textId="77777777" ns0:rsidTr="001135B9">
-        <ns0:trPr>
-          <ns0:cantSplit/>
-          <ns0:trHeight ns0:val="2394"/>
-          <ns0:jc ns0:val="center"/>
-        </ns0:trPr>
-        <ns0:tc>
-          <ns0:tcPr>
-            <ns0:tcW ns0:w="9348" ns0:type="dxa"/>
-            <ns0:gridSpan ns0:val="7"/>
-            <ns0:tcBorders>
-              <ns0:top ns0:val="single" ns0:sz="4" ns0:space="0" ns0:color="auto"/>
-              <ns0:left ns0:val="single" ns0:sz="4" ns0:space="0" ns0:color="auto"/>
-              <ns0:bottom ns0:val="single" ns0:sz="4" ns0:space="0" ns0:color="auto"/>
-              <ns0:right ns0:val="single" ns0:sz="4" ns0:space="0" ns0:color="auto"/>
-            </ns0:tcBorders>
-            <ns0:hideMark/>
-          </ns0:tcPr>
-          <ns0:p ns2:paraId="2B0CBBEF" ns2:textId="77777777" ns0:rsidR="001135B9" ns0:rsidRPr="003B0023" ns0:rsidRDefault="001135B9" ns0:rsidP="0013288F">
-            <ns0:pPr>
-              <ns0:spacing ns0:before="240" ns0:after="0"/>
-              <ns0:rPr>
-                <ns0:rFonts ns0:ascii="Times New Roman" ns0:eastAsia="Times New Roman" ns0:hAnsi="Times New Roman"/>
-                <ns0:b/>
-                <ns0:color ns0:val="000000"/>
-                <ns0:sz ns0:val="20"/>
-                <ns0:szCs ns0:val="20"/>
-                <ns0:lang ns0:eastAsia="pt-BR"/>
-              </ns0:rPr>
-            </ns0:pPr>
-            <ns0:r ns0:rsidRPr="003B0023">
-              <ns0:rPr>
-                <ns0:rFonts ns0:ascii="Times New Roman" ns0:eastAsia="Times New Roman" ns0:hAnsi="Times New Roman"/>
-                <ns0:b/>
-                <ns0:color ns0:val="000000"/>
-                <ns0:sz ns0:val="20"/>
-                <ns0:szCs ns0:val="20"/>
-                <ns0:lang ns0:eastAsia="pt-BR"/>
-              </ns0:rPr>
-              <ns0:t>OBSERVAÇÕES (SE HOUVER)</ns0:t>
-            </ns0:r>
-            <ns0:r>
-              <ns0:rPr>
-                <ns0:rFonts ns0:ascii="Times New Roman" ns0:eastAsia="Times New Roman" ns0:hAnsi="Times New Roman"/>
-                <ns0:b/>
-                <ns0:color ns0:val="000000"/>
-                <ns0:sz ns0:val="20"/>
-                <ns0:szCs ns0:val="20"/>
-                <ns0:lang ns0:eastAsia="pt-BR"/>
-              </ns0:rPr>
-              <ns0:t>:</ns0:t>
-            </ns0:r>
-            <ns0:r ns0:rsidR="00967D7E">
-              <ns0:rPr>
-                <ns0:rFonts ns0:ascii="Times New Roman" ns0:eastAsia="Times New Roman" ns0:hAnsi="Times New Roman"/>
-                <ns0:b/>
-                <ns0:color ns0:val="000000"/>
-                <ns0:sz ns0:val="20"/>
-                <ns0:szCs ns0:val="20"/>
-                <ns0:lang ns0:eastAsia="pt-BR"/>
-              </ns0:rPr>
-              <ns0:t xml:space="preserve"> </ns0:t>
-            </ns0:r>
-            <ns0:r ns0:rsidR="00967D7E" ns0:rsidRPr="00967D7E">
-              <ns0:rPr>
-                <ns0:rFonts ns0:ascii="Times New Roman" ns0:eastAsia="Times New Roman" ns0:hAnsi="Times New Roman"/>
-                <ns0:b/>
-                <ns0:color ns0:val="000000"/>
-                <ns0:sz ns0:val="20"/>
-                <ns0:szCs ns0:val="20"/>
-                <ns0:lang ns0:eastAsia="pt-BR"/>
-              </ns0:rPr>
-              <ns0:t>[OBSERVAÇÕES]</ns0:t>
-            </ns0:r>
-          </ns0:p>
-        </ns0:tc>
-      </ns0:tr>
-    </ns0:tbl>
-    <ns0:p ns2:paraId="6A5AC03E" ns2:textId="77777777" ns0:rsidR="004050A3" ns0:rsidRDefault="004050A3" ns0:rsidP="006E61DB">
-      <ns0:pPr>
-        <ns0:pStyle ns0:val="Corpodetexto"/>
-        <ns0:spacing ns0:before="9" ns0:line="360" ns0:lineRule="auto"/>
-        <ns0:rPr>
-          <ns0:rFonts ns0:ascii="Times New Roman" ns0:hAnsi="Times New Roman" ns0:cs="Times New Roman"/>
-          <ns0:color ns0:val="000000"/>
-        </ns0:rPr>
-      </ns0:pPr>
-    </ns0:p>
-    <ns0:p ns2:paraId="368DF440" ns2:textId="77777777" ns0:rsidR="0013288F" ns0:rsidRPr="004050A3" ns0:rsidRDefault="0013288F" ns0:rsidP="006E61DB">
-      <ns0:pPr>
-        <ns0:pStyle ns0:val="Corpodetexto"/>
-        <ns0:spacing ns0:before="9" ns0:line="360" ns0:lineRule="auto"/>
-        <ns0:rPr>
-          <ns0:rFonts ns0:ascii="Times New Roman" ns0:hAnsi="Times New Roman" ns0:cs="Times New Roman"/>
-          <ns0:color ns0:val="000000"/>
-        </ns0:rPr>
-      </ns0:pPr>
-      <ns0:r>
-        <ns0:rPr>
-          <ns0:rFonts ns0:ascii="Times New Roman" ns0:hAnsi="Times New Roman" ns0:cs="Times New Roman"/>
-          <ns0:color ns0:val="000000"/>
-        </ns0:rPr>
-        <ns0:br ns0:type="page"/>
-      </ns0:r>
-    </ns0:p>
-    <ns0:tbl>
-      <ns0:tblPr>
-        <ns0:tblW ns0:w="0" ns0:type="auto"/>
-        <ns0:tblInd ns0:w="817" ns0:type="dxa"/>
-        <ns0:tblBorders>
-          <ns0:top ns0:val="single" ns0:sz="4" ns0:space="0" ns0:color="000000"/>
-          <ns0:left ns0:val="single" ns0:sz="4" ns0:space="0" ns0:color="000000"/>
-          <ns0:bottom ns0:val="single" ns0:sz="4" ns0:space="0" ns0:color="000000"/>
-          <ns0:right ns0:val="single" ns0:sz="4" ns0:space="0" ns0:color="000000"/>
-          <ns0:insideH ns0:val="single" ns0:sz="4" ns0:space="0" ns0:color="000000"/>
-          <ns0:insideV ns0:val="single" ns0:sz="4" ns0:space="0" ns0:color="000000"/>
-        </ns0:tblBorders>
-        <ns0:tblLook ns0:val="04A0" ns0:firstRow="1" ns0:lastRow="0" ns0:firstColumn="1" ns0:lastColumn="0" ns0:noHBand="0" ns0:noVBand="1"/>
-      </ns0:tblPr>
-      <ns0:tblGrid>
-        <ns0:gridCol ns0:w="4193"/>
-        <ns0:gridCol ns0:w="4193"/>
-      </ns0:tblGrid>
-      <ns0:tr ns0:rsidR="004050A3" ns2:paraId="718833B6" ns2:textId="77777777" ns0:rsidTr="007F5E4E">
-        <ns0:trPr>
-          <ns0:trHeight ns0:val="236"/>
-        </ns0:trPr>
-        <ns0:tc>
-          <ns0:tcPr>
-            <ns0:tcW ns0:w="8386" ns0:type="dxa"/>
-            <ns0:gridSpan ns0:val="2"/>
-            <ns0:tcBorders>
-              <ns0:top ns0:val="single" ns0:sz="4" ns0:space="0" ns0:color="000000"/>
-              <ns0:left ns0:val="single" ns0:sz="4" ns0:space="0" ns0:color="000000"/>
-              <ns0:bottom ns0:val="single" ns0:sz="4" ns0:space="0" ns0:color="000000"/>
-              <ns0:right ns0:val="single" ns0:sz="4" ns0:space="0" ns0:color="000000"/>
-            </ns0:tcBorders>
-            <ns0:shd ns0:val="clear" ns0:color="auto" ns0:fill="002060"/>
-            <ns0:vAlign ns0:val="center"/>
-            <ns0:hideMark/>
-          </ns0:tcPr>
-          <ns0:p ns2:paraId="7EDFFA09" ns2:textId="77777777" ns0:rsidR="004050A3" ns0:rsidRDefault="004050A3" ns0:rsidP="0013288F">
-            <ns0:pPr>
-              <ns0:jc ns0:val="center"/>
-              <ns0:rPr>
-                <ns0:rFonts ns0:ascii="Times New Roman" ns0:hAnsi="Times New Roman"/>
-                <ns0:b/>
-                <ns0:bCs/>
-                <ns0:color ns0:val="FFFFFF"/>
-              </ns0:rPr>
-            </ns0:pPr>
-            <ns0:r>
-              <ns0:rPr>
-                <ns0:rFonts ns0:ascii="Times New Roman" ns0:hAnsi="Times New Roman"/>
-                <ns0:b/>
-                <ns0:bCs/>
-                <ns0:color ns0:val="FFFFFF"/>
-              </ns0:rPr>
-              <ns0:t>REGISTRO FOTOGRÁFICO DA AÇÃO CORRETIVA</ns0:t>
-            </ns0:r>
-          </ns0:p>
-        </ns0:tc>
-      </ns0:tr>
-      <ns0:tr ns0:rsidR="0013288F" ns2:paraId="499B5D07" ns2:textId="77777777" ns0:rsidTr="007F5E4E">
-        <ns0:trPr>
-          <ns0:trHeight ns0:val="236"/>
-        </ns0:trPr>
-        <ns0:tc>
-          <ns0:tcPr>
-            <ns0:tcW ns0:w="4193" ns0:type="dxa"/>
-            <ns0:tcBorders>
-              <ns0:top ns0:val="single" ns0:sz="4" ns0:space="0" ns0:color="000000"/>
-              <ns0:left ns0:val="single" ns0:sz="4" ns0:space="0" ns0:color="000000"/>
-              <ns0:bottom ns0:val="single" ns0:sz="4" ns0:space="0" ns0:color="000000"/>
-              <ns0:right ns0:val="single" ns0:sz="4" ns0:space="0" ns0:color="000000"/>
-            </ns0:tcBorders>
-            <ns0:shd ns0:val="clear" ns0:color="auto" ns0:fill="002060"/>
-            <ns0:vAlign ns0:val="center"/>
-          </ns0:tcPr>
-          <ns0:p ns2:paraId="1134C47B" ns2:textId="77777777" ns0:rsidR="0013288F" ns0:rsidRDefault="0013288F" ns0:rsidP="0013288F">
-            <ns0:pPr>
-              <ns0:jc ns0:val="center"/>
-              <ns0:rPr>
-                <ns0:rFonts ns0:ascii="Times New Roman" ns0:hAnsi="Times New Roman"/>
-                <ns0:b/>
-                <ns0:bCs/>
-                <ns0:color ns0:val="FFFFFF"/>
-              </ns0:rPr>
-            </ns0:pPr>
-            <ns0:r>
-              <ns0:rPr>
-                <ns0:rFonts ns0:ascii="Times New Roman" ns0:hAnsi="Times New Roman"/>
-                <ns0:b/>
-                <ns0:color ns0:val="FFFFFF"/>
-                <ns0:lang ns0:eastAsia="pt-BR"/>
-              </ns0:rPr>
-              <ns0:t>FOTO 1 –</ns0:t>
-            </ns0:r>
-            <ns0:r>
-              <ns0:rPr>
-                <ns0:rFonts ns0:ascii="Times New Roman" ns0:hAnsi="Times New Roman"/>
-                <ns0:color ns0:val="FFFFFF"/>
-                <ns0:lang ns0:eastAsia="pt-BR"/>
-              </ns0:rPr>
-              <ns0:t xml:space="preserve"> </ns0:t>
-            </ns0:r>
-            <ns0:r ns0:rsidR="00967D7E" ns0:rsidRPr="00967D7E">
-              <ns0:rPr>
-                <ns0:rFonts ns0:ascii="Times New Roman" ns0:hAnsi="Times New Roman"/>
-                <ns0:color ns0:val="FFFFFF"/>
-                <ns0:lang ns0:eastAsia="pt-BR"/>
-              </ns0:rPr>
-              <ns0:t>[LEGENDA</ns0:t>
-            </ns0:r>
-            <ns0:r ns0:rsidR="00967D7E">
-              <ns0:rPr>
-                <ns0:rFonts ns0:ascii="Times New Roman" ns0:hAnsi="Times New Roman"/>
-                <ns0:color ns0:val="FFFFFF"/>
-                <ns0:lang ns0:eastAsia="pt-BR"/>
-              </ns0:rPr>
-              <ns0:t>1</ns0:t>
-            </ns0:r>
-            <ns0:r ns0:rsidR="00967D7E" ns0:rsidRPr="00967D7E">
-              <ns0:rPr>
-                <ns0:rFonts ns0:ascii="Times New Roman" ns0:hAnsi="Times New Roman"/>
-                <ns0:color ns0:val="FFFFFF"/>
-                <ns0:lang ns0:eastAsia="pt-BR"/>
-              </ns0:rPr>
-              <ns0:t>]</ns0:t>
-            </ns0:r>
-          </ns0:p>
-        </ns0:tc>
-        <ns0:tc>
-          <ns0:tcPr>
-            <ns0:tcW ns0:w="4193" ns0:type="dxa"/>
-            <ns0:tcBorders>
-              <ns0:top ns0:val="single" ns0:sz="4" ns0:space="0" ns0:color="000000"/>
-              <ns0:left ns0:val="single" ns0:sz="4" ns0:space="0" ns0:color="000000"/>
-              <ns0:bottom ns0:val="single" ns0:sz="4" ns0:space="0" ns0:color="000000"/>
-              <ns0:right ns0:val="single" ns0:sz="4" ns0:space="0" ns0:color="000000"/>
-            </ns0:tcBorders>
-            <ns0:shd ns0:val="clear" ns0:color="auto" ns0:fill="002060"/>
-            <ns0:vAlign ns0:val="center"/>
-          </ns0:tcPr>
-          <ns0:p ns2:paraId="306263CC" ns2:textId="77777777" ns0:rsidR="0013288F" ns0:rsidRDefault="0013288F" ns0:rsidP="0013288F">
-            <ns0:pPr>
-              <ns0:jc ns0:val="center"/>
-              <ns0:rPr>
-                <ns0:rFonts ns0:ascii="Times New Roman" ns0:hAnsi="Times New Roman"/>
-                <ns0:b/>
-                <ns0:bCs/>
-                <ns0:color ns0:val="FFFFFF"/>
-              </ns0:rPr>
-            </ns0:pPr>
-            <ns0:r>
-              <ns0:rPr>
-                <ns0:rFonts ns0:ascii="Times New Roman" ns0:hAnsi="Times New Roman"/>
-                <ns0:b/>
-                <ns0:color ns0:val="FFFFFF"/>
-                <ns0:lang ns0:eastAsia="pt-BR"/>
-              </ns0:rPr>
-              <ns0:t>FOTO 2 –</ns0:t>
-            </ns0:r>
-            <ns0:r>
-              <ns0:rPr>
-                <ns0:rFonts ns0:ascii="Times New Roman" ns0:hAnsi="Times New Roman"/>
-                <ns0:color ns0:val="FFFFFF"/>
-                <ns0:lang ns0:eastAsia="pt-BR"/>
-              </ns0:rPr>
-              <ns0:t xml:space="preserve"> </ns0:t>
-            </ns0:r>
-            <ns0:r ns0:rsidR="00967D7E" ns0:rsidRPr="00967D7E">
-              <ns0:rPr>
-                <ns0:rFonts ns0:ascii="Times New Roman" ns0:hAnsi="Times New Roman"/>
-                <ns0:color ns0:val="FFFFFF"/>
-                <ns0:lang ns0:eastAsia="pt-BR"/>
-              </ns0:rPr>
-              <ns0:t>[LEGENDA</ns0:t>
-            </ns0:r>
-            <ns0:r ns0:rsidR="00967D7E">
-              <ns0:rPr>
-                <ns0:rFonts ns0:ascii="Times New Roman" ns0:hAnsi="Times New Roman"/>
-                <ns0:color ns0:val="FFFFFF"/>
-                <ns0:lang ns0:eastAsia="pt-BR"/>
-              </ns0:rPr>
-              <ns0:t>2</ns0:t>
-            </ns0:r>
-            <ns0:r ns0:rsidR="00967D7E" ns0:rsidRPr="00967D7E">
-              <ns0:rPr>
-                <ns0:rFonts ns0:ascii="Times New Roman" ns0:hAnsi="Times New Roman"/>
-                <ns0:color ns0:val="FFFFFF"/>
-                <ns0:lang ns0:eastAsia="pt-BR"/>
-              </ns0:rPr>
-              <ns0:t>]</ns0:t>
-            </ns0:r>
-          </ns0:p>
-        </ns0:tc>
-      </ns0:tr>
-      <ns0:tr ns0:rsidR="0013288F" ns0:rsidRPr="00E32823" ns2:paraId="19404255" ns2:textId="77777777">
-        <ns0:trPr>
-          <ns0:trHeight ns0:val="2671"/>
-        </ns0:trPr>
-        <ns0:tc>
-          <ns0:tcPr>
-            <ns0:tcW ns0:w="4193" ns0:type="dxa"/>
-            <ns0:tcBorders>
-              <ns0:top ns0:val="single" ns0:sz="4" ns0:space="0" ns0:color="000000"/>
-              <ns0:left ns0:val="single" ns0:sz="4" ns0:space="0" ns0:color="000000"/>
-              <ns0:bottom ns0:val="single" ns0:sz="4" ns0:space="0" ns0:color="000000"/>
-              <ns0:right ns0:val="single" ns0:sz="4" ns0:space="0" ns0:color="000000"/>
-            </ns0:tcBorders>
-          </ns0:tcPr>
-          <ns0:p ns2:paraId="684CC02A" ns2:textId="77777777" ns0:rsidR="0013288F" ns0:rsidRPr="00E32823" ns0:rsidRDefault="00602B53" ns0:rsidP="00E32823">
-            <ns0:pPr>
-              <ns0:shd ns0:val="clear" ns0:color="auto" ns0:fill="FFFFFF"/>
-              <ns0:spacing ns0:before="240"/>
-              <ns0:rPr>
-                <ns0:rFonts ns0:ascii="Times New Roman" ns0:hAnsi="Times New Roman"/>
-                <ns0:lang ns0:eastAsia="pt-BR"/>
-              </ns0:rPr>
-            </ns0:pPr>
-            <ns0:r ns0:rsidRPr="00602B53">
-              <ns0:rPr>
-                <ns0:rFonts ns0:ascii="Times New Roman" ns0:hAnsi="Times New Roman"/>
-                <ns0:lang ns0:eastAsia="pt-BR"/>
-              </ns0:rPr>
-              <ns0:t>[FOTO_1]</ns0:t>
-            </ns0:r>
-          </ns0:p>
-        </ns0:tc>
-        <ns0:tc>
-          <ns0:tcPr>
-            <ns0:tcW ns0:w="4193" ns0:type="dxa"/>
-            <ns0:tcBorders>
-              <ns0:top ns0:val="single" ns0:sz="4" ns0:space="0" ns0:color="000000"/>
-              <ns0:left ns0:val="single" ns0:sz="4" ns0:space="0" ns0:color="000000"/>
-              <ns0:bottom ns0:val="single" ns0:sz="4" ns0:space="0" ns0:color="000000"/>
-              <ns0:right ns0:val="single" ns0:sz="4" ns0:space="0" ns0:color="000000"/>
-            </ns0:tcBorders>
-          </ns0:tcPr>
-          <ns0:p ns2:paraId="6374F74D" ns2:textId="77777777" ns0:rsidR="0013288F" ns0:rsidRPr="00E32823" ns0:rsidRDefault="00602B53" ns0:rsidP="00E32823">
-            <ns0:pPr>
-              <ns0:shd ns0:val="clear" ns0:color="auto" ns0:fill="FFFFFF"/>
-              <ns0:spacing ns0:before="240"/>
-              <ns0:rPr>
-                <ns0:rFonts ns0:ascii="Times New Roman" ns0:hAnsi="Times New Roman"/>
-                <ns0:lang ns0:eastAsia="pt-BR"/>
-              </ns0:rPr>
-            </ns0:pPr>
-            <ns0:r ns0:rsidRPr="00602B53">
-              <ns0:rPr>
-                <ns0:rFonts ns0:ascii="Times New Roman" ns0:hAnsi="Times New Roman"/>
-                <ns0:lang ns0:eastAsia="pt-BR"/>
-              </ns0:rPr>
-              <ns0:t>[FOTO_</ns0:t>
-            </ns0:r>
-            <ns0:r>
-              <ns0:rPr>
-                <ns0:rFonts ns0:ascii="Times New Roman" ns0:hAnsi="Times New Roman"/>
-                <ns0:lang ns0:eastAsia="pt-BR"/>
-              </ns0:rPr>
-              <ns0:t>2</ns0:t>
-            </ns0:r>
-            <ns0:r ns0:rsidRPr="00602B53">
-              <ns0:rPr>
-                <ns0:rFonts ns0:ascii="Times New Roman" ns0:hAnsi="Times New Roman"/>
-                <ns0:lang ns0:eastAsia="pt-BR"/>
-              </ns0:rPr>
-              <ns0:t>]</ns0:t>
-            </ns0:r>
-          </ns0:p>
-        </ns0:tc>
-      </ns0:tr>
-      <ns0:tr ns0:rsidR="0013288F" ns2:paraId="2D3CD5C7" ns2:textId="77777777" ns0:rsidTr="007F5E4E">
-        <ns0:trPr>
-          <ns0:trHeight ns0:val="381"/>
-        </ns0:trPr>
-        <ns0:tc>
-          <ns0:tcPr>
-            <ns0:tcW ns0:w="4193" ns0:type="dxa"/>
-            <ns0:tcBorders>
-              <ns0:top ns0:val="single" ns0:sz="4" ns0:space="0" ns0:color="000000"/>
-              <ns0:left ns0:val="single" ns0:sz="4" ns0:space="0" ns0:color="000000"/>
-              <ns0:bottom ns0:val="single" ns0:sz="4" ns0:space="0" ns0:color="000000"/>
-              <ns0:right ns0:val="single" ns0:sz="4" ns0:space="0" ns0:color="000000"/>
-            </ns0:tcBorders>
-            <ns0:shd ns0:val="clear" ns0:color="auto" ns0:fill="002060"/>
-            <ns0:hideMark/>
-          </ns0:tcPr>
-          <ns0:p ns2:paraId="513D65EF" ns2:textId="77777777" ns0:rsidR="0013288F" ns0:rsidRDefault="0013288F" ns0:rsidP="00E32823">
-            <ns0:pPr>
-              <ns0:jc ns0:val="center"/>
-              <ns0:rPr>
-                <ns0:rFonts ns0:ascii="Times New Roman" ns0:hAnsi="Times New Roman"/>
-                <ns0:color ns0:val="FFFFFF"/>
-                <ns0:lang ns0:eastAsia="pt-BR"/>
-              </ns0:rPr>
-            </ns0:pPr>
-            <ns0:r>
-              <ns0:rPr>
-                <ns0:rFonts ns0:ascii="Times New Roman" ns0:hAnsi="Times New Roman"/>
-                <ns0:b/>
-                <ns0:color ns0:val="FFFFFF"/>
-                <ns0:lang ns0:eastAsia="pt-BR"/>
-              </ns0:rPr>
-              <ns0:t>FOTO 3 –</ns0:t>
-            </ns0:r>
-            <ns0:r>
-              <ns0:rPr>
-                <ns0:rFonts ns0:ascii="Times New Roman" ns0:hAnsi="Times New Roman"/>
-                <ns0:color ns0:val="FFFFFF"/>
-                <ns0:lang ns0:eastAsia="pt-BR"/>
-              </ns0:rPr>
-              <ns0:t xml:space="preserve"> </ns0:t>
-            </ns0:r>
-            <ns0:r ns0:rsidR="00967D7E" ns0:rsidRPr="00967D7E">
-              <ns0:rPr>
-                <ns0:rFonts ns0:ascii="Times New Roman" ns0:hAnsi="Times New Roman"/>
-                <ns0:color ns0:val="FFFFFF"/>
-                <ns0:lang ns0:eastAsia="pt-BR"/>
-              </ns0:rPr>
-              <ns0:t>[LEGENDA</ns0:t>
-            </ns0:r>
-            <ns0:r ns0:rsidR="00967D7E">
-              <ns0:rPr>
-                <ns0:rFonts ns0:ascii="Times New Roman" ns0:hAnsi="Times New Roman"/>
-                <ns0:color ns0:val="FFFFFF"/>
-                <ns0:lang ns0:eastAsia="pt-BR"/>
-              </ns0:rPr>
-              <ns0:t>3</ns0:t>
-            </ns0:r>
-            <ns0:r ns0:rsidR="00967D7E" ns0:rsidRPr="00967D7E">
-              <ns0:rPr>
-                <ns0:rFonts ns0:ascii="Times New Roman" ns0:hAnsi="Times New Roman"/>
-                <ns0:color ns0:val="FFFFFF"/>
-                <ns0:lang ns0:eastAsia="pt-BR"/>
-              </ns0:rPr>
-              <ns0:t>]</ns0:t>
-            </ns0:r>
-          </ns0:p>
-        </ns0:tc>
-        <ns0:tc>
-          <ns0:tcPr>
-            <ns0:tcW ns0:w="4193" ns0:type="dxa"/>
-            <ns0:tcBorders>
-              <ns0:top ns0:val="single" ns0:sz="4" ns0:space="0" ns0:color="000000"/>
-              <ns0:left ns0:val="single" ns0:sz="4" ns0:space="0" ns0:color="000000"/>
-              <ns0:bottom ns0:val="single" ns0:sz="4" ns0:space="0" ns0:color="000000"/>
-              <ns0:right ns0:val="single" ns0:sz="4" ns0:space="0" ns0:color="000000"/>
-            </ns0:tcBorders>
-            <ns0:shd ns0:val="clear" ns0:color="auto" ns0:fill="002060"/>
-          </ns0:tcPr>
-          <ns0:p ns2:paraId="3B7C5E5C" ns2:textId="77777777" ns0:rsidR="0013288F" ns0:rsidRDefault="0013288F" ns0:rsidP="00E32823">
-            <ns0:pPr>
-              <ns0:jc ns0:val="center"/>
-              <ns0:rPr>
-                <ns0:rFonts ns0:ascii="Times New Roman" ns0:hAnsi="Times New Roman"/>
-                <ns0:color ns0:val="FFFFFF"/>
-                <ns0:lang ns0:eastAsia="pt-BR"/>
-              </ns0:rPr>
-            </ns0:pPr>
-            <ns0:r>
-              <ns0:rPr>
-                <ns0:rFonts ns0:ascii="Times New Roman" ns0:hAnsi="Times New Roman"/>
-                <ns0:b/>
-                <ns0:color ns0:val="FFFFFF"/>
-                <ns0:lang ns0:eastAsia="pt-BR"/>
-              </ns0:rPr>
-              <ns0:t>FOTO 4 –</ns0:t>
-            </ns0:r>
-            <ns0:r>
-              <ns0:rPr>
-                <ns0:rFonts ns0:ascii="Times New Roman" ns0:hAnsi="Times New Roman"/>
-                <ns0:color ns0:val="FFFFFF"/>
-                <ns0:lang ns0:eastAsia="pt-BR"/>
-              </ns0:rPr>
-              <ns0:t xml:space="preserve"> </ns0:t>
-            </ns0:r>
-            <ns0:r ns0:rsidR="00967D7E" ns0:rsidRPr="00967D7E">
-              <ns0:rPr>
-                <ns0:rFonts ns0:ascii="Times New Roman" ns0:hAnsi="Times New Roman"/>
-                <ns0:color ns0:val="FFFFFF"/>
-                <ns0:lang ns0:eastAsia="pt-BR"/>
-              </ns0:rPr>
-              <ns0:t>[LEGENDA</ns0:t>
-            </ns0:r>
-            <ns0:r ns0:rsidR="00967D7E">
-              <ns0:rPr>
-                <ns0:rFonts ns0:ascii="Times New Roman" ns0:hAnsi="Times New Roman"/>
-                <ns0:color ns0:val="FFFFFF"/>
-                <ns0:lang ns0:eastAsia="pt-BR"/>
-              </ns0:rPr>
-              <ns0:t>4</ns0:t>
-            </ns0:r>
-            <ns0:r ns0:rsidR="00967D7E" ns0:rsidRPr="00967D7E">
-              <ns0:rPr>
-                <ns0:rFonts ns0:ascii="Times New Roman" ns0:hAnsi="Times New Roman"/>
-                <ns0:color ns0:val="FFFFFF"/>
-                <ns0:lang ns0:eastAsia="pt-BR"/>
-              </ns0:rPr>
-              <ns0:t>]</ns0:t>
-            </ns0:r>
-          </ns0:p>
-        </ns0:tc>
-      </ns0:tr>
-      <ns0:tr ns0:rsidR="0013288F" ns0:rsidRPr="00E32823" ns2:paraId="629AD3C5" ns2:textId="77777777" ns0:rsidTr="00967D7E">
-        <ns0:trPr>
-          <ns0:trHeight ns0:val="2835"/>
-        </ns0:trPr>
-        <ns0:tc>
-          <ns0:tcPr>
-            <ns0:tcW ns0:w="4193" ns0:type="dxa"/>
-            <ns0:tcBorders>
-              <ns0:top ns0:val="single" ns0:sz="4" ns0:space="0" ns0:color="000000"/>
-              <ns0:left ns0:val="single" ns0:sz="4" ns0:space="0" ns0:color="000000"/>
-              <ns0:bottom ns0:val="single" ns0:sz="4" ns0:space="0" ns0:color="000000"/>
-              <ns0:right ns0:val="single" ns0:sz="4" ns0:space="0" ns0:color="000000"/>
-            </ns0:tcBorders>
-          </ns0:tcPr>
-          <ns0:p ns2:paraId="11E1EB6B" ns2:textId="77777777" ns0:rsidR="0013288F" ns0:rsidRPr="00E32823" ns0:rsidRDefault="00602B53" ns0:rsidP="00967D7E">
-            <ns0:pPr>
-              <ns0:shd ns0:val="clear" ns0:color="auto" ns0:fill="FFFFFF"/>
-              <ns0:spacing ns0:before="240"/>
-              <ns0:rPr>
-                <ns0:rFonts ns0:ascii="Times New Roman" ns0:hAnsi="Times New Roman"/>
-                <ns0:b/>
-                <ns0:lang ns0:eastAsia="pt-BR"/>
-              </ns0:rPr>
-            </ns0:pPr>
-            <ns0:r ns0:rsidRPr="00602B53">
-              <ns0:rPr>
-                <ns0:rFonts ns0:ascii="Times New Roman" ns0:hAnsi="Times New Roman"/>
-                <ns0:lang ns0:eastAsia="pt-BR"/>
-              </ns0:rPr>
-              <ns0:t>[FOTO_3]</ns0:t>
-            </ns0:r>
-          </ns0:p>
-        </ns0:tc>
-        <ns0:tc>
-          <ns0:tcPr>
-            <ns0:tcW ns0:w="4193" ns0:type="dxa"/>
-            <ns0:tcBorders>
-              <ns0:top ns0:val="single" ns0:sz="4" ns0:space="0" ns0:color="000000"/>
-              <ns0:left ns0:val="single" ns0:sz="4" ns0:space="0" ns0:color="000000"/>
-              <ns0:bottom ns0:val="single" ns0:sz="4" ns0:space="0" ns0:color="000000"/>
-              <ns0:right ns0:val="single" ns0:sz="4" ns0:space="0" ns0:color="000000"/>
-            </ns0:tcBorders>
-          </ns0:tcPr>
-          <ns0:p ns2:paraId="23111D39" ns2:textId="77777777" ns0:rsidR="0013288F" ns0:rsidRPr="00E32823" ns0:rsidRDefault="00602B53" ns0:rsidP="00967D7E">
-            <ns0:pPr>
-              <ns0:shd ns0:val="clear" ns0:color="auto" ns0:fill="FFFFFF"/>
-              <ns0:spacing ns0:before="240"/>
-              <ns0:rPr>
-                <ns0:rFonts ns0:ascii="Times New Roman" ns0:hAnsi="Times New Roman"/>
-                <ns0:b/>
-                <ns0:lang ns0:eastAsia="pt-BR"/>
-              </ns0:rPr>
-            </ns0:pPr>
-            <ns0:r ns0:rsidRPr="00602B53">
-              <ns0:rPr>
-                <ns0:rFonts ns0:ascii="Times New Roman" ns0:hAnsi="Times New Roman"/>
-                <ns0:lang ns0:eastAsia="pt-BR"/>
-              </ns0:rPr>
-              <ns0:t>[FOTO_</ns0:t>
-            </ns0:r>
-            <ns0:r>
-              <ns0:rPr>
-                <ns0:rFonts ns0:ascii="Times New Roman" ns0:hAnsi="Times New Roman"/>
-                <ns0:lang ns0:eastAsia="pt-BR"/>
-              </ns0:rPr>
-              <ns0:t>4</ns0:t>
-            </ns0:r>
-            <ns0:r ns0:rsidRPr="00602B53">
-              <ns0:rPr>
-                <ns0:rFonts ns0:ascii="Times New Roman" ns0:hAnsi="Times New Roman"/>
-                <ns0:lang ns0:eastAsia="pt-BR"/>
-              </ns0:rPr>
-              <ns0:t>]</ns0:t>
-            </ns0:r>
-          </ns0:p>
-        </ns0:tc>
-      </ns0:tr>
-    </ns0:tbl>
-    <ns0:p ns2:paraId="68BB1204" ns2:textId="77777777" ns0:rsidR="00553A7F" ns0:rsidRDefault="00553A7F" ns0:rsidP="00553A7F">
-      <ns0:pPr>
-        <ns0:spacing ns0:after="0"/>
-        <ns0:rPr>
-          <ns0:vanish/>
-        </ns0:rPr>
-      </ns0:pPr>
-    </ns0:p>
-    <ns0:p ns2:paraId="6BAF2168" ns2:textId="77777777" ns0:rsidR="00F67F0E" ns0:rsidRDefault="00F67F0E" ns0:rsidP="00553A7F">
-      <ns0:pPr>
-        <ns0:spacing ns0:after="0"/>
-        <ns0:rPr>
-          <ns0:vanish/>
-        </ns0:rPr>
-      </ns0:pPr>
-    </ns0:p>
-    <ns0:p ns2:paraId="38A17995" ns2:textId="77777777" ns0:rsidR="00F67F0E" ns0:rsidRDefault="00F67F0E" ns0:rsidP="00553A7F">
-      <ns0:pPr>
-        <ns0:spacing ns0:after="0"/>
-        <ns0:rPr>
-          <ns0:vanish/>
-        </ns0:rPr>
-      </ns0:pPr>
-    </ns0:p>
-    <ns0:p ns2:paraId="25C22B10" ns2:textId="77777777" ns0:rsidR="00F67F0E" ns0:rsidRDefault="00F67F0E" ns0:rsidP="00553A7F">
-      <ns0:pPr>
-        <ns0:spacing ns0:after="0"/>
-        <ns0:rPr>
-          <ns0:vanish/>
-        </ns0:rPr>
-      </ns0:pPr>
-    </ns0:p>
-    <ns0:p ns2:paraId="24FAC7CD" ns2:textId="77777777" ns0:rsidR="00F67F0E" ns0:rsidRDefault="00F67F0E" ns0:rsidP="00553A7F">
-      <ns0:pPr>
-        <ns0:spacing ns0:after="0"/>
-        <ns0:rPr>
-          <ns0:vanish/>
-        </ns0:rPr>
-      </ns0:pPr>
-    </ns0:p>
-    <ns0:p ns2:paraId="43CFC5C9" ns2:textId="77777777" ns0:rsidR="00F67F0E" ns0:rsidRPr="00553A7F" ns0:rsidRDefault="00F67F0E" ns0:rsidP="00553A7F">
-      <ns0:pPr>
-        <ns0:spacing ns0:after="0"/>
-        <ns0:rPr>
-          <ns0:vanish/>
-        </ns0:rPr>
-      </ns0:pPr>
-    </ns0:p>
-    <ns0:p ns2:paraId="14E38058" ns2:textId="77777777" ns0:rsidR="0022486B" ns0:rsidRPr="007E3444" ns0:rsidRDefault="0022486B" ns0:rsidP="00AD1CCB">
-      <ns0:pPr>
-        <ns0:tabs>
-          <ns0:tab ns0:val="left" ns0:pos="3587"/>
-        </ns0:tabs>
-        <ns0:spacing ns0:after="0"/>
-        <ns0:jc ns0:val="both"/>
-        <ns0:rPr>
-          <ns0:rFonts ns0:ascii="Times New Roman" ns0:hAnsi="Times New Roman"/>
-          <ns0:b/>
-          <ns0:sz ns0:val="22"/>
-          <ns0:szCs ns0:val="22"/>
-        </ns0:rPr>
-      </ns0:pPr>
-    </ns0:p>
-    <ns0:sectPr ns0:rsidR="0022486B" ns0:rsidRPr="007E3444" ns0:rsidSect="006E61DB">
-      <ns0:headerReference ns0:type="even" ns10:id="rId7"/>
-      <ns0:headerReference ns0:type="default" ns10:id="rId8"/>
-      <ns0:headerReference ns0:type="first" ns10:id="rId9"/>
-      <ns0:pgSz ns0:w="11900" ns0:h="16840"/>
-      <ns0:pgMar ns0:top="1418" ns0:right="1134" ns0:bottom="1560" ns0:left="1418" ns0:header="397" ns0:footer="567" ns0:gutter="0"/>
-      <ns0:cols ns0:space="708"/>
-      <ns0:docGrid ns0:linePitch="326"/>
-    </ns0:sectPr>
-  </ns0:body>
-</ns0:document>
+<w:document xmlns:wpc="http://schemas.microsoft.com/office/word/2010/wordprocessingCanvas" xmlns:cx="http://schemas.microsoft.com/office/drawing/2014/chartex" xmlns:cx1="http://schemas.microsoft.com/office/drawing/2015/9/8/chartex" xmlns:cx2="http://schemas.microsoft.com/office/drawing/2015/10/21/chartex" xmlns:cx3="http://schemas.microsoft.com/office/drawing/2016/5/9/chartex" xmlns:cx4="http://schemas.microsoft.com/office/drawing/2016/5/10/chartex" xmlns:cx5="http://schemas.microsoft.com/office/drawing/2016/5/11/chartex" xmlns:cx6="http://schemas.microsoft.com/office/drawing/2016/5/12/chartex" xmlns:cx7="http://schemas.microsoft.com/office/drawing/2016/5/13/chartex" xmlns:cx8="http://schemas.microsoft.com/office/drawing/2016/5/14/chartex" xmlns:mc="http://schemas.openxmlformats.org/markup-compatibility/2006" xmlns:aink="http://schemas.microsoft.com/office/drawing/2016/ink" xmlns:am3d="http://schemas.microsoft.com/office/drawing/2017/model3d" xmlns:o="urn:schemas-microsoft-com:office:office" xmlns:oel="http://schemas.microsoft.com/office/2019/extlst" xmlns:r="http://schemas.openxmlformats.org/officeDocument/2006/relationships" xmlns:m="http://schemas.openxmlformats.org/officeDocument/2006/math" xmlns:v="urn:schemas-microsoft-com:vml" xmlns:wp14="http://schemas.microsoft.com/office/word/2010/wordprocessingDrawing" xmlns:wp="http://schemas.openxmlformats.org/drawingml/2006/wordprocessingDrawing" xmlns:w10="urn:schemas-microsoft-com:office:word" xmlns:w="http://schemas.openxmlformats.org/wordprocessingml/2006/main" xmlns:w14="http://schemas.microsoft.com/office/word/2010/wordml" xmlns:w15="http://schemas.microsoft.com/office/word/2012/wordml" xmlns:w16cex="http://schemas.microsoft.com/office/word/2018/wordml/cex" xmlns:w16cid="http://schemas.microsoft.com/office/word/2016/wordml/cid" xmlns:w16="http://schemas.microsoft.com/office/word/2018/wordml" xmlns:w16du="http://schemas.microsoft.com/office/word/2023/wordml/word16du" xmlns:w16sdtdh="http://schemas.microsoft.com/office/word/2020/wordml/sdtdatahash" xmlns:w16sdtfl="http://schemas.microsoft.com/office/word/2024/wordml/sdtformatlock" xmlns:w16se="http://schemas.microsoft.com/office/word/2015/wordml/symex" xmlns:wpg="http://schemas.microsoft.com/office/word/2010/wordprocessingGroup" xmlns:wpi="http://schemas.microsoft.com/office/word/2010/wordprocessingInk" xmlns:wne="http://schemas.microsoft.com/office/word/2006/wordml" xmlns:wps="http://schemas.microsoft.com/office/word/2010/wordprocessingShape" mc:Ignorable="w14 w15 w16se w16cid w16 w16cex w16sdtdh w16sdtfl w16du wp14">
+  <w:body>
+    <w:tbl>
+      <w:tblPr>
+        <w:tblW w:w="9348" w:type="dxa"/>
+        <w:jc w:val="center"/>
+        <w:shd w:val="clear" w:color="auto" w:fill="FFFFFF"/>
+        <w:tblLayout w:type="fixed"/>
+        <w:tblCellMar>
+          <w:left w:w="70" w:type="dxa"/>
+          <w:right w:w="70" w:type="dxa"/>
+        </w:tblCellMar>
+        <w:tblLook w:val="04A0" w:firstRow="1" w:lastRow="0" w:firstColumn="1" w:lastColumn="0" w:noHBand="0" w:noVBand="1"/>
+      </w:tblPr>
+      <w:tblGrid>
+        <w:gridCol w:w="2337"/>
+        <w:gridCol w:w="1330"/>
+        <w:gridCol w:w="1770"/>
+        <w:gridCol w:w="126"/>
+        <w:gridCol w:w="1138"/>
+        <w:gridCol w:w="759"/>
+        <w:gridCol w:w="1888"/>
+      </w:tblGrid>
+      <w:tr>
+        <w:trPr>
+          <w:cantSplit/>
+          <w:trHeight w:val="454"/>
+          <w:jc w:val="center"/>
+        </w:trPr>
+        <w:tc>
+          <w:tcPr>
+            <w:tcW w:w="9348" w:type="dxa"/>
+            <w:gridSpan w:val="7"/>
+            <w:tcBorders>
+              <w:top w:val="single" w:sz="4" w:space="0" w:color="auto"/>
+              <w:left w:val="single" w:sz="4" w:space="0" w:color="auto"/>
+              <w:bottom w:val="single" w:sz="4" w:space="0" w:color="auto"/>
+              <w:right w:val="single" w:sz="4" w:space="0" w:color="auto"/>
+            </w:tcBorders>
+            <w:shd w:val="clear" w:color="auto" w:fill="002060"/>
+            <w:vAlign w:val="center"/>
+          </w:tcPr>
+          <w:p>
+            <w:pPr>
+              <w:keepNext/>
+              <w:keepLines/>
+              <w:suppressLineNumbers/>
+              <w:suppressAutoHyphens/>
+              <w:spacing w:after="0" w:line="256" w:lineRule="auto"/>
+              <w:jc w:val="center"/>
+              <w:rPr>
+                <w:rFonts w:ascii="Times New Roman" w:hAnsi="Times New Roman"/>
+                <w:b/>
+                <w:color w:val="FFFFFF"/>
+                <w:sz w:val="20"/>
+                <w:szCs w:val="20"/>
+              </w:rPr>
+            </w:pPr>
+            <w:r>
+              <w:rPr>
+                <w:rFonts w:ascii="Times New Roman" w:hAnsi="Times New Roman"/>
+                <w:b/>
+                <w:color w:val="FFFFFF"/>
+                <w:sz w:val="20"/>
+                <w:szCs w:val="20"/>
+              </w:rPr>
+              <w:t>INFORMAÇÕES DA TRATATIVA</w:t>
+            </w:r>
+          </w:p>
+        </w:tc>
+      </w:tr>
+      <w:tr>
+        <w:trPr>
+          <w:cantSplit/>
+          <w:trHeight w:val="454"/>
+          <w:jc w:val="center"/>
+        </w:trPr>
+        <w:tc>
+          <w:tcPr>
+            <w:tcW w:w="3667" w:type="dxa"/>
+            <w:gridSpan w:val="2"/>
+            <w:tcBorders>
+              <w:top w:val="single" w:sz="4" w:space="0" w:color="auto"/>
+              <w:left w:val="single" w:sz="4" w:space="0" w:color="auto"/>
+              <w:bottom w:val="single" w:sz="4" w:space="0" w:color="auto"/>
+              <w:right w:val="single" w:sz="4" w:space="0" w:color="auto"/>
+            </w:tcBorders>
+            <w:shd w:val="clear" w:color="auto" w:fill="002060"/>
+            <w:vAlign w:val="center"/>
+          </w:tcPr>
+          <w:p>
+            <w:pPr>
+              <w:keepNext/>
+              <w:keepLines/>
+              <w:suppressLineNumbers/>
+              <w:suppressAutoHyphens/>
+              <w:spacing w:after="0" w:line="256" w:lineRule="auto"/>
+              <w:jc w:val="center"/>
+              <w:rPr>
+                <w:rFonts w:ascii="Times New Roman" w:hAnsi="Times New Roman"/>
+                <w:b/>
+                <w:color w:val="FFFFFF"/>
+                <w:sz w:val="20"/>
+                <w:szCs w:val="20"/>
+              </w:rPr>
+            </w:pPr>
+            <w:r>
+              <w:rPr>
+                <w:rFonts w:ascii="Times New Roman" w:hAnsi="Times New Roman"/>
+                <w:b/>
+                <w:color w:val="FFFFFF"/>
+                <w:sz w:val="20"/>
+                <w:szCs w:val="20"/>
+              </w:rPr>
+              <w:t>RNC Nº:</w:t>
+            </w:r>
+          </w:p>
+        </w:tc>
+        <w:tc>
+          <w:tcPr>
+            <w:tcW w:w="3033" w:type="dxa"/>
+            <w:gridSpan w:val="3"/>
+            <w:tcBorders>
+              <w:top w:val="single" w:sz="4" w:space="0" w:color="auto"/>
+              <w:left w:val="single" w:sz="4" w:space="0" w:color="auto"/>
+              <w:bottom w:val="single" w:sz="4" w:space="0" w:color="auto"/>
+              <w:right w:val="single" w:sz="4" w:space="0" w:color="auto"/>
+            </w:tcBorders>
+            <w:shd w:val="clear" w:color="auto" w:fill="002060"/>
+            <w:vAlign w:val="center"/>
+          </w:tcPr>
+          <w:p>
+            <w:pPr>
+              <w:keepNext/>
+              <w:keepLines/>
+              <w:suppressLineNumbers/>
+              <w:suppressAutoHyphens/>
+              <w:spacing w:after="0" w:line="256" w:lineRule="auto"/>
+              <w:jc w:val="center"/>
+              <w:rPr>
+                <w:rFonts w:ascii="Times New Roman" w:hAnsi="Times New Roman"/>
+                <w:b/>
+                <w:color w:val="FFFFFF"/>
+                <w:sz w:val="20"/>
+                <w:szCs w:val="20"/>
+              </w:rPr>
+            </w:pPr>
+            <w:r>
+              <w:rPr>
+                <w:rFonts w:ascii="Times New Roman" w:hAnsi="Times New Roman"/>
+                <w:b/>
+                <w:color w:val="FFFFFF"/>
+                <w:sz w:val="20"/>
+                <w:szCs w:val="20"/>
+              </w:rPr>
+              <w:t>DATA DA EMISSÃO DA RNC:</w:t>
+            </w:r>
+          </w:p>
+        </w:tc>
+        <w:tc>
+          <w:tcPr>
+            <w:tcW w:w="2648" w:type="dxa"/>
+            <w:gridSpan w:val="2"/>
+            <w:tcBorders>
+              <w:top w:val="single" w:sz="4" w:space="0" w:color="auto"/>
+              <w:left w:val="single" w:sz="4" w:space="0" w:color="auto"/>
+              <w:bottom w:val="single" w:sz="4" w:space="0" w:color="auto"/>
+              <w:right w:val="single" w:sz="4" w:space="0" w:color="auto"/>
+            </w:tcBorders>
+            <w:shd w:val="clear" w:color="auto" w:fill="002060"/>
+            <w:vAlign w:val="center"/>
+          </w:tcPr>
+          <w:p>
+            <w:pPr>
+              <w:keepNext/>
+              <w:keepLines/>
+              <w:suppressLineNumbers/>
+              <w:suppressAutoHyphens/>
+              <w:spacing w:after="0" w:line="256" w:lineRule="auto"/>
+              <w:jc w:val="center"/>
+              <w:rPr>
+                <w:rFonts w:ascii="Times New Roman" w:hAnsi="Times New Roman"/>
+                <w:b/>
+                <w:color w:val="FFFFFF"/>
+                <w:sz w:val="20"/>
+                <w:szCs w:val="20"/>
+              </w:rPr>
+            </w:pPr>
+            <w:r>
+              <w:rPr>
+                <w:rFonts w:ascii="Times New Roman" w:hAnsi="Times New Roman"/>
+                <w:b/>
+                <w:color w:val="FFFFFF"/>
+                <w:sz w:val="20"/>
+                <w:szCs w:val="20"/>
+              </w:rPr>
+              <w:t>DATA DA EMISSÃO DA TRATATIVA:</w:t>
+            </w:r>
+          </w:p>
+        </w:tc>
+      </w:tr>
+      <w:tr>
+        <w:trPr>
+          <w:cantSplit/>
+          <w:trHeight w:val="623"/>
+          <w:jc w:val="center"/>
+        </w:trPr>
+        <w:tc>
+          <w:tcPr>
+            <w:tcW w:w="3667" w:type="dxa"/>
+            <w:gridSpan w:val="2"/>
+            <w:tcBorders>
+              <w:top w:val="single" w:sz="4" w:space="0" w:color="auto"/>
+              <w:left w:val="single" w:sz="4" w:space="0" w:color="auto"/>
+              <w:bottom w:val="single" w:sz="4" w:space="0" w:color="auto"/>
+              <w:right w:val="single" w:sz="4" w:space="0" w:color="auto"/>
+            </w:tcBorders>
+            <w:shd w:val="clear" w:color="auto" w:fill="FFFFFF"/>
+            <w:vAlign w:val="center"/>
+          </w:tcPr>
+          <w:p>
+            <w:pPr>
+              <w:keepNext/>
+              <w:keepLines/>
+              <w:suppressLineNumbers/>
+              <w:suppressAutoHyphens/>
+              <w:spacing w:after="0" w:line="256" w:lineRule="auto"/>
+              <w:jc w:val="center"/>
+              <w:rPr>
+                <w:rFonts w:ascii="Times New Roman" w:hAnsi="Times New Roman"/>
+                <w:b/>
+                <w:sz w:val="20"/>
+                <w:szCs w:val="20"/>
+              </w:rPr>
+            </w:pPr>
+            <w:r>
+              <w:rPr>
+                <w:rFonts w:ascii="Times New Roman" w:hAnsi="Times New Roman"/>
+                <w:b/>
+                <w:sz w:val="20"/>
+                <w:szCs w:val="20"/>
+              </w:rPr>
+              <w:t>[NÚMERO_RNC]</w:t>
+            </w:r>
+          </w:p>
+        </w:tc>
+        <w:tc>
+          <w:tcPr>
+            <w:tcW w:w="3033" w:type="dxa"/>
+            <w:gridSpan w:val="3"/>
+            <w:tcBorders>
+              <w:top w:val="single" w:sz="4" w:space="0" w:color="auto"/>
+              <w:left w:val="single" w:sz="4" w:space="0" w:color="auto"/>
+              <w:bottom w:val="single" w:sz="4" w:space="0" w:color="auto"/>
+              <w:right w:val="single" w:sz="4" w:space="0" w:color="auto"/>
+            </w:tcBorders>
+            <w:shd w:val="clear" w:color="auto" w:fill="FFFFFF"/>
+            <w:vAlign w:val="center"/>
+          </w:tcPr>
+          <w:p>
+            <w:pPr>
+              <w:keepNext/>
+              <w:keepLines/>
+              <w:suppressLineNumbers/>
+              <w:suppressAutoHyphens/>
+              <w:spacing w:after="0" w:line="256" w:lineRule="auto"/>
+              <w:rPr>
+                <w:rFonts w:ascii="Times New Roman" w:hAnsi="Times New Roman"/>
+                <w:b/>
+                <w:sz w:val="20"/>
+                <w:szCs w:val="20"/>
+              </w:rPr>
+            </w:pPr>
+            <w:r>
+              <w:rPr>
+                <w:rFonts w:ascii="Times New Roman" w:hAnsi="Times New Roman"/>
+                <w:b/>
+                <w:sz w:val="20"/>
+                <w:szCs w:val="20"/>
+              </w:rPr>
+              <w:t>[DATA_EMISSÃO]</w:t>
+            </w:r>
+          </w:p>
+        </w:tc>
+        <w:tc>
+          <w:tcPr>
+            <w:tcW w:w="2648" w:type="dxa"/>
+            <w:gridSpan w:val="2"/>
+            <w:tcBorders>
+              <w:top w:val="single" w:sz="4" w:space="0" w:color="auto"/>
+              <w:left w:val="single" w:sz="4" w:space="0" w:color="auto"/>
+              <w:bottom w:val="single" w:sz="4" w:space="0" w:color="auto"/>
+              <w:right w:val="single" w:sz="4" w:space="0" w:color="auto"/>
+            </w:tcBorders>
+            <w:shd w:val="clear" w:color="auto" w:fill="FFFFFF"/>
+            <w:vAlign w:val="center"/>
+          </w:tcPr>
+          <w:p>
+            <w:pPr>
+              <w:keepNext/>
+              <w:keepLines/>
+              <w:suppressLineNumbers/>
+              <w:suppressAutoHyphens/>
+              <w:spacing w:after="0" w:line="256" w:lineRule="auto"/>
+              <w:jc w:val="center"/>
+              <w:rPr>
+                <w:rFonts w:ascii="Times New Roman" w:hAnsi="Times New Roman"/>
+                <w:b/>
+                <w:sz w:val="20"/>
+                <w:szCs w:val="20"/>
+              </w:rPr>
+            </w:pPr>
+            <w:r>
+              <w:rPr>
+                <w:rFonts w:ascii="Times New Roman" w:hAnsi="Times New Roman"/>
+                <w:b/>
+                <w:sz w:val="20"/>
+                <w:szCs w:val="20"/>
+              </w:rPr>
+              <w:t>[DATA_HOJE]</w:t>
+            </w:r>
+          </w:p>
+        </w:tc>
+      </w:tr>
+      <w:tr>
+        <w:trPr>
+          <w:cantSplit/>
+          <w:trHeight w:val="844"/>
+          <w:jc w:val="center"/>
+        </w:trPr>
+        <w:tc>
+          <w:tcPr>
+            <w:tcW w:w="5562" w:type="dxa"/>
+            <w:gridSpan w:val="4"/>
+            <w:tcBorders>
+              <w:top w:val="single" w:sz="4" w:space="0" w:color="auto"/>
+              <w:left w:val="single" w:sz="4" w:space="0" w:color="auto"/>
+              <w:bottom w:val="single" w:sz="4" w:space="0" w:color="auto"/>
+              <w:right w:val="single" w:sz="4" w:space="0" w:color="auto"/>
+            </w:tcBorders>
+            <w:hideMark/>
+          </w:tcPr>
+          <w:p>
+            <w:pPr>
+              <w:keepNext/>
+              <w:keepLines/>
+              <w:suppressLineNumbers/>
+              <w:suppressAutoHyphens/>
+              <w:spacing w:after="0" w:line="256" w:lineRule="auto"/>
+              <w:rPr>
+                <w:rFonts w:ascii="Times New Roman" w:hAnsi="Times New Roman"/>
+                <w:b/>
+                <w:sz w:val="20"/>
+                <w:szCs w:val="20"/>
+              </w:rPr>
+            </w:pPr>
+            <w:r>
+              <w:rPr>
+                <w:rFonts w:ascii="Times New Roman" w:hAnsi="Times New Roman"/>
+                <w:b/>
+                <w:sz w:val="20"/>
+                <w:szCs w:val="20"/>
+              </w:rPr>
+              <w:t>LOCAL/ FRENTE:</w:t>
+            </w:r>
+            <w:r>
+              <w:rPr>
+                <w:rFonts w:ascii="Times New Roman" w:hAnsi="Times New Roman"/>
+                <w:b/>
+                <w:sz w:val="20"/>
+                <w:szCs w:val="20"/>
+              </w:rPr>
+              <w:t xml:space="preserve"> </w:t>
+            </w:r>
+            <w:r>
+              <w:rPr>
+                <w:rFonts w:ascii="Times New Roman" w:hAnsi="Times New Roman"/>
+                <w:b/>
+                <w:sz w:val="20"/>
+                <w:szCs w:val="20"/>
+              </w:rPr>
+              <w:t>[LOCAL/ FRENTE]</w:t>
+            </w:r>
+          </w:p>
+          <w:p>
+            <w:pPr>
+              <w:keepNext/>
+              <w:keepLines/>
+              <w:suppressLineNumbers/>
+              <w:suppressAutoHyphens/>
+              <w:spacing w:after="0" w:line="256" w:lineRule="auto"/>
+              <w:rPr>
+                <w:rFonts w:ascii="Times New Roman" w:hAnsi="Times New Roman"/>
+                <w:b/>
+                <w:sz w:val="20"/>
+                <w:szCs w:val="20"/>
+              </w:rPr>
+            </w:pPr>
+          </w:p>
+        </w:tc>
+        <w:tc>
+          <w:tcPr>
+            <w:tcW w:w="3786" w:type="dxa"/>
+            <w:gridSpan w:val="3"/>
+            <w:tcBorders>
+              <w:top w:val="single" w:sz="4" w:space="0" w:color="auto"/>
+              <w:left w:val="single" w:sz="4" w:space="0" w:color="auto"/>
+              <w:bottom w:val="single" w:sz="4" w:space="0" w:color="auto"/>
+              <w:right w:val="single" w:sz="4" w:space="0" w:color="auto"/>
+            </w:tcBorders>
+          </w:tcPr>
+          <w:p>
+            <w:pPr>
+              <w:keepNext/>
+              <w:keepLines/>
+              <w:suppressLineNumbers/>
+              <w:suppressAutoHyphens/>
+              <w:spacing w:after="0" w:line="256" w:lineRule="auto"/>
+              <w:rPr>
+                <w:rFonts w:ascii="Times New Roman" w:hAnsi="Times New Roman"/>
+                <w:b/>
+                <w:sz w:val="20"/>
+                <w:szCs w:val="20"/>
+              </w:rPr>
+            </w:pPr>
+            <w:r>
+              <w:rPr>
+                <w:rFonts w:ascii="Times New Roman" w:hAnsi="Times New Roman"/>
+                <w:b/>
+                <w:sz w:val="20"/>
+                <w:szCs w:val="20"/>
+              </w:rPr>
+              <w:t>CONTRATO:</w:t>
+            </w:r>
+            <w:r>
+              <w:rPr>
+                <w:rFonts w:ascii="Times New Roman" w:hAnsi="Times New Roman"/>
+                <w:b/>
+                <w:sz w:val="20"/>
+                <w:szCs w:val="20"/>
+              </w:rPr>
+              <w:t xml:space="preserve"> </w:t>
+            </w:r>
+            <w:r>
+              <w:rPr>
+                <w:rFonts w:ascii="Times New Roman" w:hAnsi="Times New Roman"/>
+                <w:b/>
+                <w:sz w:val="20"/>
+                <w:szCs w:val="20"/>
+              </w:rPr>
+              <w:t>[CONTRATO]</w:t>
+            </w:r>
+          </w:p>
+        </w:tc>
+      </w:tr>
+      <w:tr>
+        <w:trPr>
+          <w:cantSplit/>
+          <w:trHeight w:val="1134"/>
+          <w:jc w:val="center"/>
+        </w:trPr>
+        <w:tc>
+          <w:tcPr>
+            <w:tcW w:w="9348" w:type="dxa"/>
+            <w:gridSpan w:val="7"/>
+            <w:tcBorders>
+              <w:top w:val="single" w:sz="4" w:space="0" w:color="auto"/>
+              <w:left w:val="single" w:sz="4" w:space="0" w:color="auto"/>
+              <w:bottom w:val="single" w:sz="4" w:space="0" w:color="auto"/>
+              <w:right w:val="single" w:sz="4" w:space="0" w:color="auto"/>
+            </w:tcBorders>
+            <w:hideMark/>
+          </w:tcPr>
+          <w:p>
+            <w:pPr>
+              <w:keepNext/>
+              <w:keepLines/>
+              <w:suppressLineNumbers/>
+              <w:shd w:val="clear" w:color="auto" w:fill="FFFFFF"/>
+              <w:suppressAutoHyphens/>
+              <w:spacing w:after="0" w:line="256" w:lineRule="auto"/>
+              <w:rPr>
+                <w:rFonts w:ascii="Times New Roman" w:eastAsia="Times New Roman" w:hAnsi="Times New Roman"/>
+                <w:color w:val="000000"/>
+                <w:sz w:val="20"/>
+                <w:szCs w:val="20"/>
+                <w:lang w:eastAsia="pt-BR"/>
+              </w:rPr>
+            </w:pPr>
+            <w:r>
+              <w:rPr>
+                <w:rFonts w:ascii="Times New Roman" w:hAnsi="Times New Roman"/>
+                <w:b/>
+                <w:sz w:val="20"/>
+                <w:szCs w:val="20"/>
+              </w:rPr>
+              <w:t>RESPONSÁVEL PELA ÁREA:</w:t>
+            </w:r>
+            <w:r>
+              <w:rPr>
+                <w:rFonts w:ascii="Times New Roman" w:hAnsi="Times New Roman"/>
+                <w:b/>
+                <w:sz w:val="20"/>
+                <w:szCs w:val="20"/>
+              </w:rPr>
+              <w:t xml:space="preserve"> </w:t>
+            </w:r>
+            <w:r>
+              <w:rPr>
+                <w:rFonts w:ascii="Times New Roman" w:hAnsi="Times New Roman"/>
+                <w:b/>
+                <w:sz w:val="20"/>
+                <w:szCs w:val="20"/>
+              </w:rPr>
+              <w:t>[RESPONSÁVEL PELA ÁREA]</w:t>
+            </w:r>
+          </w:p>
+        </w:tc>
+      </w:tr>
+      <w:tr>
+        <w:trPr>
+          <w:trHeight w:val="411"/>
+          <w:jc w:val="center"/>
+        </w:trPr>
+        <w:tc>
+          <w:tcPr>
+            <w:tcW w:w="9348" w:type="dxa"/>
+            <w:gridSpan w:val="7"/>
+            <w:tcBorders>
+              <w:top w:val="single" w:sz="4" w:space="0" w:color="auto"/>
+              <w:left w:val="single" w:sz="4" w:space="0" w:color="auto"/>
+              <w:bottom w:val="single" w:sz="4" w:space="0" w:color="auto"/>
+              <w:right w:val="single" w:sz="4" w:space="0" w:color="auto"/>
+            </w:tcBorders>
+            <w:shd w:val="clear" w:color="auto" w:fill="002060"/>
+            <w:vAlign w:val="center"/>
+            <w:hideMark/>
+          </w:tcPr>
+          <w:p>
+            <w:pPr>
+              <w:keepNext/>
+              <w:keepLines/>
+              <w:suppressLineNumbers/>
+              <w:suppressAutoHyphens/>
+              <w:spacing w:after="0" w:line="256" w:lineRule="auto"/>
+              <w:jc w:val="center"/>
+              <w:rPr>
+                <w:rFonts w:ascii="Times New Roman" w:hAnsi="Times New Roman"/>
+                <w:b/>
+                <w:color w:val="FFFFFF"/>
+                <w:sz w:val="20"/>
+                <w:szCs w:val="20"/>
+              </w:rPr>
+            </w:pPr>
+            <w:r>
+              <w:rPr>
+                <w:rFonts w:ascii="Times New Roman" w:hAnsi="Times New Roman"/>
+                <w:b/>
+                <w:color w:val="FFFFFF"/>
+                <w:sz w:val="20"/>
+                <w:szCs w:val="20"/>
+              </w:rPr>
+              <w:t>TIPO DE OCORRÊNCIA</w:t>
+            </w:r>
+          </w:p>
+        </w:tc>
+      </w:tr>
+      <w:tr>
+        <w:trPr>
+          <w:trHeight w:val="425"/>
+          <w:jc w:val="center"/>
+        </w:trPr>
+        <w:tc>
+          <w:tcPr>
+            <w:tcW w:w="2337" w:type="dxa"/>
+            <w:tcBorders>
+              <w:top w:val="single" w:sz="4" w:space="0" w:color="auto"/>
+              <w:left w:val="single" w:sz="4" w:space="0" w:color="auto"/>
+              <w:bottom w:val="single" w:sz="4" w:space="0" w:color="auto"/>
+              <w:right w:val="single" w:sz="4" w:space="0" w:color="auto"/>
+            </w:tcBorders>
+            <w:vAlign w:val="center"/>
+          </w:tcPr>
+          <w:p>
+            <w:pPr>
+              <w:keepNext/>
+              <w:keepLines/>
+              <w:suppressLineNumbers/>
+              <w:suppressAutoHyphens/>
+              <w:spacing w:after="0" w:line="256" w:lineRule="auto"/>
+              <w:rPr>
+                <w:rFonts w:ascii="Times New Roman" w:hAnsi="Times New Roman"/>
+                <w:b/>
+                <w:sz w:val="20"/>
+                <w:szCs w:val="20"/>
+              </w:rPr>
+            </w:pPr>
+            <w:r>
+              <w:rPr>
+                <w:rFonts w:ascii="Times New Roman" w:hAnsi="Times New Roman"/>
+                <w:b/>
+                <w:noProof/>
+                <w:sz w:val="20"/>
+                <w:szCs w:val="20"/>
+              </w:rPr>
+              <mc:AlternateContent>
+                <mc:Choice Requires="wps">
+                  <w:drawing>
+                    <wp:anchor distT="0" distB="0" distL="114300" distR="114300" simplePos="0" relativeHeight="251656192" behindDoc="0" locked="0" layoutInCell="1" allowOverlap="1" wp14:anchorId="76BF7F04" wp14:editId="09AD3F85">
+                      <wp:simplePos x="0" y="0"/>
+                      <wp:positionH relativeFrom="column">
+                        <wp:posOffset>1148715</wp:posOffset>
+                      </wp:positionH>
+                      <wp:positionV relativeFrom="paragraph">
+                        <wp:posOffset>19050</wp:posOffset>
+                      </wp:positionV>
+                      <wp:extent cx="195580" cy="140335"/>
+                      <wp:effectExtent l="8255" t="8255" r="5715" b="13335"/>
+                      <wp:wrapNone/>
+                      <wp:docPr id="1557458591" name="AutoShape 18"/>
+                      <wp:cNvGraphicFramePr>
+                        <a:graphicFrameLocks xmlns:a="http://schemas.openxmlformats.org/drawingml/2006/main"/>
+                      </wp:cNvGraphicFramePr>
+                      <a:graphic xmlns:a="http://schemas.openxmlformats.org/drawingml/2006/main">
+                        <a:graphicData uri="http://schemas.microsoft.com/office/word/2010/wordprocessingShape">
+                          <wps:wsp>
+                            <wps:cNvSpPr>
+                              <a:spLocks noChangeArrowheads="1"/>
+                            </wps:cNvSpPr>
+                            <wps:spPr bwMode="auto">
+                              <a:xfrm>
+                                <a:off x="0" y="0"/>
+                                <a:ext cx="195580" cy="140335"/>
+                              </a:xfrm>
+                              <a:prstGeom prst="roundRect">
+                                <a:avLst>
+                                  <a:gd name="adj" fmla="val 16667"/>
+                                </a:avLst>
+                              </a:prstGeom>
+                              <a:noFill/>
+                              <a:ln w="9525">
+                                <a:solidFill>
+                                  <a:srgbClr val="196B24"/>
+                                </a:solidFill>
+                                <a:round/>
+                                <a:headEnd/>
+                                <a:tailEnd/>
+                              </a:ln>
+                              <a:effectLst/>
+                              <a:extLst>
+                                <a:ext uri="{909E8E84-426E-40DD-AFC4-6F175D3DCCD1}">
+                                  <a14:hiddenFill xmlns:a14="http://schemas.microsoft.com/office/drawing/2010/main">
+                                    <a:solidFill>
+                                      <a:srgbClr val="FFFFFF"/>
+                                    </a:solidFill>
+                                  </a14:hiddenFill>
+                                </a:ext>
+                                <a:ext uri="{AF507438-7753-43E0-B8FC-AC1667EBCBE1}">
+                                  <a14:hiddenEffects xmlns:a14="http://schemas.microsoft.com/office/drawing/2010/main">
+                                    <a:effectLst>
+                                      <a:outerShdw dist="35921" dir="2700000" algn="ctr" rotWithShape="0">
+                                        <a:srgbClr val="868686"/>
+                                      </a:outerShdw>
+                                    </a:effectLst>
+                                  </a14:hiddenEffects>
+                                </a:ext>
+                              </a:extLst>
+                            </wps:spPr>
+                            <wps:bodyPr rot="0" vert="horz" wrap="square" lIns="91440" tIns="45720" rIns="91440" bIns="45720" anchor="t" anchorCtr="0" upright="1">
+                              <a:noAutofit/>
+                            </wps:bodyPr>
+                          </wps:wsp>
+                        </a:graphicData>
+                      </a:graphic>
+                      <wp14:sizeRelH relativeFrom="page">
+                        <wp14:pctWidth>0</wp14:pctWidth>
+                      </wp14:sizeRelH>
+                      <wp14:sizeRelV relativeFrom="page">
+                        <wp14:pctHeight>0</wp14:pctHeight>
+                      </wp14:sizeRelV>
+                    </wp:anchor>
+                  </w:drawing>
+                </mc:Choice>
+                <mc:Fallback>
+                  <w:pict>
+                    <v:roundrect w14:anchorId="2EBDF774" id="AutoShape 18" o:spid="_x0000_s1026" style="position:absolute;margin-left:90.45pt;margin-top:1.5pt;width:15.4pt;height:11.05pt;z-index:251656192;visibility:visible;mso-wrap-style:square;mso-width-percent:0;mso-height-percent:0;mso-wrap-distance-left:9pt;mso-wrap-distance-top:0;mso-wrap-distance-right:9pt;mso-wrap-distance-bottom:0;mso-position-horizontal:absolute;mso-position-horizontal-relative:text;mso-position-vertical:absolute;mso-position-vertical-relative:text;mso-width-percent:0;mso-height-percent:0;mso-width-relative:page;mso-height-relative:page;v-text-anchor:top" arcsize="10923f" o:gfxdata="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" filled="f" strokecolor="#196b24">
+                      <v:shadow color="#868686"/>
+                    </v:roundrect>
+                  </w:pict>
+                </mc:Fallback>
+              </mc:AlternateContent>
+            </w:r>
+            <w:r>
+              <w:rPr>
+                <w:rFonts w:ascii="Times New Roman" w:hAnsi="Times New Roman"/>
+                <w:b/>
+                <w:sz w:val="20"/>
+                <w:szCs w:val="20"/>
+              </w:rPr>
+              <w:t>MEIO AMBIENTE</w:t>
+            </w:r>
+            <w:r>
+              <w:rPr>
+                <w:rFonts w:ascii="Times New Roman" w:hAnsi="Times New Roman"/>
+                <w:b/>
+                <w:sz w:val="20"/>
+                <w:szCs w:val="20"/>
+              </w:rPr>
+              <w:t>:</w:t>
+            </w:r>
+          </w:p>
+        </w:tc>
+        <w:tc>
+          <w:tcPr>
+            <w:tcW w:w="3100" w:type="dxa"/>
+            <w:gridSpan w:val="2"/>
+            <w:tcBorders>
+              <w:top w:val="single" w:sz="4" w:space="0" w:color="auto"/>
+              <w:left w:val="single" w:sz="4" w:space="0" w:color="auto"/>
+              <w:bottom w:val="single" w:sz="4" w:space="0" w:color="auto"/>
+              <w:right w:val="single" w:sz="4" w:space="0" w:color="auto"/>
+            </w:tcBorders>
+            <w:vAlign w:val="center"/>
+          </w:tcPr>
+          <w:p>
+            <w:pPr>
+              <w:keepNext/>
+              <w:keepLines/>
+              <w:suppressLineNumbers/>
+              <w:suppressAutoHyphens/>
+              <w:spacing w:after="0" w:line="256" w:lineRule="auto"/>
+              <w:rPr>
+                <w:rFonts w:ascii="Times New Roman" w:hAnsi="Times New Roman"/>
+                <w:b/>
+                <w:sz w:val="20"/>
+                <w:szCs w:val="20"/>
+              </w:rPr>
+            </w:pPr>
+            <w:r>
+              <w:rPr>
+                <w:rFonts w:ascii="Times New Roman" w:hAnsi="Times New Roman"/>
+                <w:b/>
+                <w:noProof/>
+                <w:sz w:val="20"/>
+                <w:szCs w:val="20"/>
+              </w:rPr>
+              <mc:AlternateContent>
+                <mc:Choice Requires="wps">
+                  <w:drawing>
+                    <wp:anchor distT="0" distB="0" distL="114300" distR="114300" simplePos="0" relativeHeight="251657216" behindDoc="0" locked="0" layoutInCell="1" allowOverlap="1" wp14:anchorId="2B78AE7F" wp14:editId="71DA8255">
+                      <wp:simplePos x="0" y="0"/>
+                      <wp:positionH relativeFrom="column">
+                        <wp:posOffset>1858645</wp:posOffset>
+                      </wp:positionH>
+                      <wp:positionV relativeFrom="paragraph">
+                        <wp:posOffset>15240</wp:posOffset>
+                      </wp:positionV>
+                      <wp:extent cx="195580" cy="140335"/>
+                      <wp:effectExtent l="10795" t="13970" r="12700" b="7620"/>
+                      <wp:wrapNone/>
+                      <wp:docPr id="801053956" name="AutoShape 19"/>
+                      <wp:cNvGraphicFramePr>
+                        <a:graphicFrameLocks xmlns:a="http://schemas.openxmlformats.org/drawingml/2006/main"/>
+                      </wp:cNvGraphicFramePr>
+                      <a:graphic xmlns:a="http://schemas.openxmlformats.org/drawingml/2006/main">
+                        <a:graphicData uri="http://schemas.microsoft.com/office/word/2010/wordprocessingShape">
+                          <wps:wsp>
+                            <wps:cNvSpPr>
+                              <a:spLocks noChangeArrowheads="1"/>
+                            </wps:cNvSpPr>
+                            <wps:spPr bwMode="auto">
+                              <a:xfrm>
+                                <a:off x="0" y="0"/>
+                                <a:ext cx="195580" cy="140335"/>
+                              </a:xfrm>
+                              <a:prstGeom prst="roundRect">
+                                <a:avLst>
+                                  <a:gd name="adj" fmla="val 16667"/>
+                                </a:avLst>
+                              </a:prstGeom>
+                              <a:noFill/>
+                              <a:ln w="9525">
+                                <a:solidFill>
+                                  <a:srgbClr val="196B24"/>
+                                </a:solidFill>
+                                <a:round/>
+                                <a:headEnd/>
+                                <a:tailEnd/>
+                              </a:ln>
+                              <a:effectLst/>
+                              <a:extLst>
+                                <a:ext uri="{909E8E84-426E-40DD-AFC4-6F175D3DCCD1}">
+                                  <a14:hiddenFill xmlns:a14="http://schemas.microsoft.com/office/drawing/2010/main">
+                                    <a:solidFill>
+                                      <a:srgbClr val="FFFFFF"/>
+                                    </a:solidFill>
+                                  </a14:hiddenFill>
+                                </a:ext>
+                                <a:ext uri="{AF507438-7753-43E0-B8FC-AC1667EBCBE1}">
+                                  <a14:hiddenEffects xmlns:a14="http://schemas.microsoft.com/office/drawing/2010/main">
+                                    <a:effectLst>
+                                      <a:outerShdw dist="35921" dir="2700000" algn="ctr" rotWithShape="0">
+                                        <a:srgbClr val="868686"/>
+                                      </a:outerShdw>
+                                    </a:effectLst>
+                                  </a14:hiddenEffects>
+                                </a:ext>
+                              </a:extLst>
+                            </wps:spPr>
+                            <wps:bodyPr rot="0" vert="horz" wrap="square" lIns="91440" tIns="45720" rIns="91440" bIns="45720" anchor="t" anchorCtr="0" upright="1">
+                              <a:noAutofit/>
+                            </wps:bodyPr>
+                          </wps:wsp>
+                        </a:graphicData>
+                      </a:graphic>
+                      <wp14:sizeRelH relativeFrom="page">
+                        <wp14:pctWidth>0</wp14:pctWidth>
+                      </wp14:sizeRelH>
+                      <wp14:sizeRelV relativeFrom="page">
+                        <wp14:pctHeight>0</wp14:pctHeight>
+                      </wp14:sizeRelV>
+                    </wp:anchor>
+                  </w:drawing>
+                </mc:Choice>
+                <mc:Fallback>
+                  <w:pict>
+                    <v:roundrect w14:anchorId="33B94A96" id="AutoShape 19" o:spid="_x0000_s1026" style="position:absolute;margin-left:146.35pt;margin-top:1.2pt;width:15.4pt;height:11.05pt;z-index:251657216;visibility:visible;mso-wrap-style:square;mso-width-percent:0;mso-height-percent:0;mso-wrap-distance-left:9pt;mso-wrap-distance-top:0;mso-wrap-distance-right:9pt;mso-wrap-distance-bottom:0;mso-position-horizontal:absolute;mso-position-horizontal-relative:text;mso-position-vertical:absolute;mso-position-vertical-relative:text;mso-width-percent:0;mso-height-percent:0;mso-width-relative:page;mso-height-relative:page;v-text-anchor:top" arcsize="10923f" o:gfxdata="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" filled="f" strokecolor="#196b24">
+                      <v:shadow color="#868686"/>
+                    </v:roundrect>
+                  </w:pict>
+                </mc:Fallback>
+              </mc:AlternateContent>
+            </w:r>
+            <w:r>
+              <w:rPr>
+                <w:rFonts w:ascii="Times New Roman" w:hAnsi="Times New Roman"/>
+                <w:b/>
+                <w:sz w:val="20"/>
+                <w:szCs w:val="20"/>
+              </w:rPr>
+              <w:t>SEGURANÇA DO TRABALHO</w:t>
+            </w:r>
+            <w:r>
+              <w:rPr>
+                <w:rFonts w:ascii="Times New Roman" w:hAnsi="Times New Roman"/>
+                <w:b/>
+                <w:sz w:val="20"/>
+                <w:szCs w:val="20"/>
+              </w:rPr>
+              <w:t>:</w:t>
+            </w:r>
+          </w:p>
+        </w:tc>
+        <w:tc>
+          <w:tcPr>
+            <w:tcW w:w="2022" w:type="dxa"/>
+            <w:gridSpan w:val="3"/>
+            <w:tcBorders>
+              <w:top w:val="single" w:sz="4" w:space="0" w:color="auto"/>
+              <w:left w:val="single" w:sz="4" w:space="0" w:color="auto"/>
+              <w:bottom w:val="single" w:sz="4" w:space="0" w:color="auto"/>
+              <w:right w:val="single" w:sz="4" w:space="0" w:color="auto"/>
+            </w:tcBorders>
+            <w:vAlign w:val="center"/>
+          </w:tcPr>
+          <w:p>
+            <w:pPr>
+              <w:keepNext/>
+              <w:keepLines/>
+              <w:suppressLineNumbers/>
+              <w:suppressAutoHyphens/>
+              <w:spacing w:after="0" w:line="256" w:lineRule="auto"/>
+              <w:rPr>
+                <w:rFonts w:ascii="Times New Roman" w:hAnsi="Times New Roman"/>
+                <w:b/>
+                <w:sz w:val="20"/>
+                <w:szCs w:val="20"/>
+              </w:rPr>
+            </w:pPr>
+            <w:r>
+              <w:rPr>
+                <w:rFonts w:ascii="Times New Roman" w:hAnsi="Times New Roman"/>
+                <w:b/>
+                <w:noProof/>
+                <w:sz w:val="20"/>
+                <w:szCs w:val="20"/>
+              </w:rPr>
+              <mc:AlternateContent>
+                <mc:Choice Requires="wps">
+                  <w:drawing>
+                    <wp:anchor distT="0" distB="0" distL="114300" distR="114300" simplePos="0" relativeHeight="251658240" behindDoc="0" locked="0" layoutInCell="1" allowOverlap="1" wp14:anchorId="4FCB034B" wp14:editId="4842015E">
+                      <wp:simplePos x="0" y="0"/>
+                      <wp:positionH relativeFrom="column">
+                        <wp:posOffset>964565</wp:posOffset>
+                      </wp:positionH>
+                      <wp:positionV relativeFrom="paragraph">
+                        <wp:posOffset>15240</wp:posOffset>
+                      </wp:positionV>
+                      <wp:extent cx="195580" cy="140335"/>
+                      <wp:effectExtent l="10160" t="13970" r="13335" b="7620"/>
+                      <wp:wrapNone/>
+                      <wp:docPr id="1760387860" name="AutoShape 20"/>
+                      <wp:cNvGraphicFramePr>
+                        <a:graphicFrameLocks xmlns:a="http://schemas.openxmlformats.org/drawingml/2006/main"/>
+                      </wp:cNvGraphicFramePr>
+                      <a:graphic xmlns:a="http://schemas.openxmlformats.org/drawingml/2006/main">
+                        <a:graphicData uri="http://schemas.microsoft.com/office/word/2010/wordprocessingShape">
+                          <wps:wsp>
+                            <wps:cNvSpPr>
+                              <a:spLocks noChangeArrowheads="1"/>
+                            </wps:cNvSpPr>
+                            <wps:spPr bwMode="auto">
+                              <a:xfrm>
+                                <a:off x="0" y="0"/>
+                                <a:ext cx="195580" cy="140335"/>
+                              </a:xfrm>
+                              <a:prstGeom prst="roundRect">
+                                <a:avLst>
+                                  <a:gd name="adj" fmla="val 16667"/>
+                                </a:avLst>
+                              </a:prstGeom>
+                              <a:noFill/>
+                              <a:ln w="9525">
+                                <a:solidFill>
+                                  <a:srgbClr val="196B24"/>
+                                </a:solidFill>
+                                <a:round/>
+                                <a:headEnd/>
+                                <a:tailEnd/>
+                              </a:ln>
+                              <a:effectLst/>
+                              <a:extLst>
+                                <a:ext uri="{909E8E84-426E-40DD-AFC4-6F175D3DCCD1}">
+                                  <a14:hiddenFill xmlns:a14="http://schemas.microsoft.com/office/drawing/2010/main">
+                                    <a:solidFill>
+                                      <a:srgbClr val="FFFFFF"/>
+                                    </a:solidFill>
+                                  </a14:hiddenFill>
+                                </a:ext>
+                                <a:ext uri="{AF507438-7753-43E0-B8FC-AC1667EBCBE1}">
+                                  <a14:hiddenEffects xmlns:a14="http://schemas.microsoft.com/office/drawing/2010/main">
+                                    <a:effectLst>
+                                      <a:outerShdw dist="35921" dir="2700000" algn="ctr" rotWithShape="0">
+                                        <a:srgbClr val="868686"/>
+                                      </a:outerShdw>
+                                    </a:effectLst>
+                                  </a14:hiddenEffects>
+                                </a:ext>
+                              </a:extLst>
+                            </wps:spPr>
+                            <wps:bodyPr rot="0" vert="horz" wrap="square" lIns="91440" tIns="45720" rIns="91440" bIns="45720" anchor="t" anchorCtr="0" upright="1">
+                              <a:noAutofit/>
+                            </wps:bodyPr>
+                          </wps:wsp>
+                        </a:graphicData>
+                      </a:graphic>
+                      <wp14:sizeRelH relativeFrom="page">
+                        <wp14:pctWidth>0</wp14:pctWidth>
+                      </wp14:sizeRelH>
+                      <wp14:sizeRelV relativeFrom="page">
+                        <wp14:pctHeight>0</wp14:pctHeight>
+                      </wp14:sizeRelV>
+                    </wp:anchor>
+                  </w:drawing>
+                </mc:Choice>
+                <mc:Fallback>
+                  <w:pict>
+                    <v:roundrect w14:anchorId="22AEBB71" id="AutoShape 20" o:spid="_x0000_s1026" style="position:absolute;margin-left:75.95pt;margin-top:1.2pt;width:15.4pt;height:11.05pt;z-index:251658240;visibility:visible;mso-wrap-style:square;mso-width-percent:0;mso-height-percent:0;mso-wrap-distance-left:9pt;mso-wrap-distance-top:0;mso-wrap-distance-right:9pt;mso-wrap-distance-bottom:0;mso-position-horizontal:absolute;mso-position-horizontal-relative:text;mso-position-vertical:absolute;mso-position-vertical-relative:text;mso-width-percent:0;mso-height-percent:0;mso-width-relative:page;mso-height-relative:page;v-text-anchor:top" arcsize="10923f" o:gfxdata="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" filled="f" strokecolor="#196b24">
+                      <v:shadow color="#868686"/>
+                    </v:roundrect>
+                  </w:pict>
+                </mc:Fallback>
+              </mc:AlternateContent>
+            </w:r>
+            <w:r>
+              <w:rPr>
+                <w:rFonts w:ascii="Times New Roman" w:hAnsi="Times New Roman"/>
+                <w:b/>
+                <w:sz w:val="20"/>
+                <w:szCs w:val="20"/>
+              </w:rPr>
+              <w:t>ENGENHARIA</w:t>
+            </w:r>
+            <w:r>
+              <w:rPr>
+                <w:rFonts w:ascii="Times New Roman" w:hAnsi="Times New Roman"/>
+                <w:b/>
+                <w:sz w:val="20"/>
+                <w:szCs w:val="20"/>
+              </w:rPr>
+              <w:t>:</w:t>
+            </w:r>
+          </w:p>
+        </w:tc>
+        <w:tc>
+          <w:tcPr>
+            <w:tcW w:w="1889" w:type="dxa"/>
+            <w:tcBorders>
+              <w:top w:val="single" w:sz="4" w:space="0" w:color="auto"/>
+              <w:left w:val="single" w:sz="4" w:space="0" w:color="auto"/>
+              <w:bottom w:val="single" w:sz="4" w:space="0" w:color="auto"/>
+              <w:right w:val="single" w:sz="4" w:space="0" w:color="auto"/>
+            </w:tcBorders>
+            <w:vAlign w:val="center"/>
+          </w:tcPr>
+          <w:p>
+            <w:pPr>
+              <w:keepNext/>
+              <w:keepLines/>
+              <w:suppressLineNumbers/>
+              <w:suppressAutoHyphens/>
+              <w:spacing w:after="0" w:line="256" w:lineRule="auto"/>
+              <w:rPr>
+                <w:rFonts w:ascii="Times New Roman" w:hAnsi="Times New Roman"/>
+                <w:b/>
+                <w:sz w:val="20"/>
+                <w:szCs w:val="20"/>
+              </w:rPr>
+            </w:pPr>
+            <w:r>
+              <w:rPr>
+                <w:rFonts w:ascii="Times New Roman" w:hAnsi="Times New Roman"/>
+                <w:b/>
+                <w:noProof/>
+                <w:sz w:val="20"/>
+                <w:szCs w:val="20"/>
+              </w:rPr>
+              <mc:AlternateContent>
+                <mc:Choice Requires="wps">
+                  <w:drawing>
+                    <wp:anchor distT="0" distB="0" distL="114300" distR="114300" simplePos="0" relativeHeight="251659264" behindDoc="0" locked="0" layoutInCell="1" allowOverlap="1" wp14:anchorId="3A4A4730" wp14:editId="1DD36CBA">
+                      <wp:simplePos x="0" y="0"/>
+                      <wp:positionH relativeFrom="column">
+                        <wp:posOffset>567690</wp:posOffset>
+                      </wp:positionH>
+                      <wp:positionV relativeFrom="paragraph">
+                        <wp:posOffset>24765</wp:posOffset>
+                      </wp:positionV>
+                      <wp:extent cx="195580" cy="140335"/>
+                      <wp:effectExtent l="5715" t="13970" r="8255" b="7620"/>
+                      <wp:wrapNone/>
+                      <wp:docPr id="476071933" name="AutoShape 21"/>
+                      <wp:cNvGraphicFramePr>
+                        <a:graphicFrameLocks xmlns:a="http://schemas.openxmlformats.org/drawingml/2006/main"/>
+                      </wp:cNvGraphicFramePr>
+                      <a:graphic xmlns:a="http://schemas.openxmlformats.org/drawingml/2006/main">
+                        <a:graphicData uri="http://schemas.microsoft.com/office/word/2010/wordprocessingShape">
+                          <wps:wsp>
+                            <wps:cNvSpPr>
+                              <a:spLocks noChangeArrowheads="1"/>
+                            </wps:cNvSpPr>
+                            <wps:spPr bwMode="auto">
+                              <a:xfrm>
+                                <a:off x="0" y="0"/>
+                                <a:ext cx="195580" cy="140335"/>
+                              </a:xfrm>
+                              <a:prstGeom prst="roundRect">
+                                <a:avLst>
+                                  <a:gd name="adj" fmla="val 16667"/>
+                                </a:avLst>
+                              </a:prstGeom>
+                              <a:noFill/>
+                              <a:ln w="9525">
+                                <a:solidFill>
+                                  <a:srgbClr val="196B24"/>
+                                </a:solidFill>
+                                <a:round/>
+                                <a:headEnd/>
+                                <a:tailEnd/>
+                              </a:ln>
+                              <a:effectLst/>
+                              <a:extLst>
+                                <a:ext uri="{909E8E84-426E-40DD-AFC4-6F175D3DCCD1}">
+                                  <a14:hiddenFill xmlns:a14="http://schemas.microsoft.com/office/drawing/2010/main">
+                                    <a:solidFill>
+                                      <a:srgbClr val="FFFFFF"/>
+                                    </a:solidFill>
+                                  </a14:hiddenFill>
+                                </a:ext>
+                                <a:ext uri="{AF507438-7753-43E0-B8FC-AC1667EBCBE1}">
+                                  <a14:hiddenEffects xmlns:a14="http://schemas.microsoft.com/office/drawing/2010/main">
+                                    <a:effectLst>
+                                      <a:outerShdw dist="35921" dir="2700000" algn="ctr" rotWithShape="0">
+                                        <a:srgbClr val="868686"/>
+                                      </a:outerShdw>
+                                    </a:effectLst>
+                                  </a14:hiddenEffects>
+                                </a:ext>
+                              </a:extLst>
+                            </wps:spPr>
+                            <wps:bodyPr rot="0" vert="horz" wrap="square" lIns="91440" tIns="45720" rIns="91440" bIns="45720" anchor="t" anchorCtr="0" upright="1">
+                              <a:noAutofit/>
+                            </wps:bodyPr>
+                          </wps:wsp>
+                        </a:graphicData>
+                      </a:graphic>
+                      <wp14:sizeRelH relativeFrom="page">
+                        <wp14:pctWidth>0</wp14:pctWidth>
+                      </wp14:sizeRelH>
+                      <wp14:sizeRelV relativeFrom="page">
+                        <wp14:pctHeight>0</wp14:pctHeight>
+                      </wp14:sizeRelV>
+                    </wp:anchor>
+                  </w:drawing>
+                </mc:Choice>
+                <mc:Fallback>
+                  <w:pict>
+                    <v:roundrect w14:anchorId="0C1EC122" id="AutoShape 21" o:spid="_x0000_s1026" style="position:absolute;margin-left:44.7pt;margin-top:1.95pt;width:15.4pt;height:11.05pt;z-index:251659264;visibility:visible;mso-wrap-style:square;mso-width-percent:0;mso-height-percent:0;mso-wrap-distance-left:9pt;mso-wrap-distance-top:0;mso-wrap-distance-right:9pt;mso-wrap-distance-bottom:0;mso-position-horizontal:absolute;mso-position-horizontal-relative:text;mso-position-vertical:absolute;mso-position-vertical-relative:text;mso-width-percent:0;mso-height-percent:0;mso-width-relative:page;mso-height-relative:page;v-text-anchor:top" arcsize="10923f" o:gfxdata="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" filled="f" strokecolor="#196b24">
+                      <v:shadow color="#868686"/>
+                    </v:roundrect>
+                  </w:pict>
+                </mc:Fallback>
+              </mc:AlternateContent>
+            </w:r>
+            <w:r>
+              <w:rPr>
+                <w:rFonts w:ascii="Times New Roman" w:hAnsi="Times New Roman"/>
+                <w:b/>
+                <w:sz w:val="20"/>
+                <w:szCs w:val="20"/>
+              </w:rPr>
+              <w:t>SOCIAL</w:t>
+            </w:r>
+            <w:r>
+              <w:rPr>
+                <w:rFonts w:ascii="Times New Roman" w:hAnsi="Times New Roman"/>
+                <w:b/>
+                <w:sz w:val="20"/>
+                <w:szCs w:val="20"/>
+              </w:rPr>
+              <w:t>:</w:t>
+            </w:r>
+          </w:p>
+        </w:tc>
+      </w:tr>
+      <w:tr>
+        <w:trPr>
+          <w:cantSplit/>
+          <w:trHeight w:val="1977"/>
+          <w:jc w:val="center"/>
+        </w:trPr>
+        <w:tc>
+          <w:tcPr>
+            <w:tcW w:w="9348" w:type="dxa"/>
+            <w:gridSpan w:val="7"/>
+            <w:tcBorders>
+              <w:top w:val="single" w:sz="4" w:space="0" w:color="auto"/>
+              <w:left w:val="single" w:sz="4" w:space="0" w:color="auto"/>
+              <w:bottom w:val="single" w:sz="4" w:space="0" w:color="auto"/>
+              <w:right w:val="single" w:sz="4" w:space="0" w:color="auto"/>
+            </w:tcBorders>
+            <w:hideMark/>
+          </w:tcPr>
+          <w:p>
+            <w:pPr>
+              <w:keepNext/>
+              <w:keepLines/>
+              <w:suppressLineNumbers/>
+              <w:suppressAutoHyphens/>
+              <w:spacing w:before="240" w:after="0" w:line="256" w:lineRule="auto"/>
+              <w:rPr>
+                <w:rFonts w:ascii="Times New Roman" w:hAnsi="Times New Roman"/>
+                <w:b/>
+                <w:sz w:val="20"/>
+                <w:szCs w:val="20"/>
+              </w:rPr>
+            </w:pPr>
+            <w:r>
+              <w:rPr>
+                <w:rFonts w:ascii="Times New Roman" w:eastAsia="Times New Roman" w:hAnsi="Times New Roman"/>
+                <w:b/>
+                <w:color w:val="000000"/>
+                <w:sz w:val="20"/>
+                <w:szCs w:val="20"/>
+                <w:lang w:eastAsia="pt-BR"/>
+              </w:rPr>
+              <w:t>ANÁLISE DA OCORRÊNCIA</w:t>
+            </w:r>
+            <w:r>
+              <w:rPr>
+                <w:rFonts w:ascii="Times New Roman" w:eastAsia="Times New Roman" w:hAnsi="Times New Roman"/>
+                <w:b/>
+                <w:color w:val="000000"/>
+                <w:sz w:val="20"/>
+                <w:szCs w:val="20"/>
+                <w:lang w:eastAsia="pt-BR"/>
+              </w:rPr>
+              <w:t>:</w:t>
+            </w:r>
+            <w:r>
+              <w:t xml:space="preserve"> </w:t>
+            </w:r>
+            <w:r>
+              <w:rPr>
+                <w:rFonts w:ascii="Times New Roman" w:eastAsia="Times New Roman" w:hAnsi="Times New Roman"/>
+                <w:b/>
+                <w:color w:val="000000"/>
+                <w:sz w:val="20"/>
+                <w:szCs w:val="20"/>
+                <w:lang w:eastAsia="pt-BR"/>
+              </w:rPr>
+              <w:t>[DESCRIÇÃO_OCORRÊNCIA]</w:t>
+            </w:r>
+          </w:p>
+        </w:tc>
+      </w:tr>
+      <w:tr>
+        <w:trPr>
+          <w:cantSplit/>
+          <w:trHeight w:val="2171"/>
+          <w:jc w:val="center"/>
+        </w:trPr>
+        <w:tc>
+          <w:tcPr>
+            <w:tcW w:w="9348" w:type="dxa"/>
+            <w:gridSpan w:val="7"/>
+            <w:tcBorders>
+              <w:top w:val="single" w:sz="4" w:space="0" w:color="auto"/>
+              <w:left w:val="single" w:sz="4" w:space="0" w:color="auto"/>
+              <w:bottom w:val="single" w:sz="4" w:space="0" w:color="auto"/>
+              <w:right w:val="single" w:sz="4" w:space="0" w:color="auto"/>
+            </w:tcBorders>
+            <w:hideMark/>
+          </w:tcPr>
+          <w:p>
+            <w:pPr>
+              <w:keepNext/>
+              <w:keepLines/>
+              <w:suppressLineNumbers/>
+              <w:suppressAutoHyphens/>
+              <w:spacing w:before="240" w:after="0" w:line="256" w:lineRule="auto"/>
+              <w:rPr>
+                <w:rFonts w:ascii="Times New Roman" w:hAnsi="Times New Roman"/>
+                <w:b/>
+                <w:sz w:val="20"/>
+                <w:szCs w:val="20"/>
+              </w:rPr>
+            </w:pPr>
+            <w:r>
+              <w:rPr>
+                <w:rFonts w:ascii="Times New Roman" w:eastAsia="Times New Roman" w:hAnsi="Times New Roman"/>
+                <w:b/>
+                <w:color w:val="000000"/>
+                <w:sz w:val="20"/>
+                <w:szCs w:val="20"/>
+                <w:lang w:eastAsia="pt-BR"/>
+              </w:rPr>
+              <w:t>MEDIDAS CORRETIVAS</w:t>
+            </w:r>
+            <w:r>
+              <w:rPr>
+                <w:rFonts w:ascii="Times New Roman" w:eastAsia="Times New Roman" w:hAnsi="Times New Roman"/>
+                <w:b/>
+                <w:color w:val="000000"/>
+                <w:sz w:val="20"/>
+                <w:szCs w:val="20"/>
+                <w:lang w:eastAsia="pt-BR"/>
+              </w:rPr>
+              <w:t>:</w:t>
+            </w:r>
+            <w:r>
+              <w:rPr>
+                <w:rFonts w:ascii="Times New Roman" w:eastAsia="Times New Roman" w:hAnsi="Times New Roman"/>
+                <w:b/>
+                <w:color w:val="000000"/>
+                <w:sz w:val="20"/>
+                <w:szCs w:val="20"/>
+                <w:lang w:eastAsia="pt-BR"/>
+              </w:rPr>
+              <w:t xml:space="preserve"> </w:t>
+            </w:r>
+            <w:r>
+              <w:rPr>
+                <w:rFonts w:ascii="Times New Roman" w:eastAsia="Times New Roman" w:hAnsi="Times New Roman"/>
+                <w:b/>
+                <w:color w:val="000000"/>
+                <w:sz w:val="20"/>
+                <w:szCs w:val="20"/>
+                <w:lang w:eastAsia="pt-BR"/>
+              </w:rPr>
+              <w:t>[MEDIDAS_CORRETIVAS]</w:t>
+            </w:r>
+          </w:p>
+        </w:tc>
+      </w:tr>
+      <w:tr>
+        <w:trPr>
+          <w:cantSplit/>
+          <w:trHeight w:val="2394"/>
+          <w:jc w:val="center"/>
+        </w:trPr>
+        <w:tc>
+          <w:tcPr>
+            <w:tcW w:w="9348" w:type="dxa"/>
+            <w:gridSpan w:val="7"/>
+            <w:tcBorders>
+              <w:top w:val="single" w:sz="4" w:space="0" w:color="auto"/>
+              <w:left w:val="single" w:sz="4" w:space="0" w:color="auto"/>
+              <w:bottom w:val="single" w:sz="4" w:space="0" w:color="auto"/>
+              <w:right w:val="single" w:sz="4" w:space="0" w:color="auto"/>
+            </w:tcBorders>
+            <w:hideMark/>
+          </w:tcPr>
+          <w:p>
+            <w:pPr>
+              <w:spacing w:before="240" w:after="0"/>
+              <w:rPr>
+                <w:rFonts w:ascii="Times New Roman" w:eastAsia="Times New Roman" w:hAnsi="Times New Roman"/>
+                <w:b/>
+                <w:color w:val="000000"/>
+                <w:sz w:val="20"/>
+                <w:szCs w:val="20"/>
+                <w:lang w:eastAsia="pt-BR"/>
+              </w:rPr>
+            </w:pPr>
+            <w:r>
+              <w:rPr>
+                <w:rFonts w:ascii="Times New Roman" w:eastAsia="Times New Roman" w:hAnsi="Times New Roman"/>
+                <w:b/>
+                <w:color w:val="000000"/>
+                <w:sz w:val="20"/>
+                <w:szCs w:val="20"/>
+                <w:lang w:eastAsia="pt-BR"/>
+              </w:rPr>
+              <w:t>OBSERVAÇÕES (SE HOUVER)</w:t>
+            </w:r>
+            <w:r>
+              <w:rPr>
+                <w:rFonts w:ascii="Times New Roman" w:eastAsia="Times New Roman" w:hAnsi="Times New Roman"/>
+                <w:b/>
+                <w:color w:val="000000"/>
+                <w:sz w:val="20"/>
+                <w:szCs w:val="20"/>
+                <w:lang w:eastAsia="pt-BR"/>
+              </w:rPr>
+              <w:t>:</w:t>
+            </w:r>
+            <w:r>
+              <w:rPr>
+                <w:rFonts w:ascii="Times New Roman" w:eastAsia="Times New Roman" w:hAnsi="Times New Roman"/>
+                <w:b/>
+                <w:color w:val="000000"/>
+                <w:sz w:val="20"/>
+                <w:szCs w:val="20"/>
+                <w:lang w:eastAsia="pt-BR"/>
+              </w:rPr>
+              <w:t xml:space="preserve"> </w:t>
+            </w:r>
+            <w:r>
+              <w:rPr>
+                <w:rFonts w:ascii="Times New Roman" w:eastAsia="Times New Roman" w:hAnsi="Times New Roman"/>
+                <w:b/>
+                <w:color w:val="000000"/>
+                <w:sz w:val="20"/>
+                <w:szCs w:val="20"/>
+                <w:lang w:eastAsia="pt-BR"/>
+              </w:rPr>
+              <w:t>[OBSERVAÇÕES]</w:t>
+            </w:r>
+          </w:p>
+        </w:tc>
+      </w:tr>
+    </w:tbl>
+    <w:p>
+      <w:pPr>
+        <w:pStyle w:val="Corpodetexto"/>
+        <w:spacing w:before="9" w:line="360" w:lineRule="auto"/>
+        <w:rPr>
+          <w:rFonts w:ascii="Times New Roman" w:hAnsi="Times New Roman" w:cs="Times New Roman"/>
+          <w:color w:val="000000"/>
+        </w:rPr>
+      </w:pPr>
+    </w:p>
+    <w:p>
+      <w:pPr>
+        <w:pStyle w:val="Corpodetexto"/>
+        <w:spacing w:before="9" w:line="360" w:lineRule="auto"/>
+        <w:rPr>
+          <w:rFonts w:ascii="Times New Roman" w:hAnsi="Times New Roman" w:cs="Times New Roman"/>
+          <w:color w:val="000000"/>
+        </w:rPr>
+      </w:pPr>
+      <w:r>
+        <w:rPr>
+          <w:rFonts w:ascii="Times New Roman" w:hAnsi="Times New Roman" w:cs="Times New Roman"/>
+          <w:color w:val="000000"/>
+        </w:rPr>
+        <w:br w:type="page"/>
+      </w:r>
+    </w:p>
+    <w:tbl>
+      <w:tblPr>
+        <w:tblW w:w="0" w:type="auto"/>
+        <w:tblInd w:w="817" w:type="dxa"/>
+        <w:tblBorders>
+          <w:top w:val="single" w:sz="4" w:space="0" w:color="000000"/>
+          <w:left w:val="single" w:sz="4" w:space="0" w:color="000000"/>
+          <w:bottom w:val="single" w:sz="4" w:space="0" w:color="000000"/>
+          <w:right w:val="single" w:sz="4" w:space="0" w:color="000000"/>
+          <w:insideH w:val="single" w:sz="4" w:space="0" w:color="000000"/>
+          <w:insideV w:val="single" w:sz="4" w:space="0" w:color="000000"/>
+        </w:tblBorders>
+        <w:tblLook w:val="04A0" w:firstRow="1" w:lastRow="0" w:firstColumn="1" w:lastColumn="0" w:noHBand="0" w:noVBand="1"/>
+      </w:tblPr>
+      <w:tblGrid>
+        <w:gridCol w:w="4193"/>
+        <w:gridCol w:w="4193"/>
+      </w:tblGrid>
+      <w:tr>
+        <w:trPr>
+          <w:trHeight w:val="236"/>
+        </w:trPr>
+        <w:tc>
+          <w:tcPr>
+            <w:tcW w:w="8386" w:type="dxa"/>
+            <w:gridSpan w:val="2"/>
+            <w:tcBorders>
+              <w:top w:val="single" w:sz="4" w:space="0" w:color="000000"/>
+              <w:left w:val="single" w:sz="4" w:space="0" w:color="000000"/>
+              <w:bottom w:val="single" w:sz="4" w:space="0" w:color="000000"/>
+              <w:right w:val="single" w:sz="4" w:space="0" w:color="000000"/>
+            </w:tcBorders>
+            <w:shd w:val="clear" w:color="auto" w:fill="002060"/>
+            <w:vAlign w:val="center"/>
+            <w:hideMark/>
+          </w:tcPr>
+          <w:p>
+            <w:pPr>
+              <w:jc w:val="center"/>
+              <w:rPr>
+                <w:rFonts w:ascii="Times New Roman" w:hAnsi="Times New Roman"/>
+                <w:b/>
+                <w:bCs/>
+                <w:color w:val="FFFFFF"/>
+              </w:rPr>
+            </w:pPr>
+            <w:r>
+              <w:rPr>
+                <w:rFonts w:ascii="Times New Roman" w:hAnsi="Times New Roman"/>
+                <w:b/>
+                <w:bCs/>
+                <w:color w:val="FFFFFF"/>
+              </w:rPr>
+              <w:t>REGISTRO FOTOGRÁFICO DA AÇÃO CORRETIVA</w:t>
+            </w:r>
+          </w:p>
+        </w:tc>
+      </w:tr>
+      <w:tr>
+        <w:trPr>
+          <w:trHeight w:val="236"/>
+        </w:trPr>
+        <w:tc>
+          <w:tcPr>
+            <w:tcW w:w="4193" w:type="dxa"/>
+            <w:tcBorders>
+              <w:top w:val="single" w:sz="4" w:space="0" w:color="000000"/>
+              <w:left w:val="single" w:sz="4" w:space="0" w:color="000000"/>
+              <w:bottom w:val="single" w:sz="4" w:space="0" w:color="000000"/>
+              <w:right w:val="single" w:sz="4" w:space="0" w:color="000000"/>
+            </w:tcBorders>
+            <w:shd w:val="clear" w:color="auto" w:fill="002060"/>
+            <w:vAlign w:val="center"/>
+          </w:tcPr>
+          <w:p>
+            <w:pPr>
+              <w:jc w:val="center"/>
+              <w:rPr>
+                <w:rFonts w:ascii="Times New Roman" w:hAnsi="Times New Roman"/>
+                <w:b/>
+                <w:bCs/>
+                <w:color w:val="FFFFFF"/>
+              </w:rPr>
+            </w:pPr>
+            <w:r>
+              <w:rPr>
+                <w:rFonts w:ascii="Times New Roman" w:hAnsi="Times New Roman"/>
+                <w:b/>
+                <w:color w:val="FFFFFF"/>
+                <w:lang w:eastAsia="pt-BR"/>
+              </w:rPr>
+              <w:t>FOTO 1 –</w:t>
+            </w:r>
+            <w:r>
+              <w:rPr>
+                <w:rFonts w:ascii="Times New Roman" w:hAnsi="Times New Roman"/>
+                <w:color w:val="FFFFFF"/>
+                <w:lang w:eastAsia="pt-BR"/>
+              </w:rPr>
+              <w:t xml:space="preserve"> </w:t>
+            </w:r>
+            <w:r>
+              <w:rPr>
+                <w:rFonts w:ascii="Times New Roman" w:hAnsi="Times New Roman"/>
+                <w:color w:val="FFFFFF"/>
+                <w:lang w:eastAsia="pt-BR"/>
+              </w:rPr>
+              <w:t>[LEGENDA</w:t>
+            </w:r>
+            <w:r>
+              <w:rPr>
+                <w:rFonts w:ascii="Times New Roman" w:hAnsi="Times New Roman"/>
+                <w:color w:val="FFFFFF"/>
+                <w:lang w:eastAsia="pt-BR"/>
+              </w:rPr>
+              <w:t>1</w:t>
+            </w:r>
+            <w:r>
+              <w:rPr>
+                <w:rFonts w:ascii="Times New Roman" w:hAnsi="Times New Roman"/>
+                <w:color w:val="FFFFFF"/>
+                <w:lang w:eastAsia="pt-BR"/>
+              </w:rPr>
+              <w:t>]</w:t>
+            </w:r>
+          </w:p>
+        </w:tc>
+        <w:tc>
+          <w:tcPr>
+            <w:tcW w:w="4193" w:type="dxa"/>
+            <w:tcBorders>
+              <w:top w:val="single" w:sz="4" w:space="0" w:color="000000"/>
+              <w:left w:val="single" w:sz="4" w:space="0" w:color="000000"/>
+              <w:bottom w:val="single" w:sz="4" w:space="0" w:color="000000"/>
+              <w:right w:val="single" w:sz="4" w:space="0" w:color="000000"/>
+            </w:tcBorders>
+            <w:shd w:val="clear" w:color="auto" w:fill="002060"/>
+            <w:vAlign w:val="center"/>
+          </w:tcPr>
+          <w:p>
+            <w:pPr>
+              <w:jc w:val="center"/>
+              <w:rPr>
+                <w:rFonts w:ascii="Times New Roman" w:hAnsi="Times New Roman"/>
+                <w:b/>
+                <w:bCs/>
+                <w:color w:val="FFFFFF"/>
+              </w:rPr>
+            </w:pPr>
+            <w:r>
+              <w:rPr>
+                <w:rFonts w:ascii="Times New Roman" w:hAnsi="Times New Roman"/>
+                <w:b/>
+                <w:color w:val="FFFFFF"/>
+                <w:lang w:eastAsia="pt-BR"/>
+              </w:rPr>
+              <w:t>FOTO 2 –</w:t>
+            </w:r>
+            <w:r>
+              <w:rPr>
+                <w:rFonts w:ascii="Times New Roman" w:hAnsi="Times New Roman"/>
+                <w:color w:val="FFFFFF"/>
+                <w:lang w:eastAsia="pt-BR"/>
+              </w:rPr>
+              <w:t xml:space="preserve"> </w:t>
+            </w:r>
+            <w:r>
+              <w:rPr>
+                <w:rFonts w:ascii="Times New Roman" w:hAnsi="Times New Roman"/>
+                <w:color w:val="FFFFFF"/>
+                <w:lang w:eastAsia="pt-BR"/>
+              </w:rPr>
+              <w:t>[LEGENDA</w:t>
+            </w:r>
+            <w:r>
+              <w:rPr>
+                <w:rFonts w:ascii="Times New Roman" w:hAnsi="Times New Roman"/>
+                <w:color w:val="FFFFFF"/>
+                <w:lang w:eastAsia="pt-BR"/>
+              </w:rPr>
+              <w:t>2</w:t>
+            </w:r>
+            <w:r>
+              <w:rPr>
+                <w:rFonts w:ascii="Times New Roman" w:hAnsi="Times New Roman"/>
+                <w:color w:val="FFFFFF"/>
+                <w:lang w:eastAsia="pt-BR"/>
+              </w:rPr>
+              <w:t>]</w:t>
+            </w:r>
+          </w:p>
+        </w:tc>
+      </w:tr>
+      <w:tr>
+        <w:trPr>
+          <w:trHeight w:val="2671"/>
+        </w:trPr>
+        <w:tc>
+          <w:tcPr>
+            <w:tcW w:w="4193" w:type="dxa"/>
+            <w:tcBorders>
+              <w:top w:val="single" w:sz="4" w:space="0" w:color="000000"/>
+              <w:left w:val="single" w:sz="4" w:space="0" w:color="000000"/>
+              <w:bottom w:val="single" w:sz="4" w:space="0" w:color="000000"/>
+              <w:right w:val="single" w:sz="4" w:space="0" w:color="000000"/>
+            </w:tcBorders>
+          </w:tcPr>
+          <w:p>
+            <w:pPr>
+              <w:shd w:val="clear" w:color="auto" w:fill="FFFFFF"/>
+              <w:spacing w:before="240"/>
+              <w:rPr>
+                <w:rFonts w:ascii="Times New Roman" w:hAnsi="Times New Roman"/>
+                <w:lang w:eastAsia="pt-BR"/>
+              </w:rPr>
+            </w:pPr>
+            <w:r>
+              <w:rPr>
+                <w:rFonts w:ascii="Times New Roman" w:hAnsi="Times New Roman"/>
+                <w:lang w:eastAsia="pt-BR"/>
+              </w:rPr>
+              <w:t>[FOTO_1]</w:t>
+            </w:r>
+          </w:p>
+        </w:tc>
+        <w:tc>
+          <w:tcPr>
+            <w:tcW w:w="4193" w:type="dxa"/>
+            <w:tcBorders>
+              <w:top w:val="single" w:sz="4" w:space="0" w:color="000000"/>
+              <w:left w:val="single" w:sz="4" w:space="0" w:color="000000"/>
+              <w:bottom w:val="single" w:sz="4" w:space="0" w:color="000000"/>
+              <w:right w:val="single" w:sz="4" w:space="0" w:color="000000"/>
+            </w:tcBorders>
+          </w:tcPr>
+          <w:p>
+            <w:pPr>
+              <w:shd w:val="clear" w:color="auto" w:fill="FFFFFF"/>
+              <w:spacing w:before="240"/>
+              <w:rPr>
+                <w:rFonts w:ascii="Times New Roman" w:hAnsi="Times New Roman"/>
+                <w:lang w:eastAsia="pt-BR"/>
+              </w:rPr>
+            </w:pPr>
+            <w:r>
+              <w:rPr>
+                <w:rFonts w:ascii="Times New Roman" w:hAnsi="Times New Roman"/>
+                <w:lang w:eastAsia="pt-BR"/>
+              </w:rPr>
+              <w:t>[FOTO_</w:t>
+            </w:r>
+            <w:r>
+              <w:rPr>
+                <w:rFonts w:ascii="Times New Roman" w:hAnsi="Times New Roman"/>
+                <w:lang w:eastAsia="pt-BR"/>
+              </w:rPr>
+              <w:t>2</w:t>
+            </w:r>
+            <w:r>
+              <w:rPr>
+                <w:rFonts w:ascii="Times New Roman" w:hAnsi="Times New Roman"/>
+                <w:lang w:eastAsia="pt-BR"/>
+              </w:rPr>
+              <w:t>]</w:t>
+            </w:r>
+          </w:p>
+        </w:tc>
+      </w:tr>
+      <w:tr>
+        <w:trPr>
+          <w:trHeight w:val="381"/>
+        </w:trPr>
+        <w:tc>
+          <w:tcPr>
+            <w:tcW w:w="4193" w:type="dxa"/>
+            <w:tcBorders>
+              <w:top w:val="single" w:sz="4" w:space="0" w:color="000000"/>
+              <w:left w:val="single" w:sz="4" w:space="0" w:color="000000"/>
+              <w:bottom w:val="single" w:sz="4" w:space="0" w:color="000000"/>
+              <w:right w:val="single" w:sz="4" w:space="0" w:color="000000"/>
+            </w:tcBorders>
+            <w:shd w:val="clear" w:color="auto" w:fill="002060"/>
+            <w:hideMark/>
+          </w:tcPr>
+          <w:p>
+            <w:pPr>
+              <w:jc w:val="center"/>
+              <w:rPr>
+                <w:rFonts w:ascii="Times New Roman" w:hAnsi="Times New Roman"/>
+                <w:color w:val="FFFFFF"/>
+                <w:lang w:eastAsia="pt-BR"/>
+              </w:rPr>
+            </w:pPr>
+            <w:r>
+              <w:rPr>
+                <w:rFonts w:ascii="Times New Roman" w:hAnsi="Times New Roman"/>
+                <w:b/>
+                <w:color w:val="FFFFFF"/>
+                <w:lang w:eastAsia="pt-BR"/>
+              </w:rPr>
+              <w:t>FOTO 3 –</w:t>
+            </w:r>
+            <w:r>
+              <w:rPr>
+                <w:rFonts w:ascii="Times New Roman" w:hAnsi="Times New Roman"/>
+                <w:color w:val="FFFFFF"/>
+                <w:lang w:eastAsia="pt-BR"/>
+              </w:rPr>
+              <w:t xml:space="preserve"> </w:t>
+            </w:r>
+            <w:r>
+              <w:rPr>
+                <w:rFonts w:ascii="Times New Roman" w:hAnsi="Times New Roman"/>
+                <w:color w:val="FFFFFF"/>
+                <w:lang w:eastAsia="pt-BR"/>
+              </w:rPr>
+              <w:t>[LEGENDA</w:t>
+            </w:r>
+            <w:r>
+              <w:rPr>
+                <w:rFonts w:ascii="Times New Roman" w:hAnsi="Times New Roman"/>
+                <w:color w:val="FFFFFF"/>
+                <w:lang w:eastAsia="pt-BR"/>
+              </w:rPr>
+              <w:t>3</w:t>
+            </w:r>
+            <w:r>
+              <w:rPr>
+                <w:rFonts w:ascii="Times New Roman" w:hAnsi="Times New Roman"/>
+                <w:color w:val="FFFFFF"/>
+                <w:lang w:eastAsia="pt-BR"/>
+              </w:rPr>
+              <w:t>]</w:t>
+            </w:r>
+          </w:p>
+        </w:tc>
+        <w:tc>
+          <w:tcPr>
+            <w:tcW w:w="4193" w:type="dxa"/>
+            <w:tcBorders>
+              <w:top w:val="single" w:sz="4" w:space="0" w:color="000000"/>
+              <w:left w:val="single" w:sz="4" w:space="0" w:color="000000"/>
+              <w:bottom w:val="single" w:sz="4" w:space="0" w:color="000000"/>
+              <w:right w:val="single" w:sz="4" w:space="0" w:color="000000"/>
+            </w:tcBorders>
+            <w:shd w:val="clear" w:color="auto" w:fill="002060"/>
+          </w:tcPr>
+          <w:p>
+            <w:pPr>
+              <w:jc w:val="center"/>
+              <w:rPr>
+                <w:rFonts w:ascii="Times New Roman" w:hAnsi="Times New Roman"/>
+                <w:color w:val="FFFFFF"/>
+                <w:lang w:eastAsia="pt-BR"/>
+              </w:rPr>
+            </w:pPr>
+            <w:r>
+              <w:rPr>
+                <w:rFonts w:ascii="Times New Roman" w:hAnsi="Times New Roman"/>
+                <w:b/>
+                <w:color w:val="FFFFFF"/>
+                <w:lang w:eastAsia="pt-BR"/>
+              </w:rPr>
+              <w:t>FOTO 4 –</w:t>
+            </w:r>
+            <w:r>
+              <w:rPr>
+                <w:rFonts w:ascii="Times New Roman" w:hAnsi="Times New Roman"/>
+                <w:color w:val="FFFFFF"/>
+                <w:lang w:eastAsia="pt-BR"/>
+              </w:rPr>
+              <w:t xml:space="preserve"> </w:t>
+            </w:r>
+            <w:r>
+              <w:rPr>
+                <w:rFonts w:ascii="Times New Roman" w:hAnsi="Times New Roman"/>
+                <w:color w:val="FFFFFF"/>
+                <w:lang w:eastAsia="pt-BR"/>
+              </w:rPr>
+              <w:t>[LEGENDA</w:t>
+            </w:r>
+            <w:r>
+              <w:rPr>
+                <w:rFonts w:ascii="Times New Roman" w:hAnsi="Times New Roman"/>
+                <w:color w:val="FFFFFF"/>
+                <w:lang w:eastAsia="pt-BR"/>
+              </w:rPr>
+              <w:t>4</w:t>
+            </w:r>
+            <w:r>
+              <w:rPr>
+                <w:rFonts w:ascii="Times New Roman" w:hAnsi="Times New Roman"/>
+                <w:color w:val="FFFFFF"/>
+                <w:lang w:eastAsia="pt-BR"/>
+              </w:rPr>
+              <w:t>]</w:t>
+            </w:r>
+          </w:p>
+        </w:tc>
+      </w:tr>
+      <w:tr>
+        <w:trPr>
+          <w:trHeight w:val="2835"/>
+        </w:trPr>
+        <w:tc>
+          <w:tcPr>
+            <w:tcW w:w="4193" w:type="dxa"/>
+            <w:tcBorders>
+              <w:top w:val="single" w:sz="4" w:space="0" w:color="000000"/>
+              <w:left w:val="single" w:sz="4" w:space="0" w:color="000000"/>
+              <w:bottom w:val="single" w:sz="4" w:space="0" w:color="000000"/>
+              <w:right w:val="single" w:sz="4" w:space="0" w:color="000000"/>
+            </w:tcBorders>
+          </w:tcPr>
+          <w:p>
+            <w:pPr>
+              <w:shd w:val="clear" w:color="auto" w:fill="FFFFFF"/>
+              <w:spacing w:before="240"/>
+              <w:rPr>
+                <w:rFonts w:ascii="Times New Roman" w:hAnsi="Times New Roman"/>
+                <w:b/>
+                <w:lang w:eastAsia="pt-BR"/>
+              </w:rPr>
+            </w:pPr>
+            <w:r>
+              <w:rPr>
+                <w:rFonts w:ascii="Times New Roman" w:hAnsi="Times New Roman"/>
+                <w:lang w:eastAsia="pt-BR"/>
+              </w:rPr>
+              <w:t>[FOTO_3]</w:t>
+            </w:r>
+          </w:p>
+        </w:tc>
+        <w:tc>
+          <w:tcPr>
+            <w:tcW w:w="4193" w:type="dxa"/>
+            <w:tcBorders>
+              <w:top w:val="single" w:sz="4" w:space="0" w:color="000000"/>
+              <w:left w:val="single" w:sz="4" w:space="0" w:color="000000"/>
+              <w:bottom w:val="single" w:sz="4" w:space="0" w:color="000000"/>
+              <w:right w:val="single" w:sz="4" w:space="0" w:color="000000"/>
+            </w:tcBorders>
+          </w:tcPr>
+          <w:p>
+            <w:pPr>
+              <w:shd w:val="clear" w:color="auto" w:fill="FFFFFF"/>
+              <w:spacing w:before="240"/>
+              <w:rPr>
+                <w:rFonts w:ascii="Times New Roman" w:hAnsi="Times New Roman"/>
+                <w:b/>
+                <w:lang w:eastAsia="pt-BR"/>
+              </w:rPr>
+            </w:pPr>
+            <w:r>
+              <w:rPr>
+                <w:rFonts w:ascii="Times New Roman" w:hAnsi="Times New Roman"/>
+                <w:lang w:eastAsia="pt-BR"/>
+              </w:rPr>
+              <w:t>[FOTO_</w:t>
+            </w:r>
+            <w:r>
+              <w:rPr>
+                <w:rFonts w:ascii="Times New Roman" w:hAnsi="Times New Roman"/>
+                <w:lang w:eastAsia="pt-BR"/>
+              </w:rPr>
+              <w:t>4</w:t>
+            </w:r>
+            <w:r>
+              <w:rPr>
+                <w:rFonts w:ascii="Times New Roman" w:hAnsi="Times New Roman"/>
+                <w:lang w:eastAsia="pt-BR"/>
+              </w:rPr>
+              <w:t>]</w:t>
+            </w:r>
+          </w:p>
+        </w:tc>
+      </w:tr>
+    </w:tbl>
+    <w:p>
+      <w:pPr>
+        <w:spacing w:after="0"/>
+        <w:rPr>
+          <w:vanish/>
+        </w:rPr>
+      </w:pPr>
+    </w:p>
+    <w:p>
+      <w:pPr>
+        <w:spacing w:after="0"/>
+        <w:rPr>
+          <w:vanish/>
+        </w:rPr>
+      </w:pPr>
+    </w:p>
+    <w:p>
+      <w:pPr>
+        <w:spacing w:after="0"/>
+        <w:rPr>
+          <w:vanish/>
+        </w:rPr>
+      </w:pPr>
+    </w:p>
+    <w:p>
+      <w:pPr>
+        <w:spacing w:after="0"/>
+        <w:rPr>
+          <w:vanish/>
+        </w:rPr>
+      </w:pPr>
+    </w:p>
+    <w:p>
+      <w:pPr>
+        <w:spacing w:after="0"/>
+        <w:rPr>
+          <w:vanish/>
+        </w:rPr>
+      </w:pPr>
+    </w:p>
+    <w:p>
+      <w:pPr>
+        <w:spacing w:after="0"/>
+        <w:rPr>
+          <w:vanish/>
+        </w:rPr>
+      </w:pPr>
+    </w:p>
+    <w:p>
+      <w:pPr>
+        <w:tabs>
+          <w:tab w:val="left" w:pos="3587"/>
+        </w:tabs>
+        <w:spacing w:after="0"/>
+        <w:jc w:val="both"/>
+        <w:rPr>
+          <w:rFonts w:ascii="Times New Roman" w:hAnsi="Times New Roman"/>
+          <w:b/>
+          <w:sz w:val="22"/>
+          <w:szCs w:val="22"/>
+        </w:rPr>
+      </w:pPr>
+    </w:p>
+    <w:sectPr>
+      <w:headerReference w:type="even" r:id="rId7"/>
+      <w:headerReference w:type="default" r:id="rId8"/>
+      <w:headerReference w:type="first" r:id="rId9"/>
+      <w:pgSz w:w="11900" w:h="16840"/>
+      <w:pgMar w:top="1418" w:right="1134" w:bottom="1560" w:left="1418" w:header="397" w:footer="567" w:gutter="0"/>
+      <w:cols w:space="708"/>
+      <w:docGrid w:linePitch="326"/>
+    </w:sectPr>
+  </w:body>
+</w:document>
 </file>
 
 <file path=word/endnotes.xml><?xml version="1.0" encoding="utf-8"?>

</xml_diff>